<commit_message>
docs: expand week 1 report and refresh learning notes
</commit_message>
<xml_diff>
--- a/reports/week01/第一周实习周报.docx
+++ b/reports/week01/第一周实习周报.docx
@@ -28,7 +28,7 @@
         <w:snapToGrid w:val="0"/>
       </w:pPr>
       <w:r>
-        <w:t>阶段记录：2026 年 10 月 12 日至 13 日　更新日期：2026 年 10 月 16 日</w:t>
+        <w:t>第一周记录：2026 年 10 月 12 日至 13 日　更新日期：2026 年 10 月 16 日</w:t>
       </w:r>
     </w:p>
     <w:p>
@@ -36,7 +36,7 @@
         <w:snapToGrid w:val="0"/>
       </w:pPr>
       <w:r>
-        <w:t>第一周已完成开发环境搭建、最小裸机程序运行、GDB 调试及启动流程与工业需求资料整理，形成了可继续开发的工程基线。本次更新补充 Git 提交和后续 UART 进度，便于带教了解当前状态；测试结果引用已有验证记录。</w:t>
+        <w:t>第一周完成了开发环境搭建、最小裸机 Demo、GDB 启动调试和工业需求资料整理。已形成可复现的启动验证工程，10 月 13 日的增强验证共 6 项检查通过。当前工作重点是理解启动代码与测试之间的对应关系，为后续驱动及镜像加载开发打基础。</w:t>
       </w:r>
     </w:p>
     <w:p>
@@ -45,7 +45,7 @@
         <w:snapToGrid w:val="0"/>
       </w:pPr>
       <w:r>
-        <w:t>一 第一周任务完成情况</w:t>
+        <w:t>一 完成情况与工程架构</w:t>
       </w:r>
     </w:p>
     <w:tbl>
@@ -64,9 +64,9 @@
         </w:tblBorders>
       </w:tblPr>
       <w:tblGrid>
-        <w:gridCol w:w="1656"/>
-        <w:gridCol w:w="5688"/>
-        <w:gridCol w:w="2736"/>
+        <w:gridCol w:w="1872"/>
+        <w:gridCol w:w="4968"/>
+        <w:gridCol w:w="3240"/>
       </w:tblGrid>
       <w:tr>
         <w:trPr>
@@ -75,7 +75,7 @@
         </w:trPr>
         <w:tc>
           <w:tcPr>
-            <w:tcW w:type="dxa" w:w="1656"/>
+            <w:tcW w:type="dxa" w:w="1872"/>
             <w:vAlign w:val="center"/>
             <w:tcMar>
               <w:top w:w="90" w:type="dxa"/>
@@ -96,13 +96,13 @@
                 <w:b/>
                 <w:sz w:val="21"/>
               </w:rPr>
-              <w:t>工作项</w:t>
+              <w:t>任务</w:t>
             </w:r>
           </w:p>
         </w:tc>
         <w:tc>
           <w:tcPr>
-            <w:tcW w:type="dxa" w:w="5688"/>
+            <w:tcW w:type="dxa" w:w="4968"/>
             <w:vAlign w:val="center"/>
             <w:tcMar>
               <w:top w:w="90" w:type="dxa"/>
@@ -123,13 +123,13 @@
                 <w:b/>
                 <w:sz w:val="21"/>
               </w:rPr>
-              <w:t>完成结果</w:t>
+              <w:t>已完成结果</w:t>
             </w:r>
           </w:p>
         </w:tc>
         <w:tc>
           <w:tcPr>
-            <w:tcW w:type="dxa" w:w="2736"/>
+            <w:tcW w:type="dxa" w:w="3240"/>
             <w:vAlign w:val="center"/>
             <w:tcMar>
               <w:top w:w="90" w:type="dxa"/>
@@ -150,7 +150,7 @@
                 <w:b/>
                 <w:sz w:val="21"/>
               </w:rPr>
-              <w:t>交付材料</w:t>
+              <w:t>主要交付</w:t>
             </w:r>
           </w:p>
         </w:tc>
@@ -161,7 +161,7 @@
         </w:trPr>
         <w:tc>
           <w:tcPr>
-            <w:tcW w:type="dxa" w:w="1656"/>
+            <w:tcW w:type="dxa" w:w="1872"/>
             <w:vAlign w:val="center"/>
             <w:tcMar>
               <w:top w:w="90" w:type="dxa"/>
@@ -181,13 +181,13 @@
                 <w:b w:val="0"/>
                 <w:sz w:val="21"/>
               </w:rPr>
-              <w:t>环境搭建与运行</w:t>
+              <w:t>环境搭建</w:t>
             </w:r>
           </w:p>
         </w:tc>
         <w:tc>
           <w:tcPr>
-            <w:tcW w:type="dxa" w:w="5688"/>
+            <w:tcW w:type="dxa" w:w="4968"/>
             <w:vAlign w:val="center"/>
             <w:tcMar>
               <w:top w:w="90" w:type="dxa"/>
@@ -207,13 +207,13 @@
                 <w:b w:val="0"/>
                 <w:sz w:val="21"/>
               </w:rPr>
-              <w:t>MacBook 上的 QEMU、ARM 工具链、CMake 和 GDB 已完成验证；最小 Demo 可构建、运行和调试</w:t>
+              <w:t>QEMU、Arm GCC、CMake、Make、GDB 和 Git 可用</w:t>
             </w:r>
           </w:p>
         </w:tc>
         <w:tc>
           <w:tcPr>
-            <w:tcW w:type="dxa" w:w="2736"/>
+            <w:tcW w:type="dxa" w:w="3240"/>
             <w:vAlign w:val="center"/>
             <w:tcMar>
               <w:top w:w="90" w:type="dxa"/>
@@ -233,7 +233,7 @@
                 <w:b w:val="0"/>
                 <w:sz w:val="21"/>
               </w:rPr>
-              <w:t>环境验证报告、构建与运行脚本</w:t>
+              <w:t>构建与运行脚本、版本日志</w:t>
             </w:r>
           </w:p>
         </w:tc>
@@ -244,7 +244,7 @@
         </w:trPr>
         <w:tc>
           <w:tcPr>
-            <w:tcW w:type="dxa" w:w="1656"/>
+            <w:tcW w:type="dxa" w:w="1872"/>
             <w:vAlign w:val="center"/>
             <w:tcMar>
               <w:top w:w="90" w:type="dxa"/>
@@ -264,13 +264,13 @@
                 <w:b w:val="0"/>
                 <w:sz w:val="21"/>
               </w:rPr>
-              <w:t>启动流程学习</w:t>
+              <w:t>最小裸机启动</w:t>
             </w:r>
           </w:p>
         </w:tc>
         <w:tc>
           <w:tcPr>
-            <w:tcW w:type="dxa" w:w="5688"/>
+            <w:tcW w:type="dxa" w:w="4968"/>
             <w:vAlign w:val="center"/>
             <w:tcMar>
               <w:top w:w="90" w:type="dxa"/>
@@ -290,13 +290,13 @@
                 <w:b w:val="0"/>
                 <w:sz w:val="21"/>
               </w:rPr>
-              <w:t>整理向量表、复位入口、数据段初始化及进入 main 的流程；完成断点和单步观察</w:t>
+              <w:t>完成复位入口、数据初始化与 C 自检</w:t>
             </w:r>
           </w:p>
         </w:tc>
         <w:tc>
           <w:tcPr>
-            <w:tcW w:type="dxa" w:w="2736"/>
+            <w:tcW w:type="dxa" w:w="3240"/>
             <w:vAlign w:val="center"/>
             <w:tcMar>
               <w:top w:w="90" w:type="dxa"/>
@@ -316,7 +316,7 @@
                 <w:b w:val="0"/>
                 <w:sz w:val="21"/>
               </w:rPr>
-              <w:t>启动代码、平台说明、学习笔记</w:t>
+              <w:t>startup.S、linker.ld、main.c</w:t>
             </w:r>
           </w:p>
         </w:tc>
@@ -327,7 +327,7 @@
         </w:trPr>
         <w:tc>
           <w:tcPr>
-            <w:tcW w:type="dxa" w:w="1656"/>
+            <w:tcW w:type="dxa" w:w="1872"/>
             <w:vAlign w:val="center"/>
             <w:tcMar>
               <w:top w:w="90" w:type="dxa"/>
@@ -347,13 +347,13 @@
                 <w:b w:val="0"/>
                 <w:sz w:val="21"/>
               </w:rPr>
-              <w:t>工业需求调研</w:t>
+              <w:t>调试与验证</w:t>
             </w:r>
           </w:p>
         </w:tc>
         <w:tc>
           <w:tcPr>
-            <w:tcW w:type="dxa" w:w="5688"/>
+            <w:tcW w:type="dxa" w:w="4968"/>
             <w:vAlign w:val="center"/>
             <w:tcMar>
               <w:top w:w="90" w:type="dxa"/>
@@ -373,13 +373,13 @@
                 <w:b w:val="0"/>
                 <w:sz w:val="21"/>
               </w:rPr>
-              <w:t>整理 S7 启动相关公开资料，以及固件校验、升级恢复等需求</w:t>
+              <w:t>完成断点、单步、初始化污染和两个错误用例</w:t>
             </w:r>
           </w:p>
         </w:tc>
         <w:tc>
           <w:tcPr>
-            <w:tcW w:type="dxa" w:w="2736"/>
+            <w:tcW w:type="dxa" w:w="3240"/>
             <w:vAlign w:val="center"/>
             <w:tcMar>
               <w:top w:w="90" w:type="dxa"/>
@@ -399,7 +399,7 @@
                 <w:b w:val="0"/>
                 <w:sz w:val="21"/>
               </w:rPr>
-              <w:t>工业需求与启动流程笔记</w:t>
+              <w:t>verify-startup.py、测试摘要</w:t>
             </w:r>
           </w:p>
         </w:tc>
@@ -410,7 +410,7 @@
         </w:trPr>
         <w:tc>
           <w:tcPr>
-            <w:tcW w:type="dxa" w:w="1656"/>
+            <w:tcW w:type="dxa" w:w="1872"/>
             <w:vAlign w:val="center"/>
             <w:tcMar>
               <w:top w:w="90" w:type="dxa"/>
@@ -430,13 +430,13 @@
                 <w:b w:val="0"/>
                 <w:sz w:val="21"/>
               </w:rPr>
-              <w:t>工程与周报</w:t>
+              <w:t>需求与工程整理</w:t>
             </w:r>
           </w:p>
         </w:tc>
         <w:tc>
           <w:tcPr>
-            <w:tcW w:type="dxa" w:w="5688"/>
+            <w:tcW w:type="dxa" w:w="4968"/>
             <w:vAlign w:val="center"/>
             <w:tcMar>
               <w:top w:w="90" w:type="dxa"/>
@@ -456,13 +456,13 @@
                 <w:b w:val="0"/>
                 <w:sz w:val="21"/>
               </w:rPr>
-              <w:t>已建立代码目录、README 和 Git 仓库；10 月 13 日完成第一周基线提交</w:t>
+              <w:t>形成启动流程和工业需求笔记；建立基线提交</w:t>
             </w:r>
           </w:p>
         </w:tc>
         <w:tc>
           <w:tcPr>
-            <w:tcW w:type="dxa" w:w="2736"/>
+            <w:tcW w:type="dxa" w:w="3240"/>
             <w:vAlign w:val="center"/>
             <w:tcMar>
               <w:top w:w="90" w:type="dxa"/>
@@ -482,7 +482,592 @@
                 <w:b w:val="0"/>
                 <w:sz w:val="21"/>
               </w:rPr>
-              <w:t>提交 8bb81c4、本周报</w:t>
+              <w:t>README、学习笔记、8bb81c4</w:t>
+            </w:r>
+          </w:p>
+        </w:tc>
+      </w:tr>
+      <w:tr>
+        <w:trPr>
+          <w:cantSplit/>
+        </w:trPr>
+        <w:tc>
+          <w:tcPr>
+            <w:tcW w:type="dxa" w:w="1872"/>
+            <w:vAlign w:val="center"/>
+            <w:tcMar>
+              <w:top w:w="90" w:type="dxa"/>
+              <w:left w:w="110" w:type="dxa"/>
+              <w:bottom w:w="90" w:type="dxa"/>
+              <w:right w:w="110" w:type="dxa"/>
+            </w:tcMar>
+            <w:shd w:fill="FFFFFF"/>
+          </w:tcPr>
+          <w:p>
+            <w:pPr>
+              <w:spacing w:after="0" w:line="300" w:lineRule="exact"/>
+              <w:snapToGrid w:val="0"/>
+            </w:pPr>
+            <w:r>
+              <w:rPr>
+                <w:b w:val="0"/>
+                <w:sz w:val="21"/>
+              </w:rPr>
+              <w:t>Git 提交与云端同步</w:t>
+            </w:r>
+          </w:p>
+        </w:tc>
+        <w:tc>
+          <w:tcPr>
+            <w:tcW w:type="dxa" w:w="4968"/>
+            <w:vAlign w:val="center"/>
+            <w:tcMar>
+              <w:top w:w="90" w:type="dxa"/>
+              <w:left w:w="110" w:type="dxa"/>
+              <w:bottom w:w="90" w:type="dxa"/>
+              <w:right w:w="110" w:type="dxa"/>
+            </w:tcMar>
+            <w:shd w:fill="FFFFFF"/>
+          </w:tcPr>
+          <w:p>
+            <w:pPr>
+              <w:spacing w:after="0" w:line="300" w:lineRule="exact"/>
+              <w:snapToGrid w:val="0"/>
+            </w:pPr>
+            <w:r>
+              <w:rPr>
+                <w:b w:val="0"/>
+                <w:sz w:val="21"/>
+              </w:rPr>
+              <w:t>已完成本地提交并推送 GitHub；main 已关联 origin/main</w:t>
+            </w:r>
+          </w:p>
+        </w:tc>
+        <w:tc>
+          <w:tcPr>
+            <w:tcW w:type="dxa" w:w="3240"/>
+            <w:vAlign w:val="center"/>
+            <w:tcMar>
+              <w:top w:w="90" w:type="dxa"/>
+              <w:left w:w="110" w:type="dxa"/>
+              <w:bottom w:w="90" w:type="dxa"/>
+              <w:right w:w="110" w:type="dxa"/>
+            </w:tcMar>
+            <w:shd w:fill="FFFFFF"/>
+          </w:tcPr>
+          <w:p>
+            <w:pPr>
+              <w:spacing w:after="0" w:line="300" w:lineRule="exact"/>
+              <w:snapToGrid w:val="0"/>
+            </w:pPr>
+            <w:r>
+              <w:rPr>
+                <w:b w:val="0"/>
+                <w:sz w:val="21"/>
+              </w:rPr>
+              <w:t>云端提交 9f8969f</w:t>
+            </w:r>
+          </w:p>
+        </w:tc>
+      </w:tr>
+    </w:tbl>
+    <w:p>
+      <w:pPr>
+        <w:spacing w:after="40" w:before="0" w:line="240" w:lineRule="auto"/>
+        <w:snapToGrid w:val="0"/>
+      </w:pPr>
+      <w:r>
+        <w:rPr>
+          <w:sz w:val="4"/>
+        </w:rPr>
+      </w:r>
+    </w:p>
+    <w:p>
+      <w:pPr>
+        <w:pStyle w:val="Heading2"/>
+        <w:snapToGrid w:val="0"/>
+      </w:pPr>
+      <w:r>
+        <w:t>构建运行与调试关系</w:t>
+      </w:r>
+    </w:p>
+    <w:p>
+      <w:pPr>
+        <w:keepNext/>
+        <w:spacing w:after="0" w:line="236" w:lineRule="exact"/>
+        <w:snapToGrid w:val="0"/>
+      </w:pPr>
+      <w:r>
+        <w:rPr>
+          <w:rFonts w:ascii="Menlo" w:hAnsi="Menlo" w:eastAsia="Heiti SC"/>
+          <w:sz w:val="18"/>
+        </w:rPr>
+        <w:t>CMake + Arm GCC + linker.ld → demo.elf</w:t>
+      </w:r>
+    </w:p>
+    <w:p>
+      <w:pPr>
+        <w:keepNext/>
+        <w:spacing w:after="0" w:line="236" w:lineRule="exact"/>
+        <w:snapToGrid w:val="0"/>
+      </w:pPr>
+      <w:r>
+        <w:rPr>
+          <w:rFonts w:ascii="Menlo" w:hAnsi="Menlo" w:eastAsia="Heiti SC"/>
+          <w:sz w:val="18"/>
+        </w:rPr>
+        <w:t>QEMU → 向量表 → Reset_Handler → main → 自检与输出</w:t>
+      </w:r>
+    </w:p>
+    <w:p>
+      <w:pPr>
+        <w:keepNext w:val="0"/>
+        <w:spacing w:after="0" w:line="236" w:lineRule="exact"/>
+        <w:snapToGrid w:val="0"/>
+      </w:pPr>
+      <w:r>
+        <w:rPr>
+          <w:rFonts w:ascii="Menlo" w:hAnsi="Menlo" w:eastAsia="Heiti SC"/>
+          <w:sz w:val="18"/>
+        </w:rPr>
+        <w:t>GDB  → QEMU gdbstub → 断点 单步 内存与寄存器观察</w:t>
+      </w:r>
+    </w:p>
+    <w:tbl>
+      <w:tblPr>
+        <w:tblW w:type="auto" w:w="0"/>
+        <w:jc w:val="center"/>
+        <w:tblLayout w:type="fixed"/>
+        <w:tblLook w:firstColumn="1" w:firstRow="1" w:lastColumn="0" w:lastRow="0" w:noHBand="0" w:noVBand="1" w:val="04A0"/>
+        <w:tblBorders>
+          <w:top w:val="single" w:sz="4" w:color="D9D9D9"/>
+          <w:left w:val="single" w:sz="4" w:color="D9D9D9"/>
+          <w:bottom w:val="single" w:sz="4" w:color="D9D9D9"/>
+          <w:right w:val="single" w:sz="4" w:color="D9D9D9"/>
+          <w:insideH w:val="single" w:sz="4" w:color="D9D9D9"/>
+          <w:insideV w:val="single" w:sz="4" w:color="D9D9D9"/>
+        </w:tblBorders>
+      </w:tblPr>
+      <w:tblGrid>
+        <w:gridCol w:w="1872"/>
+        <w:gridCol w:w="4968"/>
+        <w:gridCol w:w="3240"/>
+      </w:tblGrid>
+      <w:tr>
+        <w:trPr>
+          <w:cantSplit/>
+          <w:tblHeader/>
+        </w:trPr>
+        <w:tc>
+          <w:tcPr>
+            <w:tcW w:type="dxa" w:w="1872"/>
+            <w:vAlign w:val="center"/>
+            <w:tcMar>
+              <w:top w:w="90" w:type="dxa"/>
+              <w:left w:w="110" w:type="dxa"/>
+              <w:bottom w:w="90" w:type="dxa"/>
+              <w:right w:w="110" w:type="dxa"/>
+            </w:tcMar>
+            <w:shd w:fill="E8EEF4"/>
+          </w:tcPr>
+          <w:p>
+            <w:pPr>
+              <w:spacing w:after="0" w:line="300" w:lineRule="exact"/>
+              <w:jc w:val="center"/>
+              <w:snapToGrid w:val="0"/>
+            </w:pPr>
+            <w:r>
+              <w:rPr>
+                <w:b/>
+                <w:sz w:val="21"/>
+              </w:rPr>
+              <w:t>模块</w:t>
+            </w:r>
+          </w:p>
+        </w:tc>
+        <w:tc>
+          <w:tcPr>
+            <w:tcW w:type="dxa" w:w="4968"/>
+            <w:vAlign w:val="center"/>
+            <w:tcMar>
+              <w:top w:w="90" w:type="dxa"/>
+              <w:left w:w="110" w:type="dxa"/>
+              <w:bottom w:w="90" w:type="dxa"/>
+              <w:right w:w="110" w:type="dxa"/>
+            </w:tcMar>
+            <w:shd w:fill="E8EEF4"/>
+          </w:tcPr>
+          <w:p>
+            <w:pPr>
+              <w:spacing w:after="0" w:line="300" w:lineRule="exact"/>
+              <w:jc w:val="center"/>
+              <w:snapToGrid w:val="0"/>
+            </w:pPr>
+            <w:r>
+              <w:rPr>
+                <w:b/>
+                <w:sz w:val="21"/>
+              </w:rPr>
+              <w:t>文件位置（相对 codes）</w:t>
+            </w:r>
+          </w:p>
+        </w:tc>
+        <w:tc>
+          <w:tcPr>
+            <w:tcW w:type="dxa" w:w="3240"/>
+            <w:vAlign w:val="center"/>
+            <w:tcMar>
+              <w:top w:w="90" w:type="dxa"/>
+              <w:left w:w="110" w:type="dxa"/>
+              <w:bottom w:w="90" w:type="dxa"/>
+              <w:right w:w="110" w:type="dxa"/>
+            </w:tcMar>
+            <w:shd w:fill="E8EEF4"/>
+          </w:tcPr>
+          <w:p>
+            <w:pPr>
+              <w:spacing w:after="0" w:line="300" w:lineRule="exact"/>
+              <w:jc w:val="center"/>
+              <w:snapToGrid w:val="0"/>
+            </w:pPr>
+            <w:r>
+              <w:rPr>
+                <w:b/>
+                <w:sz w:val="21"/>
+              </w:rPr>
+              <w:t>职责</w:t>
+            </w:r>
+          </w:p>
+        </w:tc>
+      </w:tr>
+      <w:tr>
+        <w:trPr>
+          <w:cantSplit/>
+        </w:trPr>
+        <w:tc>
+          <w:tcPr>
+            <w:tcW w:type="dxa" w:w="1872"/>
+            <w:vAlign w:val="center"/>
+            <w:tcMar>
+              <w:top w:w="90" w:type="dxa"/>
+              <w:left w:w="110" w:type="dxa"/>
+              <w:bottom w:w="90" w:type="dxa"/>
+              <w:right w:w="110" w:type="dxa"/>
+            </w:tcMar>
+            <w:shd w:fill="FFFFFF"/>
+          </w:tcPr>
+          <w:p>
+            <w:pPr>
+              <w:spacing w:after="0" w:line="300" w:lineRule="exact"/>
+              <w:snapToGrid w:val="0"/>
+            </w:pPr>
+            <w:r>
+              <w:rPr>
+                <w:b w:val="0"/>
+                <w:sz w:val="21"/>
+              </w:rPr>
+              <w:t>启动层</w:t>
+            </w:r>
+          </w:p>
+        </w:tc>
+        <w:tc>
+          <w:tcPr>
+            <w:tcW w:type="dxa" w:w="4968"/>
+            <w:vAlign w:val="center"/>
+            <w:tcMar>
+              <w:top w:w="90" w:type="dxa"/>
+              <w:left w:w="110" w:type="dxa"/>
+              <w:bottom w:w="90" w:type="dxa"/>
+              <w:right w:w="110" w:type="dxa"/>
+            </w:tcMar>
+            <w:shd w:fill="FFFFFF"/>
+          </w:tcPr>
+          <w:p>
+            <w:pPr>
+              <w:spacing w:after="0" w:line="300" w:lineRule="exact"/>
+              <w:snapToGrid w:val="0"/>
+            </w:pPr>
+            <w:r>
+              <w:rPr>
+                <w:b w:val="0"/>
+                <w:sz w:val="21"/>
+              </w:rPr>
+              <w:t>src/startup.S</w:t>
+            </w:r>
+          </w:p>
+        </w:tc>
+        <w:tc>
+          <w:tcPr>
+            <w:tcW w:type="dxa" w:w="3240"/>
+            <w:vAlign w:val="center"/>
+            <w:tcMar>
+              <w:top w:w="90" w:type="dxa"/>
+              <w:left w:w="110" w:type="dxa"/>
+              <w:bottom w:w="90" w:type="dxa"/>
+              <w:right w:w="110" w:type="dxa"/>
+            </w:tcMar>
+            <w:shd w:fill="FFFFFF"/>
+          </w:tcPr>
+          <w:p>
+            <w:pPr>
+              <w:spacing w:after="0" w:line="300" w:lineRule="exact"/>
+              <w:snapToGrid w:val="0"/>
+            </w:pPr>
+            <w:r>
+              <w:rPr>
+                <w:b w:val="0"/>
+                <w:sz w:val="21"/>
+              </w:rPr>
+              <w:t>提供向量表，初始化 C 数据，调用 main</w:t>
+            </w:r>
+          </w:p>
+        </w:tc>
+      </w:tr>
+      <w:tr>
+        <w:trPr>
+          <w:cantSplit/>
+        </w:trPr>
+        <w:tc>
+          <w:tcPr>
+            <w:tcW w:type="dxa" w:w="1872"/>
+            <w:vAlign w:val="center"/>
+            <w:tcMar>
+              <w:top w:w="90" w:type="dxa"/>
+              <w:left w:w="110" w:type="dxa"/>
+              <w:bottom w:w="90" w:type="dxa"/>
+              <w:right w:w="110" w:type="dxa"/>
+            </w:tcMar>
+            <w:shd w:fill="FFFFFF"/>
+          </w:tcPr>
+          <w:p>
+            <w:pPr>
+              <w:spacing w:after="0" w:line="300" w:lineRule="exact"/>
+              <w:snapToGrid w:val="0"/>
+            </w:pPr>
+            <w:r>
+              <w:rPr>
+                <w:b w:val="0"/>
+                <w:sz w:val="21"/>
+              </w:rPr>
+              <w:t>内存布局</w:t>
+            </w:r>
+          </w:p>
+        </w:tc>
+        <w:tc>
+          <w:tcPr>
+            <w:tcW w:type="dxa" w:w="4968"/>
+            <w:vAlign w:val="center"/>
+            <w:tcMar>
+              <w:top w:w="90" w:type="dxa"/>
+              <w:left w:w="110" w:type="dxa"/>
+              <w:bottom w:w="90" w:type="dxa"/>
+              <w:right w:w="110" w:type="dxa"/>
+            </w:tcMar>
+            <w:shd w:fill="FFFFFF"/>
+          </w:tcPr>
+          <w:p>
+            <w:pPr>
+              <w:spacing w:after="0" w:line="300" w:lineRule="exact"/>
+              <w:snapToGrid w:val="0"/>
+            </w:pPr>
+            <w:r>
+              <w:rPr>
+                <w:b w:val="0"/>
+                <w:sz w:val="21"/>
+              </w:rPr>
+              <w:t>src/linker.ld</w:t>
+            </w:r>
+          </w:p>
+        </w:tc>
+        <w:tc>
+          <w:tcPr>
+            <w:tcW w:type="dxa" w:w="3240"/>
+            <w:vAlign w:val="center"/>
+            <w:tcMar>
+              <w:top w:w="90" w:type="dxa"/>
+              <w:left w:w="110" w:type="dxa"/>
+              <w:bottom w:w="90" w:type="dxa"/>
+              <w:right w:w="110" w:type="dxa"/>
+            </w:tcMar>
+            <w:shd w:fill="FFFFFF"/>
+          </w:tcPr>
+          <w:p>
+            <w:pPr>
+              <w:spacing w:after="0" w:line="300" w:lineRule="exact"/>
+              <w:snapToGrid w:val="0"/>
+            </w:pPr>
+            <w:r>
+              <w:rPr>
+                <w:b w:val="0"/>
+                <w:sz w:val="21"/>
+              </w:rPr>
+              <w:t>定义代码区、RAM、段边界和栈顶符号</w:t>
+            </w:r>
+          </w:p>
+        </w:tc>
+      </w:tr>
+      <w:tr>
+        <w:trPr>
+          <w:cantSplit/>
+        </w:trPr>
+        <w:tc>
+          <w:tcPr>
+            <w:tcW w:type="dxa" w:w="1872"/>
+            <w:vAlign w:val="center"/>
+            <w:tcMar>
+              <w:top w:w="90" w:type="dxa"/>
+              <w:left w:w="110" w:type="dxa"/>
+              <w:bottom w:w="90" w:type="dxa"/>
+              <w:right w:w="110" w:type="dxa"/>
+            </w:tcMar>
+            <w:shd w:fill="FFFFFF"/>
+          </w:tcPr>
+          <w:p>
+            <w:pPr>
+              <w:spacing w:after="0" w:line="300" w:lineRule="exact"/>
+              <w:snapToGrid w:val="0"/>
+            </w:pPr>
+            <w:r>
+              <w:rPr>
+                <w:b w:val="0"/>
+                <w:sz w:val="21"/>
+              </w:rPr>
+              <w:t>示例主流程</w:t>
+            </w:r>
+          </w:p>
+        </w:tc>
+        <w:tc>
+          <w:tcPr>
+            <w:tcW w:type="dxa" w:w="4968"/>
+            <w:vAlign w:val="center"/>
+            <w:tcMar>
+              <w:top w:w="90" w:type="dxa"/>
+              <w:left w:w="110" w:type="dxa"/>
+              <w:bottom w:w="90" w:type="dxa"/>
+              <w:right w:w="110" w:type="dxa"/>
+            </w:tcMar>
+            <w:shd w:fill="FFFFFF"/>
+          </w:tcPr>
+          <w:p>
+            <w:pPr>
+              <w:spacing w:after="0" w:line="300" w:lineRule="exact"/>
+              <w:snapToGrid w:val="0"/>
+            </w:pPr>
+            <w:r>
+              <w:rPr>
+                <w:b w:val="0"/>
+                <w:sz w:val="21"/>
+              </w:rPr>
+              <w:t>src/main.c</w:t>
+            </w:r>
+          </w:p>
+        </w:tc>
+        <w:tc>
+          <w:tcPr>
+            <w:tcW w:type="dxa" w:w="3240"/>
+            <w:vAlign w:val="center"/>
+            <w:tcMar>
+              <w:top w:w="90" w:type="dxa"/>
+              <w:left w:w="110" w:type="dxa"/>
+              <w:bottom w:w="90" w:type="dxa"/>
+              <w:right w:w="110" w:type="dxa"/>
+            </w:tcMar>
+            <w:shd w:fill="FFFFFF"/>
+          </w:tcPr>
+          <w:p>
+            <w:pPr>
+              <w:spacing w:after="0" w:line="300" w:lineRule="exact"/>
+              <w:snapToGrid w:val="0"/>
+            </w:pPr>
+            <w:r>
+              <w:rPr>
+                <w:b w:val="0"/>
+                <w:sz w:val="21"/>
+              </w:rPr>
+              <w:t>检查内核与数据初值，输出 PASS 或 FAIL</w:t>
+            </w:r>
+          </w:p>
+        </w:tc>
+      </w:tr>
+      <w:tr>
+        <w:trPr>
+          <w:cantSplit/>
+        </w:trPr>
+        <w:tc>
+          <w:tcPr>
+            <w:tcW w:type="dxa" w:w="1872"/>
+            <w:vAlign w:val="center"/>
+            <w:tcMar>
+              <w:top w:w="90" w:type="dxa"/>
+              <w:left w:w="110" w:type="dxa"/>
+              <w:bottom w:w="90" w:type="dxa"/>
+              <w:right w:w="110" w:type="dxa"/>
+            </w:tcMar>
+            <w:shd w:fill="FFFFFF"/>
+          </w:tcPr>
+          <w:p>
+            <w:pPr>
+              <w:spacing w:after="0" w:line="300" w:lineRule="exact"/>
+              <w:snapToGrid w:val="0"/>
+            </w:pPr>
+            <w:r>
+              <w:rPr>
+                <w:b w:val="0"/>
+                <w:sz w:val="21"/>
+              </w:rPr>
+              <w:t>验证工具</w:t>
+            </w:r>
+          </w:p>
+        </w:tc>
+        <w:tc>
+          <w:tcPr>
+            <w:tcW w:type="dxa" w:w="4968"/>
+            <w:vAlign w:val="center"/>
+            <w:tcMar>
+              <w:top w:w="90" w:type="dxa"/>
+              <w:left w:w="110" w:type="dxa"/>
+              <w:bottom w:w="90" w:type="dxa"/>
+              <w:right w:w="110" w:type="dxa"/>
+            </w:tcMar>
+            <w:shd w:fill="FFFFFF"/>
+          </w:tcPr>
+          <w:p>
+            <w:pPr>
+              <w:spacing w:after="0" w:line="300" w:lineRule="exact"/>
+              <w:snapToGrid w:val="0"/>
+            </w:pPr>
+            <w:r>
+              <w:rPr>
+                <w:b w:val="0"/>
+                <w:sz w:val="21"/>
+              </w:rPr>
+              <w:t>scripts/verify-startup.py</w:t>
+            </w:r>
+          </w:p>
+        </w:tc>
+        <w:tc>
+          <w:tcPr>
+            <w:tcW w:type="dxa" w:w="3240"/>
+            <w:vAlign w:val="center"/>
+            <w:tcMar>
+              <w:top w:w="90" w:type="dxa"/>
+              <w:left w:w="110" w:type="dxa"/>
+              <w:bottom w:w="90" w:type="dxa"/>
+              <w:right w:w="110" w:type="dxa"/>
+            </w:tcMar>
+            <w:shd w:fill="FFFFFF"/>
+          </w:tcPr>
+          <w:p>
+            <w:pPr>
+              <w:spacing w:after="0" w:line="300" w:lineRule="exact"/>
+              <w:snapToGrid w:val="0"/>
+            </w:pPr>
+            <w:r>
+              <w:rPr>
+                <w:b w:val="0"/>
+                <w:sz w:val="21"/>
+              </w:rPr>
+              <w:t>独立构建、注入测试条件、断言并留存证据</w:t>
             </w:r>
           </w:p>
         </w:tc>
@@ -504,7 +1089,15 @@
         <w:snapToGrid w:val="0"/>
       </w:pPr>
       <w:r>
-        <w:t>10 月 13 日增强验证共 6 项检查通过，涵盖工具、全新构建及 4 个固件运行场景。除正常启动外，还检查了内存污染后的初始化恢复，以及变量被破坏时的错误输出。详细步骤和原始日志保留在验证报告中。</w:t>
+        <w:t>这样划分后，启动代码只负责建立 C 运行条件，自检由 C 程序完成，测试脚本负责观察及故障注入。GDB 属于调试工具，不是固件启动步骤。第一周代码仍保留为独立 demo.elf，便于后续回归。</w:t>
+      </w:r>
+    </w:p>
+    <w:p>
+      <w:pPr>
+        <w:snapToGrid w:val="0"/>
+      </w:pPr>
+      <w:r>
+        <w:br w:type="page"/>
       </w:r>
     </w:p>
     <w:p>
@@ -513,7 +1106,16 @@
         <w:snapToGrid w:val="0"/>
       </w:pPr>
       <w:r>
-        <w:t>二 学习重点与当前问题</w:t>
+        <w:t>二 关键代码与实现思路</w:t>
+      </w:r>
+    </w:p>
+    <w:p>
+      <w:pPr>
+        <w:pStyle w:val="Heading2"/>
+        <w:snapToGrid w:val="0"/>
+      </w:pPr>
+      <w:r>
+        <w:t>数据初始化为什么放在 main 之前</w:t>
       </w:r>
     </w:p>
     <w:p>
@@ -521,7 +1123,145 @@
         <w:snapToGrid w:val="0"/>
       </w:pPr>
       <w:r>
-        <w:t>启动流程的学习重点是把汇编、链接脚本和 C 程序对应起来：启动代码复制 .data、清零 .bss，再进入 main；链接脚本负责安排代码、数据和栈的位置。后续需要继续结合调试器，熟悉各步骤的实际执行过程。</w:t>
+        <w:t xml:space="preserve">带初值的全局变量需要从装载位置复制到 RAM，零初始化变量需要清零。链接脚本输出 _sidata、_sdata、_edata 等符号，由启动汇编使用。下面摘录自 </w:t>
+      </w:r>
+      <w:hyperlink r:id="rId10">
+        <w:r>
+          <w:rPr>
+            <w:rFonts w:ascii="Calibri" w:eastAsia="Songti SC"/>
+            <w:color w:val="1F4E79"/>
+          </w:rPr>
+          <w:t>src/startup.S</w:t>
+        </w:r>
+      </w:hyperlink>
+      <w:r>
+        <w:t>，与当前源文件一致。</w:t>
+      </w:r>
+    </w:p>
+    <w:p>
+      <w:pPr>
+        <w:keepNext/>
+        <w:spacing w:after="0" w:line="236" w:lineRule="exact"/>
+        <w:snapToGrid w:val="0"/>
+      </w:pPr>
+      <w:r>
+        <w:rPr>
+          <w:rFonts w:ascii="Menlo" w:hAnsi="Menlo" w:eastAsia="Heiti SC"/>
+          <w:sz w:val="18"/>
+        </w:rPr>
+        <w:t xml:space="preserve">  ldr r0, =_sidata</w:t>
+      </w:r>
+    </w:p>
+    <w:p>
+      <w:pPr>
+        <w:keepNext/>
+        <w:spacing w:after="0" w:line="236" w:lineRule="exact"/>
+        <w:snapToGrid w:val="0"/>
+      </w:pPr>
+      <w:r>
+        <w:rPr>
+          <w:rFonts w:ascii="Menlo" w:hAnsi="Menlo" w:eastAsia="Heiti SC"/>
+          <w:sz w:val="18"/>
+        </w:rPr>
+        <w:t xml:space="preserve">  ldr r1, =_sdata</w:t>
+      </w:r>
+    </w:p>
+    <w:p>
+      <w:pPr>
+        <w:keepNext/>
+        <w:spacing w:after="0" w:line="236" w:lineRule="exact"/>
+        <w:snapToGrid w:val="0"/>
+      </w:pPr>
+      <w:r>
+        <w:rPr>
+          <w:rFonts w:ascii="Menlo" w:hAnsi="Menlo" w:eastAsia="Heiti SC"/>
+          <w:sz w:val="18"/>
+        </w:rPr>
+        <w:t xml:space="preserve">  ldr r2, =_edata</w:t>
+      </w:r>
+    </w:p>
+    <w:p>
+      <w:pPr>
+        <w:keepNext/>
+        <w:spacing w:after="0" w:line="236" w:lineRule="exact"/>
+        <w:snapToGrid w:val="0"/>
+      </w:pPr>
+      <w:r>
+        <w:rPr>
+          <w:rFonts w:ascii="Menlo" w:hAnsi="Menlo" w:eastAsia="Heiti SC"/>
+          <w:sz w:val="18"/>
+        </w:rPr>
+        <w:t>1:</w:t>
+      </w:r>
+    </w:p>
+    <w:p>
+      <w:pPr>
+        <w:keepNext/>
+        <w:spacing w:after="0" w:line="236" w:lineRule="exact"/>
+        <w:snapToGrid w:val="0"/>
+      </w:pPr>
+      <w:r>
+        <w:rPr>
+          <w:rFonts w:ascii="Menlo" w:hAnsi="Menlo" w:eastAsia="Heiti SC"/>
+          <w:sz w:val="18"/>
+        </w:rPr>
+        <w:t xml:space="preserve">  cmp r1, r2</w:t>
+      </w:r>
+    </w:p>
+    <w:p>
+      <w:pPr>
+        <w:keepNext/>
+        <w:spacing w:after="0" w:line="236" w:lineRule="exact"/>
+        <w:snapToGrid w:val="0"/>
+      </w:pPr>
+      <w:r>
+        <w:rPr>
+          <w:rFonts w:ascii="Menlo" w:hAnsi="Menlo" w:eastAsia="Heiti SC"/>
+          <w:sz w:val="18"/>
+        </w:rPr>
+        <w:t xml:space="preserve">  bcs 2f</w:t>
+      </w:r>
+    </w:p>
+    <w:p>
+      <w:pPr>
+        <w:keepNext/>
+        <w:spacing w:after="0" w:line="236" w:lineRule="exact"/>
+        <w:snapToGrid w:val="0"/>
+      </w:pPr>
+      <w:r>
+        <w:rPr>
+          <w:rFonts w:ascii="Menlo" w:hAnsi="Menlo" w:eastAsia="Heiti SC"/>
+          <w:sz w:val="18"/>
+        </w:rPr>
+        <w:t xml:space="preserve">  ldr r3, [r0], #4</w:t>
+      </w:r>
+    </w:p>
+    <w:p>
+      <w:pPr>
+        <w:keepNext/>
+        <w:spacing w:after="0" w:line="236" w:lineRule="exact"/>
+        <w:snapToGrid w:val="0"/>
+      </w:pPr>
+      <w:r>
+        <w:rPr>
+          <w:rFonts w:ascii="Menlo" w:hAnsi="Menlo" w:eastAsia="Heiti SC"/>
+          <w:sz w:val="18"/>
+        </w:rPr>
+        <w:t xml:space="preserve">  str r3, [r1], #4</w:t>
+      </w:r>
+    </w:p>
+    <w:p>
+      <w:pPr>
+        <w:keepNext w:val="0"/>
+        <w:spacing w:after="0" w:line="236" w:lineRule="exact"/>
+        <w:snapToGrid w:val="0"/>
+      </w:pPr>
+      <w:r>
+        <w:rPr>
+          <w:rFonts w:ascii="Menlo" w:hAnsi="Menlo" w:eastAsia="Heiti SC"/>
+          <w:sz w:val="18"/>
+        </w:rPr>
+        <w:t xml:space="preserve">  b 1b</w:t>
       </w:r>
     </w:p>
     <w:p>
@@ -529,7 +1269,161 @@
         <w:snapToGrid w:val="0"/>
       </w:pPr>
       <w:r>
-        <w:t>验证中值得保留的方法是先把数据区写成错误值，再检查启动后是否恢复。这样可以避免模拟器内存初值恰好为零，导致清零代码未正确执行却仍显示通过。</w:t>
+        <w:t>r0 指向 .data 初值，r1 指向 RAM 写入位置，r2 表示结束边界；每次复制 4 字节。当前链接脚本对段边界进行 4 字节对齐，与按字复制的实现相配合。</w:t>
+      </w:r>
+    </w:p>
+    <w:p>
+      <w:pPr>
+        <w:keepNext/>
+        <w:spacing w:after="0" w:line="236" w:lineRule="exact"/>
+        <w:snapToGrid w:val="0"/>
+      </w:pPr>
+      <w:r>
+        <w:rPr>
+          <w:rFonts w:ascii="Menlo" w:hAnsi="Menlo" w:eastAsia="Heiti SC"/>
+          <w:sz w:val="18"/>
+        </w:rPr>
+        <w:t>2:</w:t>
+      </w:r>
+    </w:p>
+    <w:p>
+      <w:pPr>
+        <w:keepNext/>
+        <w:spacing w:after="0" w:line="236" w:lineRule="exact"/>
+        <w:snapToGrid w:val="0"/>
+      </w:pPr>
+      <w:r>
+        <w:rPr>
+          <w:rFonts w:ascii="Menlo" w:hAnsi="Menlo" w:eastAsia="Heiti SC"/>
+          <w:sz w:val="18"/>
+        </w:rPr>
+        <w:t xml:space="preserve">  ldr r1, =_sbss</w:t>
+      </w:r>
+    </w:p>
+    <w:p>
+      <w:pPr>
+        <w:keepNext/>
+        <w:spacing w:after="0" w:line="236" w:lineRule="exact"/>
+        <w:snapToGrid w:val="0"/>
+      </w:pPr>
+      <w:r>
+        <w:rPr>
+          <w:rFonts w:ascii="Menlo" w:hAnsi="Menlo" w:eastAsia="Heiti SC"/>
+          <w:sz w:val="18"/>
+        </w:rPr>
+        <w:t xml:space="preserve">  ldr r2, =_ebss</w:t>
+      </w:r>
+    </w:p>
+    <w:p>
+      <w:pPr>
+        <w:keepNext/>
+        <w:spacing w:after="0" w:line="236" w:lineRule="exact"/>
+        <w:snapToGrid w:val="0"/>
+      </w:pPr>
+      <w:r>
+        <w:rPr>
+          <w:rFonts w:ascii="Menlo" w:hAnsi="Menlo" w:eastAsia="Heiti SC"/>
+          <w:sz w:val="18"/>
+        </w:rPr>
+        <w:t xml:space="preserve">  movs r3, #0</w:t>
+      </w:r>
+    </w:p>
+    <w:p>
+      <w:pPr>
+        <w:keepNext/>
+        <w:spacing w:after="0" w:line="236" w:lineRule="exact"/>
+        <w:snapToGrid w:val="0"/>
+      </w:pPr>
+      <w:r>
+        <w:rPr>
+          <w:rFonts w:ascii="Menlo" w:hAnsi="Menlo" w:eastAsia="Heiti SC"/>
+          <w:sz w:val="18"/>
+        </w:rPr>
+        <w:t>3:</w:t>
+      </w:r>
+    </w:p>
+    <w:p>
+      <w:pPr>
+        <w:keepNext/>
+        <w:spacing w:after="0" w:line="236" w:lineRule="exact"/>
+        <w:snapToGrid w:val="0"/>
+      </w:pPr>
+      <w:r>
+        <w:rPr>
+          <w:rFonts w:ascii="Menlo" w:hAnsi="Menlo" w:eastAsia="Heiti SC"/>
+          <w:sz w:val="18"/>
+        </w:rPr>
+        <w:t xml:space="preserve">  cmp r1, r2</w:t>
+      </w:r>
+    </w:p>
+    <w:p>
+      <w:pPr>
+        <w:keepNext/>
+        <w:spacing w:after="0" w:line="236" w:lineRule="exact"/>
+        <w:snapToGrid w:val="0"/>
+      </w:pPr>
+      <w:r>
+        <w:rPr>
+          <w:rFonts w:ascii="Menlo" w:hAnsi="Menlo" w:eastAsia="Heiti SC"/>
+          <w:sz w:val="18"/>
+        </w:rPr>
+        <w:t xml:space="preserve">  bcs 4f</w:t>
+      </w:r>
+    </w:p>
+    <w:p>
+      <w:pPr>
+        <w:keepNext/>
+        <w:spacing w:after="0" w:line="236" w:lineRule="exact"/>
+        <w:snapToGrid w:val="0"/>
+      </w:pPr>
+      <w:r>
+        <w:rPr>
+          <w:rFonts w:ascii="Menlo" w:hAnsi="Menlo" w:eastAsia="Heiti SC"/>
+          <w:sz w:val="18"/>
+        </w:rPr>
+        <w:t xml:space="preserve">  str r3, [r1], #4</w:t>
+      </w:r>
+    </w:p>
+    <w:p>
+      <w:pPr>
+        <w:keepNext/>
+        <w:spacing w:after="0" w:line="236" w:lineRule="exact"/>
+        <w:snapToGrid w:val="0"/>
+      </w:pPr>
+      <w:r>
+        <w:rPr>
+          <w:rFonts w:ascii="Menlo" w:hAnsi="Menlo" w:eastAsia="Heiti SC"/>
+          <w:sz w:val="18"/>
+        </w:rPr>
+        <w:t xml:space="preserve">  b 3b</w:t>
+      </w:r>
+    </w:p>
+    <w:p>
+      <w:pPr>
+        <w:keepNext/>
+        <w:spacing w:after="0" w:line="236" w:lineRule="exact"/>
+        <w:snapToGrid w:val="0"/>
+      </w:pPr>
+      <w:r>
+        <w:rPr>
+          <w:rFonts w:ascii="Menlo" w:hAnsi="Menlo" w:eastAsia="Heiti SC"/>
+          <w:sz w:val="18"/>
+        </w:rPr>
+        <w:t>4:</w:t>
+      </w:r>
+    </w:p>
+    <w:p>
+      <w:pPr>
+        <w:keepNext w:val="0"/>
+        <w:spacing w:after="0" w:line="236" w:lineRule="exact"/>
+        <w:snapToGrid w:val="0"/>
+      </w:pPr>
+      <w:r>
+        <w:rPr>
+          <w:rFonts w:ascii="Menlo" w:hAnsi="Menlo" w:eastAsia="Heiti SC"/>
+          <w:sz w:val="18"/>
+        </w:rPr>
+        <w:t xml:space="preserve">  bl main</w:t>
       </w:r>
     </w:p>
     <w:p>
@@ -537,17 +1431,16 @@
         <w:snapToGrid w:val="0"/>
       </w:pPr>
       <w:r>
-        <w:t>当前平台为 QEMU mps2-an500，模拟 Cortex-M7。第一周输出使用 semihosting，代码区实际为模拟 SRAM。S7 资料用于需求参考，具体型号的启动行为仍需进一步确认。</w:t>
+        <w:t>第二个循环清零 [_sbss, _ebss)，随后调用 main。若 main 返回，则进入默认处理循环。第一周向量表只提供基本入口，完整异常和外部中断支持留在后续阶段。</w:t>
       </w:r>
     </w:p>
     <w:p>
       <w:pPr>
-        <w:pStyle w:val="Heading1"/>
-        <w:pageBreakBefore/>
+        <w:pStyle w:val="Heading2"/>
         <w:snapToGrid w:val="0"/>
       </w:pPr>
       <w:r>
-        <w:t>三 截至本次更新的后续进度</w:t>
+        <w:t>在 C 入口检查启动结果</w:t>
       </w:r>
     </w:p>
     <w:p>
@@ -555,7 +1448,103 @@
         <w:snapToGrid w:val="0"/>
       </w:pPr>
       <w:r>
-        <w:t>10 月 14 日已提交第二周阶段代码，提交号为 8cbafe1。在保留第一周 Demo 的基础上，增加了独立启动目标、向量表与异常入口，以及 UART0 轮询发送。关闭 semihosting 后，启动日志仍可经模拟 UART 输出。</w:t>
+        <w:t xml:space="preserve">以下摘录自 </w:t>
+      </w:r>
+      <w:hyperlink r:id="rId11">
+        <w:r>
+          <w:rPr>
+            <w:rFonts w:ascii="Calibri" w:eastAsia="Songti SC"/>
+            <w:color w:val="1F4E79"/>
+          </w:rPr>
+          <w:t>src/main.c</w:t>
+        </w:r>
+      </w:hyperlink>
+      <w:r>
+        <w:t>。CPUID 的 PartNo 用于检查内核，两个变量分别观察 .data 和 .bss 的初始化结果。</w:t>
+      </w:r>
+    </w:p>
+    <w:p>
+      <w:pPr>
+        <w:keepNext/>
+        <w:spacing w:after="0" w:line="236" w:lineRule="exact"/>
+        <w:snapToGrid w:val="0"/>
+      </w:pPr>
+      <w:r>
+        <w:rPr>
+          <w:rFonts w:ascii="Menlo" w:hAnsi="Menlo" w:eastAsia="Heiti SC"/>
+          <w:sz w:val="18"/>
+        </w:rPr>
+        <w:t xml:space="preserve">    const uint32_t cpuid = *(volatile uint32_t *)0xE000ED00;</w:t>
+      </w:r>
+    </w:p>
+    <w:p>
+      <w:pPr>
+        <w:keepNext/>
+        <w:spacing w:after="0" w:line="236" w:lineRule="exact"/>
+        <w:snapToGrid w:val="0"/>
+      </w:pPr>
+      <w:r>
+        <w:rPr>
+          <w:rFonts w:ascii="Menlo" w:hAnsi="Menlo" w:eastAsia="Heiti SC"/>
+          <w:sz w:val="18"/>
+        </w:rPr>
+        <w:t xml:space="preserve">    int ok = initialized_data == 0x12345678 &amp;&amp; zero_data == 0</w:t>
+      </w:r>
+    </w:p>
+    <w:p>
+      <w:pPr>
+        <w:keepNext/>
+        <w:spacing w:after="0" w:line="236" w:lineRule="exact"/>
+        <w:snapToGrid w:val="0"/>
+      </w:pPr>
+      <w:r>
+        <w:rPr>
+          <w:rFonts w:ascii="Menlo" w:hAnsi="Menlo" w:eastAsia="Heiti SC"/>
+          <w:sz w:val="18"/>
+        </w:rPr>
+        <w:t xml:space="preserve">        &amp;&amp; ((cpuid &gt;&gt; 4) &amp; 0xfff) == 0xc27;</w:t>
+      </w:r>
+    </w:p>
+    <w:p>
+      <w:pPr>
+        <w:keepNext/>
+        <w:spacing w:after="0" w:line="236" w:lineRule="exact"/>
+        <w:snapToGrid w:val="0"/>
+      </w:pPr>
+      <w:r>
+        <w:rPr>
+          <w:rFonts w:ascii="Menlo" w:hAnsi="Menlo" w:eastAsia="Heiti SC"/>
+          <w:sz w:val="18"/>
+        </w:rPr>
+        <w:t xml:space="preserve">    demo_result = ok ? 0x600d : 0xdead;</w:t>
+      </w:r>
+    </w:p>
+    <w:p>
+      <w:pPr>
+        <w:keepNext/>
+        <w:spacing w:after="0" w:line="236" w:lineRule="exact"/>
+        <w:snapToGrid w:val="0"/>
+      </w:pPr>
+      <w:r>
+        <w:rPr>
+          <w:rFonts w:ascii="Menlo" w:hAnsi="Menlo" w:eastAsia="Heiti SC"/>
+          <w:sz w:val="18"/>
+        </w:rPr>
+        <w:t xml:space="preserve">    semihost(4, ok ? "PASS: Cortex-M7; .data initialized; .bss zero; bare-metal C99\n"</w:t>
+      </w:r>
+    </w:p>
+    <w:p>
+      <w:pPr>
+        <w:keepNext w:val="0"/>
+        <w:spacing w:after="0" w:line="236" w:lineRule="exact"/>
+        <w:snapToGrid w:val="0"/>
+      </w:pPr>
+      <w:r>
+        <w:rPr>
+          <w:rFonts w:ascii="Menlo" w:hAnsi="Menlo" w:eastAsia="Heiti SC"/>
+          <w:sz w:val="18"/>
+        </w:rPr>
+        <w:t xml:space="preserve">                   : "FAIL: Cortex-M7 or C runtime validation\n");</w:t>
       </w:r>
     </w:p>
     <w:p>
@@ -563,7 +1552,15 @@
         <w:snapToGrid w:val="0"/>
       </w:pPr>
       <w:r>
-        <w:t>第二周最终记录显示 12 项检查全部通过，包括模型时钟、构建、第一周回归，以及 9 个第二周运行场景，其中正常启动重复了 3 次。已验证数据初始化、UART 参数边界和部分故障路径。这些属于后续阶段成果，未计入第一周完成项。</w:t>
+        <w:t>demo_result 提供 GDB 可观察的结果标记。该检查用于当前启动示例；semihosting 输出依赖宿主机调试服务，UART 驱动的验证见后续进度。</w:t>
+      </w:r>
+    </w:p>
+    <w:p>
+      <w:pPr>
+        <w:snapToGrid w:val="0"/>
+      </w:pPr>
+      <w:r>
+        <w:br w:type="page"/>
       </w:r>
     </w:p>
     <w:p>
@@ -572,7 +1569,1316 @@
         <w:snapToGrid w:val="0"/>
       </w:pPr>
       <w:r>
-        <w:t>四 下一阶段计划及需确认事项</w:t>
+        <w:t>三 测试方法与实际结果</w:t>
+      </w:r>
+    </w:p>
+    <w:p>
+      <w:pPr>
+        <w:pStyle w:val="Heading2"/>
+        <w:snapToGrid w:val="0"/>
+      </w:pPr>
+      <w:r>
+        <w:t>先设置错误初值再验证恢复</w:t>
+      </w:r>
+    </w:p>
+    <w:p>
+      <w:pPr>
+        <w:snapToGrid w:val="0"/>
+      </w:pPr>
+      <w:r>
+        <w:t>只观察 .bss 为零可能产生假阳性，因为模拟 RAM 初值可能恰好为零。因此测试先停在 Reset_Handler，污染 .data 和 .bss，再运行到 main 的第一条指令检查恢复结果；同时在 .bss 末尾后放置 4 字节哨兵，观察该位置是否被误写。</w:t>
+      </w:r>
+    </w:p>
+    <w:p>
+      <w:pPr>
+        <w:snapToGrid w:val="0"/>
+      </w:pPr>
+      <w:r>
+        <w:t>测试于 10 月 13 日执行，在独立构建目录生成并运行同一 ELF。汇总包含 6 项检查，其中工具和构建各 1 项，固件运行场景 4 项。</w:t>
+      </w:r>
+    </w:p>
+    <w:tbl>
+      <w:tblPr>
+        <w:tblW w:type="auto" w:w="0"/>
+        <w:jc w:val="center"/>
+        <w:tblLayout w:type="fixed"/>
+        <w:tblLook w:firstColumn="1" w:firstRow="1" w:lastColumn="0" w:lastRow="0" w:noHBand="0" w:noVBand="1" w:val="04A0"/>
+        <w:tblBorders>
+          <w:top w:val="single" w:sz="4" w:color="D9D9D9"/>
+          <w:left w:val="single" w:sz="4" w:color="D9D9D9"/>
+          <w:bottom w:val="single" w:sz="4" w:color="D9D9D9"/>
+          <w:right w:val="single" w:sz="4" w:color="D9D9D9"/>
+          <w:insideH w:val="single" w:sz="4" w:color="D9D9D9"/>
+          <w:insideV w:val="single" w:sz="4" w:color="D9D9D9"/>
+        </w:tblBorders>
+      </w:tblPr>
+      <w:tblGrid>
+        <w:gridCol w:w="1872"/>
+        <w:gridCol w:w="4968"/>
+        <w:gridCol w:w="3240"/>
+      </w:tblGrid>
+      <w:tr>
+        <w:trPr>
+          <w:cantSplit/>
+          <w:tblHeader/>
+        </w:trPr>
+        <w:tc>
+          <w:tcPr>
+            <w:tcW w:type="dxa" w:w="1872"/>
+            <w:vAlign w:val="center"/>
+            <w:tcMar>
+              <w:top w:w="90" w:type="dxa"/>
+              <w:left w:w="110" w:type="dxa"/>
+              <w:bottom w:w="90" w:type="dxa"/>
+              <w:right w:w="110" w:type="dxa"/>
+            </w:tcMar>
+            <w:shd w:fill="E8EEF4"/>
+          </w:tcPr>
+          <w:p>
+            <w:pPr>
+              <w:spacing w:after="0" w:line="300" w:lineRule="exact"/>
+              <w:jc w:val="center"/>
+              <w:snapToGrid w:val="0"/>
+            </w:pPr>
+            <w:r>
+              <w:rPr>
+                <w:b/>
+                <w:sz w:val="21"/>
+              </w:rPr>
+              <w:t>检查项</w:t>
+            </w:r>
+          </w:p>
+        </w:tc>
+        <w:tc>
+          <w:tcPr>
+            <w:tcW w:type="dxa" w:w="4968"/>
+            <w:vAlign w:val="center"/>
+            <w:tcMar>
+              <w:top w:w="90" w:type="dxa"/>
+              <w:left w:w="110" w:type="dxa"/>
+              <w:bottom w:w="90" w:type="dxa"/>
+              <w:right w:w="110" w:type="dxa"/>
+            </w:tcMar>
+            <w:shd w:fill="E8EEF4"/>
+          </w:tcPr>
+          <w:p>
+            <w:pPr>
+              <w:spacing w:after="0" w:line="300" w:lineRule="exact"/>
+              <w:jc w:val="center"/>
+              <w:snapToGrid w:val="0"/>
+            </w:pPr>
+            <w:r>
+              <w:rPr>
+                <w:b/>
+                <w:sz w:val="21"/>
+              </w:rPr>
+              <w:t>操作与预期</w:t>
+            </w:r>
+          </w:p>
+        </w:tc>
+        <w:tc>
+          <w:tcPr>
+            <w:tcW w:type="dxa" w:w="3240"/>
+            <w:vAlign w:val="center"/>
+            <w:tcMar>
+              <w:top w:w="90" w:type="dxa"/>
+              <w:left w:w="110" w:type="dxa"/>
+              <w:bottom w:w="90" w:type="dxa"/>
+              <w:right w:w="110" w:type="dxa"/>
+            </w:tcMar>
+            <w:shd w:fill="E8EEF4"/>
+          </w:tcPr>
+          <w:p>
+            <w:pPr>
+              <w:spacing w:after="0" w:line="300" w:lineRule="exact"/>
+              <w:jc w:val="center"/>
+              <w:snapToGrid w:val="0"/>
+            </w:pPr>
+            <w:r>
+              <w:rPr>
+                <w:b/>
+                <w:sz w:val="21"/>
+              </w:rPr>
+              <w:t>实际结果</w:t>
+            </w:r>
+          </w:p>
+        </w:tc>
+      </w:tr>
+      <w:tr>
+        <w:trPr>
+          <w:cantSplit/>
+        </w:trPr>
+        <w:tc>
+          <w:tcPr>
+            <w:tcW w:type="dxa" w:w="1872"/>
+            <w:vAlign w:val="center"/>
+            <w:tcMar>
+              <w:top w:w="90" w:type="dxa"/>
+              <w:left w:w="110" w:type="dxa"/>
+              <w:bottom w:w="90" w:type="dxa"/>
+              <w:right w:w="110" w:type="dxa"/>
+            </w:tcMar>
+            <w:shd w:fill="FFFFFF"/>
+          </w:tcPr>
+          <w:p>
+            <w:pPr>
+              <w:spacing w:after="0" w:line="300" w:lineRule="exact"/>
+              <w:snapToGrid w:val="0"/>
+            </w:pPr>
+            <w:r>
+              <w:rPr>
+                <w:b w:val="0"/>
+                <w:sz w:val="21"/>
+              </w:rPr>
+              <w:t>工具检查</w:t>
+            </w:r>
+          </w:p>
+        </w:tc>
+        <w:tc>
+          <w:tcPr>
+            <w:tcW w:type="dxa" w:w="4968"/>
+            <w:vAlign w:val="center"/>
+            <w:tcMar>
+              <w:top w:w="90" w:type="dxa"/>
+              <w:left w:w="110" w:type="dxa"/>
+              <w:bottom w:w="90" w:type="dxa"/>
+              <w:right w:w="110" w:type="dxa"/>
+            </w:tcMar>
+            <w:shd w:fill="FFFFFF"/>
+          </w:tcPr>
+          <w:p>
+            <w:pPr>
+              <w:spacing w:after="0" w:line="300" w:lineRule="exact"/>
+              <w:snapToGrid w:val="0"/>
+            </w:pPr>
+            <w:r>
+              <w:rPr>
+                <w:b w:val="0"/>
+                <w:sz w:val="21"/>
+              </w:rPr>
+              <w:t>六个工具可用，满足版本约束</w:t>
+            </w:r>
+          </w:p>
+        </w:tc>
+        <w:tc>
+          <w:tcPr>
+            <w:tcW w:type="dxa" w:w="3240"/>
+            <w:vAlign w:val="center"/>
+            <w:tcMar>
+              <w:top w:w="90" w:type="dxa"/>
+              <w:left w:w="110" w:type="dxa"/>
+              <w:bottom w:w="90" w:type="dxa"/>
+              <w:right w:w="110" w:type="dxa"/>
+            </w:tcMar>
+            <w:shd w:fill="FFFFFF"/>
+          </w:tcPr>
+          <w:p>
+            <w:pPr>
+              <w:spacing w:after="0" w:line="300" w:lineRule="exact"/>
+              <w:snapToGrid w:val="0"/>
+            </w:pPr>
+            <w:r>
+              <w:rPr>
+                <w:b w:val="0"/>
+                <w:sz w:val="21"/>
+              </w:rPr>
+              <w:t>PASS</w:t>
+            </w:r>
+          </w:p>
+        </w:tc>
+      </w:tr>
+      <w:tr>
+        <w:trPr>
+          <w:cantSplit/>
+        </w:trPr>
+        <w:tc>
+          <w:tcPr>
+            <w:tcW w:type="dxa" w:w="1872"/>
+            <w:vAlign w:val="center"/>
+            <w:tcMar>
+              <w:top w:w="90" w:type="dxa"/>
+              <w:left w:w="110" w:type="dxa"/>
+              <w:bottom w:w="90" w:type="dxa"/>
+              <w:right w:w="110" w:type="dxa"/>
+            </w:tcMar>
+            <w:shd w:fill="FFFFFF"/>
+          </w:tcPr>
+          <w:p>
+            <w:pPr>
+              <w:spacing w:after="0" w:line="300" w:lineRule="exact"/>
+              <w:snapToGrid w:val="0"/>
+            </w:pPr>
+            <w:r>
+              <w:rPr>
+                <w:b w:val="0"/>
+                <w:sz w:val="21"/>
+              </w:rPr>
+              <w:t>全新构建</w:t>
+            </w:r>
+          </w:p>
+        </w:tc>
+        <w:tc>
+          <w:tcPr>
+            <w:tcW w:type="dxa" w:w="4968"/>
+            <w:vAlign w:val="center"/>
+            <w:tcMar>
+              <w:top w:w="90" w:type="dxa"/>
+              <w:left w:w="110" w:type="dxa"/>
+              <w:bottom w:w="90" w:type="dxa"/>
+              <w:right w:w="110" w:type="dxa"/>
+            </w:tcMar>
+            <w:shd w:fill="FFFFFF"/>
+          </w:tcPr>
+          <w:p>
+            <w:pPr>
+              <w:spacing w:after="0" w:line="300" w:lineRule="exact"/>
+              <w:snapToGrid w:val="0"/>
+            </w:pPr>
+            <w:r>
+              <w:rPr>
+                <w:b w:val="0"/>
+                <w:sz w:val="21"/>
+              </w:rPr>
+              <w:t>编译链接成功，检查 ELF 段布局</w:t>
+            </w:r>
+          </w:p>
+        </w:tc>
+        <w:tc>
+          <w:tcPr>
+            <w:tcW w:type="dxa" w:w="3240"/>
+            <w:vAlign w:val="center"/>
+            <w:tcMar>
+              <w:top w:w="90" w:type="dxa"/>
+              <w:left w:w="110" w:type="dxa"/>
+              <w:bottom w:w="90" w:type="dxa"/>
+              <w:right w:w="110" w:type="dxa"/>
+            </w:tcMar>
+            <w:shd w:fill="FFFFFF"/>
+          </w:tcPr>
+          <w:p>
+            <w:pPr>
+              <w:spacing w:after="0" w:line="300" w:lineRule="exact"/>
+              <w:snapToGrid w:val="0"/>
+            </w:pPr>
+            <w:r>
+              <w:rPr>
+                <w:b w:val="0"/>
+                <w:sz w:val="21"/>
+              </w:rPr>
+              <w:t>PASS；text 368、data 4、bss 8 字节</w:t>
+            </w:r>
+          </w:p>
+        </w:tc>
+      </w:tr>
+      <w:tr>
+        <w:trPr>
+          <w:cantSplit/>
+        </w:trPr>
+        <w:tc>
+          <w:tcPr>
+            <w:tcW w:type="dxa" w:w="1872"/>
+            <w:vAlign w:val="center"/>
+            <w:tcMar>
+              <w:top w:w="90" w:type="dxa"/>
+              <w:left w:w="110" w:type="dxa"/>
+              <w:bottom w:w="90" w:type="dxa"/>
+              <w:right w:w="110" w:type="dxa"/>
+            </w:tcMar>
+            <w:shd w:fill="FFFFFF"/>
+          </w:tcPr>
+          <w:p>
+            <w:pPr>
+              <w:spacing w:after="0" w:line="300" w:lineRule="exact"/>
+              <w:snapToGrid w:val="0"/>
+            </w:pPr>
+            <w:r>
+              <w:rPr>
+                <w:b w:val="0"/>
+                <w:sz w:val="21"/>
+              </w:rPr>
+              <w:t>正常启动</w:t>
+            </w:r>
+          </w:p>
+        </w:tc>
+        <w:tc>
+          <w:tcPr>
+            <w:tcW w:type="dxa" w:w="4968"/>
+            <w:vAlign w:val="center"/>
+            <w:tcMar>
+              <w:top w:w="90" w:type="dxa"/>
+              <w:left w:w="110" w:type="dxa"/>
+              <w:bottom w:w="90" w:type="dxa"/>
+              <w:right w:w="110" w:type="dxa"/>
+            </w:tcMar>
+            <w:shd w:fill="FFFFFF"/>
+          </w:tcPr>
+          <w:p>
+            <w:pPr>
+              <w:spacing w:after="0" w:line="300" w:lineRule="exact"/>
+              <w:snapToGrid w:val="0"/>
+            </w:pPr>
+            <w:r>
+              <w:rPr>
+                <w:b w:val="0"/>
+                <w:sz w:val="21"/>
+              </w:rPr>
+              <w:t>输出 PASS，正常退出</w:t>
+            </w:r>
+          </w:p>
+        </w:tc>
+        <w:tc>
+          <w:tcPr>
+            <w:tcW w:type="dxa" w:w="3240"/>
+            <w:vAlign w:val="center"/>
+            <w:tcMar>
+              <w:top w:w="90" w:type="dxa"/>
+              <w:left w:w="110" w:type="dxa"/>
+              <w:bottom w:w="90" w:type="dxa"/>
+              <w:right w:w="110" w:type="dxa"/>
+            </w:tcMar>
+            <w:shd w:fill="FFFFFF"/>
+          </w:tcPr>
+          <w:p>
+            <w:pPr>
+              <w:spacing w:after="0" w:line="300" w:lineRule="exact"/>
+              <w:snapToGrid w:val="0"/>
+            </w:pPr>
+            <w:r>
+              <w:rPr>
+                <w:b w:val="0"/>
+                <w:sz w:val="21"/>
+              </w:rPr>
+              <w:t>PASS；退出码 0</w:t>
+            </w:r>
+          </w:p>
+        </w:tc>
+      </w:tr>
+      <w:tr>
+        <w:trPr>
+          <w:cantSplit/>
+        </w:trPr>
+        <w:tc>
+          <w:tcPr>
+            <w:tcW w:type="dxa" w:w="1872"/>
+            <w:vAlign w:val="center"/>
+            <w:tcMar>
+              <w:top w:w="90" w:type="dxa"/>
+              <w:left w:w="110" w:type="dxa"/>
+              <w:bottom w:w="90" w:type="dxa"/>
+              <w:right w:w="110" w:type="dxa"/>
+            </w:tcMar>
+            <w:shd w:fill="FFFFFF"/>
+          </w:tcPr>
+          <w:p>
+            <w:pPr>
+              <w:spacing w:after="0" w:line="300" w:lineRule="exact"/>
+              <w:snapToGrid w:val="0"/>
+            </w:pPr>
+            <w:r>
+              <w:rPr>
+                <w:b w:val="0"/>
+                <w:sz w:val="21"/>
+              </w:rPr>
+              <w:t>污染后启动</w:t>
+            </w:r>
+          </w:p>
+        </w:tc>
+        <w:tc>
+          <w:tcPr>
+            <w:tcW w:type="dxa" w:w="4968"/>
+            <w:vAlign w:val="center"/>
+            <w:tcMar>
+              <w:top w:w="90" w:type="dxa"/>
+              <w:left w:w="110" w:type="dxa"/>
+              <w:bottom w:w="90" w:type="dxa"/>
+              <w:right w:w="110" w:type="dxa"/>
+            </w:tcMar>
+            <w:shd w:fill="FFFFFF"/>
+          </w:tcPr>
+          <w:p>
+            <w:pPr>
+              <w:spacing w:after="0" w:line="300" w:lineRule="exact"/>
+              <w:snapToGrid w:val="0"/>
+            </w:pPr>
+            <w:r>
+              <w:rPr>
+                <w:b w:val="0"/>
+                <w:sz w:val="21"/>
+              </w:rPr>
+              <w:t>data 填 CC、BSS 填 A5；应恢复且保留哨兵</w:t>
+            </w:r>
+          </w:p>
+        </w:tc>
+        <w:tc>
+          <w:tcPr>
+            <w:tcW w:type="dxa" w:w="3240"/>
+            <w:vAlign w:val="center"/>
+            <w:tcMar>
+              <w:top w:w="90" w:type="dxa"/>
+              <w:left w:w="110" w:type="dxa"/>
+              <w:bottom w:w="90" w:type="dxa"/>
+              <w:right w:w="110" w:type="dxa"/>
+            </w:tcMar>
+            <w:shd w:fill="FFFFFF"/>
+          </w:tcPr>
+          <w:p>
+            <w:pPr>
+              <w:spacing w:after="0" w:line="300" w:lineRule="exact"/>
+              <w:snapToGrid w:val="0"/>
+            </w:pPr>
+            <w:r>
+              <w:rPr>
+                <w:b w:val="0"/>
+                <w:sz w:val="21"/>
+              </w:rPr>
+              <w:t>PASS；data 正确、BSS 全零、哨兵保留</w:t>
+            </w:r>
+          </w:p>
+        </w:tc>
+      </w:tr>
+      <w:tr>
+        <w:trPr>
+          <w:cantSplit/>
+        </w:trPr>
+        <w:tc>
+          <w:tcPr>
+            <w:tcW w:type="dxa" w:w="1872"/>
+            <w:vAlign w:val="center"/>
+            <w:tcMar>
+              <w:top w:w="90" w:type="dxa"/>
+              <w:left w:w="110" w:type="dxa"/>
+              <w:bottom w:w="90" w:type="dxa"/>
+              <w:right w:w="110" w:type="dxa"/>
+            </w:tcMar>
+            <w:shd w:fill="FFFFFF"/>
+          </w:tcPr>
+          <w:p>
+            <w:pPr>
+              <w:spacing w:after="0" w:line="300" w:lineRule="exact"/>
+              <w:snapToGrid w:val="0"/>
+            </w:pPr>
+            <w:r>
+              <w:rPr>
+                <w:b w:val="0"/>
+                <w:sz w:val="21"/>
+              </w:rPr>
+              <w:t>破坏 data 变量</w:t>
+            </w:r>
+          </w:p>
+        </w:tc>
+        <w:tc>
+          <w:tcPr>
+            <w:tcW w:type="dxa" w:w="4968"/>
+            <w:vAlign w:val="center"/>
+            <w:tcMar>
+              <w:top w:w="90" w:type="dxa"/>
+              <w:left w:w="110" w:type="dxa"/>
+              <w:bottom w:w="90" w:type="dxa"/>
+              <w:right w:w="110" w:type="dxa"/>
+            </w:tcMar>
+            <w:shd w:fill="FFFFFF"/>
+          </w:tcPr>
+          <w:p>
+            <w:pPr>
+              <w:spacing w:after="0" w:line="300" w:lineRule="exact"/>
+              <w:snapToGrid w:val="0"/>
+            </w:pPr>
+            <w:r>
+              <w:rPr>
+                <w:b w:val="0"/>
+                <w:sz w:val="21"/>
+              </w:rPr>
+              <w:t>main 入口改 initialized_data；应识别错误</w:t>
+            </w:r>
+          </w:p>
+        </w:tc>
+        <w:tc>
+          <w:tcPr>
+            <w:tcW w:type="dxa" w:w="3240"/>
+            <w:vAlign w:val="center"/>
+            <w:tcMar>
+              <w:top w:w="90" w:type="dxa"/>
+              <w:left w:w="110" w:type="dxa"/>
+              <w:bottom w:w="90" w:type="dxa"/>
+              <w:right w:w="110" w:type="dxa"/>
+            </w:tcMar>
+            <w:shd w:fill="FFFFFF"/>
+          </w:tcPr>
+          <w:p>
+            <w:pPr>
+              <w:spacing w:after="0" w:line="300" w:lineRule="exact"/>
+              <w:snapToGrid w:val="0"/>
+            </w:pPr>
+            <w:r>
+              <w:rPr>
+                <w:b w:val="0"/>
+                <w:sz w:val="21"/>
+              </w:rPr>
+              <w:t>PASS；输出 FAIL，结果 0xdead，退出 1</w:t>
+            </w:r>
+          </w:p>
+        </w:tc>
+      </w:tr>
+      <w:tr>
+        <w:trPr>
+          <w:cantSplit/>
+        </w:trPr>
+        <w:tc>
+          <w:tcPr>
+            <w:tcW w:type="dxa" w:w="1872"/>
+            <w:vAlign w:val="center"/>
+            <w:tcMar>
+              <w:top w:w="90" w:type="dxa"/>
+              <w:left w:w="110" w:type="dxa"/>
+              <w:bottom w:w="90" w:type="dxa"/>
+              <w:right w:w="110" w:type="dxa"/>
+            </w:tcMar>
+            <w:shd w:fill="FFFFFF"/>
+          </w:tcPr>
+          <w:p>
+            <w:pPr>
+              <w:spacing w:after="0" w:line="300" w:lineRule="exact"/>
+              <w:snapToGrid w:val="0"/>
+            </w:pPr>
+            <w:r>
+              <w:rPr>
+                <w:b w:val="0"/>
+                <w:sz w:val="21"/>
+              </w:rPr>
+              <w:t>破坏 BSS 变量</w:t>
+            </w:r>
+          </w:p>
+        </w:tc>
+        <w:tc>
+          <w:tcPr>
+            <w:tcW w:type="dxa" w:w="4968"/>
+            <w:vAlign w:val="center"/>
+            <w:tcMar>
+              <w:top w:w="90" w:type="dxa"/>
+              <w:left w:w="110" w:type="dxa"/>
+              <w:bottom w:w="90" w:type="dxa"/>
+              <w:right w:w="110" w:type="dxa"/>
+            </w:tcMar>
+            <w:shd w:fill="FFFFFF"/>
+          </w:tcPr>
+          <w:p>
+            <w:pPr>
+              <w:spacing w:after="0" w:line="300" w:lineRule="exact"/>
+              <w:snapToGrid w:val="0"/>
+            </w:pPr>
+            <w:r>
+              <w:rPr>
+                <w:b w:val="0"/>
+                <w:sz w:val="21"/>
+              </w:rPr>
+              <w:t>main 入口改 zero_data；应识别错误</w:t>
+            </w:r>
+          </w:p>
+        </w:tc>
+        <w:tc>
+          <w:tcPr>
+            <w:tcW w:type="dxa" w:w="3240"/>
+            <w:vAlign w:val="center"/>
+            <w:tcMar>
+              <w:top w:w="90" w:type="dxa"/>
+              <w:left w:w="110" w:type="dxa"/>
+              <w:bottom w:w="90" w:type="dxa"/>
+              <w:right w:w="110" w:type="dxa"/>
+            </w:tcMar>
+            <w:shd w:fill="FFFFFF"/>
+          </w:tcPr>
+          <w:p>
+            <w:pPr>
+              <w:spacing w:after="0" w:line="300" w:lineRule="exact"/>
+              <w:snapToGrid w:val="0"/>
+            </w:pPr>
+            <w:r>
+              <w:rPr>
+                <w:b w:val="0"/>
+                <w:sz w:val="21"/>
+              </w:rPr>
+              <w:t>PASS；输出 FAIL，结果 0xdead，退出 1</w:t>
+            </w:r>
+          </w:p>
+        </w:tc>
+      </w:tr>
+    </w:tbl>
+    <w:p>
+      <w:pPr>
+        <w:spacing w:after="40" w:before="0" w:line="240" w:lineRule="auto"/>
+        <w:snapToGrid w:val="0"/>
+      </w:pPr>
+      <w:r>
+        <w:rPr>
+          <w:sz w:val="4"/>
+        </w:rPr>
+      </w:r>
+    </w:p>
+    <w:p>
+      <w:pPr>
+        <w:pStyle w:val="Heading2"/>
+        <w:snapToGrid w:val="0"/>
+      </w:pPr>
+      <w:r>
+        <w:t>关键调试证据</w:t>
+      </w:r>
+    </w:p>
+    <w:p>
+      <w:pPr>
+        <w:snapToGrid w:val="0"/>
+      </w:pPr>
+      <w:r>
+        <w:t xml:space="preserve">以下为 </w:t>
+      </w:r>
+      <w:hyperlink r:id="rId12">
+        <w:r>
+          <w:rPr>
+            <w:rFonts w:ascii="Calibri" w:eastAsia="Songti SC"/>
+            <w:color w:val="1F4E79"/>
+          </w:rPr>
+          <w:t>初始化污染 GDB 日志</w:t>
+        </w:r>
+      </w:hyperlink>
+      <w:r>
+        <w:t xml:space="preserve"> 的节选。</w:t>
+      </w:r>
+    </w:p>
+    <w:p>
+      <w:pPr>
+        <w:keepNext/>
+        <w:spacing w:after="0" w:line="236" w:lineRule="exact"/>
+        <w:snapToGrid w:val="0"/>
+      </w:pPr>
+      <w:r>
+        <w:rPr>
+          <w:rFonts w:ascii="Menlo" w:hAnsi="Menlo" w:eastAsia="Heiti SC"/>
+          <w:sz w:val="18"/>
+        </w:rPr>
+        <w:t>RESET_MSP=0x20400000 RESET_PC=0xc4 RESET_VECTOR=0xc5</w:t>
+      </w:r>
+    </w:p>
+    <w:p>
+      <w:pPr>
+        <w:keepNext/>
+        <w:spacing w:after="0" w:line="236" w:lineRule="exact"/>
+        <w:snapToGrid w:val="0"/>
+      </w:pPr>
+      <w:r>
+        <w:rPr>
+          <w:rFonts w:ascii="Menlo" w:hAnsi="Menlo" w:eastAsia="Heiti SC"/>
+          <w:sz w:val="18"/>
+        </w:rPr>
+        <w:t>INJECTED_DATA=cccccccc</w:t>
+      </w:r>
+    </w:p>
+    <w:p>
+      <w:pPr>
+        <w:keepNext/>
+        <w:spacing w:after="0" w:line="236" w:lineRule="exact"/>
+        <w:snapToGrid w:val="0"/>
+      </w:pPr>
+      <w:r>
+        <w:rPr>
+          <w:rFonts w:ascii="Menlo" w:hAnsi="Menlo" w:eastAsia="Heiti SC"/>
+          <w:sz w:val="18"/>
+        </w:rPr>
+        <w:t>INJECTED_BSS=a5a5a5a5a5a5a5a5</w:t>
+      </w:r>
+    </w:p>
+    <w:p>
+      <w:pPr>
+        <w:keepNext/>
+        <w:spacing w:after="0" w:line="236" w:lineRule="exact"/>
+        <w:snapToGrid w:val="0"/>
+      </w:pPr>
+      <w:r>
+        <w:rPr>
+          <w:rFonts w:ascii="Menlo" w:hAnsi="Menlo" w:eastAsia="Heiti SC"/>
+          <w:sz w:val="18"/>
+        </w:rPr>
+        <w:t>RESTORED_DATA=78563412</w:t>
+      </w:r>
+    </w:p>
+    <w:p>
+      <w:pPr>
+        <w:keepNext/>
+        <w:spacing w:after="0" w:line="236" w:lineRule="exact"/>
+        <w:snapToGrid w:val="0"/>
+      </w:pPr>
+      <w:r>
+        <w:rPr>
+          <w:rFonts w:ascii="Menlo" w:hAnsi="Menlo" w:eastAsia="Heiti SC"/>
+          <w:sz w:val="18"/>
+        </w:rPr>
+        <w:t>CLEARED_BSS=0000000000000000</w:t>
+      </w:r>
+    </w:p>
+    <w:p>
+      <w:pPr>
+        <w:keepNext/>
+        <w:spacing w:after="0" w:line="236" w:lineRule="exact"/>
+        <w:snapToGrid w:val="0"/>
+      </w:pPr>
+      <w:r>
+        <w:rPr>
+          <w:rFonts w:ascii="Menlo" w:hAnsi="Menlo" w:eastAsia="Heiti SC"/>
+          <w:sz w:val="18"/>
+        </w:rPr>
+        <w:t>UPPER_SENTINEL=0x12345678</w:t>
+      </w:r>
+    </w:p>
+    <w:p>
+      <w:pPr>
+        <w:keepNext/>
+        <w:spacing w:after="0" w:line="236" w:lineRule="exact"/>
+        <w:snapToGrid w:val="0"/>
+      </w:pPr>
+      <w:r>
+        <w:rPr>
+          <w:rFonts w:ascii="Menlo" w:hAnsi="Menlo" w:eastAsia="Heiti SC"/>
+          <w:sz w:val="18"/>
+        </w:rPr>
+        <w:t>STEP_PC=0x46</w:t>
+      </w:r>
+    </w:p>
+    <w:p>
+      <w:pPr>
+        <w:keepNext w:val="0"/>
+        <w:spacing w:after="0" w:line="236" w:lineRule="exact"/>
+        <w:snapToGrid w:val="0"/>
+      </w:pPr>
+      <w:r>
+        <w:rPr>
+          <w:rFonts w:ascii="Menlo" w:hAnsi="Menlo" w:eastAsia="Heiti SC"/>
+          <w:sz w:val="18"/>
+        </w:rPr>
+        <w:t>CHECK_PASS:poisoned-startup</w:t>
+      </w:r>
+    </w:p>
+    <w:p>
+      <w:pPr>
+        <w:snapToGrid w:val="0"/>
+      </w:pPr>
+      <w:r>
+        <w:t>恢复后的字节 78 56 34 12 对应小端整数 0x12345678。复位向量值 0xc5 的最低位表示 Thumb 状态，实际指令地址为 0xc4。负向用例的退出码 1 是预期结果；最终测试脚本退出码为 0。</w:t>
+      </w:r>
+    </w:p>
+    <w:p>
+      <w:pPr>
+        <w:snapToGrid w:val="0"/>
+      </w:pPr>
+      <w:r>
+        <w:t>结论：当前布局中的数据复制、清零和错误识别符合预期。覆盖范围为 4 字节 .data、8 字节 .bss 和一处末尾哨兵；尚未覆盖任意段长度、空段和完整越界检测。</w:t>
+      </w:r>
+    </w:p>
+    <w:p>
+      <w:pPr>
+        <w:snapToGrid w:val="0"/>
+      </w:pPr>
+      <w:r>
+        <w:br w:type="page"/>
+      </w:r>
+    </w:p>
+    <w:p>
+      <w:pPr>
+        <w:pStyle w:val="Heading1"/>
+        <w:snapToGrid w:val="0"/>
+      </w:pPr>
+      <w:r>
+        <w:t>四 工业需求调研与下一阶段设计</w:t>
+      </w:r>
+    </w:p>
+    <w:p>
+      <w:pPr>
+        <w:pStyle w:val="Heading2"/>
+        <w:snapToGrid w:val="0"/>
+      </w:pPr>
+      <w:r>
+        <w:t>将需求落实到模块与验收条件</w:t>
+      </w:r>
+    </w:p>
+    <w:p>
+      <w:pPr>
+        <w:snapToGrid w:val="0"/>
+      </w:pPr>
+      <w:r>
+        <w:t>已整理的 S7 资料帮助区分更新文件验证、启动前固件验证及 PLC 用户程序启动阶段。具体型号仍需确认；本项目使用 QEMU MPS2 Cortex-M7 平台，以下模块是后续设计草案，不代表已还原 S7 内部实现。</w:t>
+      </w:r>
+    </w:p>
+    <w:tbl>
+      <w:tblPr>
+        <w:tblW w:type="auto" w:w="0"/>
+        <w:jc w:val="center"/>
+        <w:tblLayout w:type="fixed"/>
+        <w:tblLook w:firstColumn="1" w:firstRow="1" w:lastColumn="0" w:lastRow="0" w:noHBand="0" w:noVBand="1" w:val="04A0"/>
+        <w:tblBorders>
+          <w:top w:val="single" w:sz="4" w:color="D9D9D9"/>
+          <w:left w:val="single" w:sz="4" w:color="D9D9D9"/>
+          <w:bottom w:val="single" w:sz="4" w:color="D9D9D9"/>
+          <w:right w:val="single" w:sz="4" w:color="D9D9D9"/>
+          <w:insideH w:val="single" w:sz="4" w:color="D9D9D9"/>
+          <w:insideV w:val="single" w:sz="4" w:color="D9D9D9"/>
+        </w:tblBorders>
+      </w:tblPr>
+      <w:tblGrid>
+        <w:gridCol w:w="1872"/>
+        <w:gridCol w:w="4968"/>
+        <w:gridCol w:w="3240"/>
+      </w:tblGrid>
+      <w:tr>
+        <w:trPr>
+          <w:cantSplit/>
+          <w:tblHeader/>
+        </w:trPr>
+        <w:tc>
+          <w:tcPr>
+            <w:tcW w:type="dxa" w:w="1872"/>
+            <w:vAlign w:val="center"/>
+            <w:tcMar>
+              <w:top w:w="90" w:type="dxa"/>
+              <w:left w:w="110" w:type="dxa"/>
+              <w:bottom w:w="90" w:type="dxa"/>
+              <w:right w:w="110" w:type="dxa"/>
+            </w:tcMar>
+            <w:shd w:fill="E8EEF4"/>
+          </w:tcPr>
+          <w:p>
+            <w:pPr>
+              <w:spacing w:after="0" w:line="300" w:lineRule="exact"/>
+              <w:jc w:val="center"/>
+              <w:snapToGrid w:val="0"/>
+            </w:pPr>
+            <w:r>
+              <w:rPr>
+                <w:b/>
+                <w:sz w:val="21"/>
+              </w:rPr>
+              <w:t>设计模块</w:t>
+            </w:r>
+          </w:p>
+        </w:tc>
+        <w:tc>
+          <w:tcPr>
+            <w:tcW w:type="dxa" w:w="4968"/>
+            <w:vAlign w:val="center"/>
+            <w:tcMar>
+              <w:top w:w="90" w:type="dxa"/>
+              <w:left w:w="110" w:type="dxa"/>
+              <w:bottom w:w="90" w:type="dxa"/>
+              <w:right w:w="110" w:type="dxa"/>
+            </w:tcMar>
+            <w:shd w:fill="E8EEF4"/>
+          </w:tcPr>
+          <w:p>
+            <w:pPr>
+              <w:spacing w:after="0" w:line="300" w:lineRule="exact"/>
+              <w:jc w:val="center"/>
+              <w:snapToGrid w:val="0"/>
+            </w:pPr>
+            <w:r>
+              <w:rPr>
+                <w:b/>
+                <w:sz w:val="21"/>
+              </w:rPr>
+              <w:t>要解决的问题</w:t>
+            </w:r>
+          </w:p>
+        </w:tc>
+        <w:tc>
+          <w:tcPr>
+            <w:tcW w:type="dxa" w:w="3240"/>
+            <w:vAlign w:val="center"/>
+            <w:tcMar>
+              <w:top w:w="90" w:type="dxa"/>
+              <w:left w:w="110" w:type="dxa"/>
+              <w:bottom w:w="90" w:type="dxa"/>
+              <w:right w:w="110" w:type="dxa"/>
+            </w:tcMar>
+            <w:shd w:fill="E8EEF4"/>
+          </w:tcPr>
+          <w:p>
+            <w:pPr>
+              <w:spacing w:after="0" w:line="300" w:lineRule="exact"/>
+              <w:jc w:val="center"/>
+              <w:snapToGrid w:val="0"/>
+            </w:pPr>
+            <w:r>
+              <w:rPr>
+                <w:b/>
+                <w:sz w:val="21"/>
+              </w:rPr>
+              <w:t>后续验收方法</w:t>
+            </w:r>
+          </w:p>
+        </w:tc>
+      </w:tr>
+      <w:tr>
+        <w:trPr>
+          <w:cantSplit/>
+        </w:trPr>
+        <w:tc>
+          <w:tcPr>
+            <w:tcW w:type="dxa" w:w="1872"/>
+            <w:vAlign w:val="center"/>
+            <w:tcMar>
+              <w:top w:w="90" w:type="dxa"/>
+              <w:left w:w="110" w:type="dxa"/>
+              <w:bottom w:w="90" w:type="dxa"/>
+              <w:right w:w="110" w:type="dxa"/>
+            </w:tcMar>
+            <w:shd w:fill="FFFFFF"/>
+          </w:tcPr>
+          <w:p>
+            <w:pPr>
+              <w:spacing w:after="0" w:line="300" w:lineRule="exact"/>
+              <w:snapToGrid w:val="0"/>
+            </w:pPr>
+            <w:r>
+              <w:rPr>
+                <w:b w:val="0"/>
+                <w:sz w:val="21"/>
+              </w:rPr>
+              <w:t>镜像检查</w:t>
+            </w:r>
+          </w:p>
+        </w:tc>
+        <w:tc>
+          <w:tcPr>
+            <w:tcW w:type="dxa" w:w="4968"/>
+            <w:vAlign w:val="center"/>
+            <w:tcMar>
+              <w:top w:w="90" w:type="dxa"/>
+              <w:left w:w="110" w:type="dxa"/>
+              <w:bottom w:w="90" w:type="dxa"/>
+              <w:right w:w="110" w:type="dxa"/>
+            </w:tcMar>
+            <w:shd w:fill="FFFFFF"/>
+          </w:tcPr>
+          <w:p>
+            <w:pPr>
+              <w:spacing w:after="0" w:line="300" w:lineRule="exact"/>
+              <w:snapToGrid w:val="0"/>
+            </w:pPr>
+            <w:r>
+              <w:rPr>
+                <w:b w:val="0"/>
+                <w:sz w:val="21"/>
+              </w:rPr>
+              <w:t>镜像长度、入口和内容是否有效</w:t>
+            </w:r>
+          </w:p>
+        </w:tc>
+        <w:tc>
+          <w:tcPr>
+            <w:tcW w:type="dxa" w:w="3240"/>
+            <w:vAlign w:val="center"/>
+            <w:tcMar>
+              <w:top w:w="90" w:type="dxa"/>
+              <w:left w:w="110" w:type="dxa"/>
+              <w:bottom w:w="90" w:type="dxa"/>
+              <w:right w:w="110" w:type="dxa"/>
+            </w:tcMar>
+            <w:shd w:fill="FFFFFF"/>
+          </w:tcPr>
+          <w:p>
+            <w:pPr>
+              <w:spacing w:after="0" w:line="300" w:lineRule="exact"/>
+              <w:snapToGrid w:val="0"/>
+            </w:pPr>
+            <w:r>
+              <w:rPr>
+                <w:b w:val="0"/>
+                <w:sz w:val="21"/>
+              </w:rPr>
+              <w:t>输入截断、超长和非法入口，确认拒绝</w:t>
+            </w:r>
+          </w:p>
+        </w:tc>
+      </w:tr>
+      <w:tr>
+        <w:trPr>
+          <w:cantSplit/>
+        </w:trPr>
+        <w:tc>
+          <w:tcPr>
+            <w:tcW w:type="dxa" w:w="1872"/>
+            <w:vAlign w:val="center"/>
+            <w:tcMar>
+              <w:top w:w="90" w:type="dxa"/>
+              <w:left w:w="110" w:type="dxa"/>
+              <w:bottom w:w="90" w:type="dxa"/>
+              <w:right w:w="110" w:type="dxa"/>
+            </w:tcMar>
+            <w:shd w:fill="FFFFFF"/>
+          </w:tcPr>
+          <w:p>
+            <w:pPr>
+              <w:spacing w:after="0" w:line="300" w:lineRule="exact"/>
+              <w:snapToGrid w:val="0"/>
+            </w:pPr>
+            <w:r>
+              <w:rPr>
+                <w:b w:val="0"/>
+                <w:sz w:val="21"/>
+              </w:rPr>
+              <w:t>存储层</w:t>
+            </w:r>
+          </w:p>
+        </w:tc>
+        <w:tc>
+          <w:tcPr>
+            <w:tcW w:type="dxa" w:w="4968"/>
+            <w:vAlign w:val="center"/>
+            <w:tcMar>
+              <w:top w:w="90" w:type="dxa"/>
+              <w:left w:w="110" w:type="dxa"/>
+              <w:bottom w:w="90" w:type="dxa"/>
+              <w:right w:w="110" w:type="dxa"/>
+            </w:tcMar>
+            <w:shd w:fill="FFFFFF"/>
+          </w:tcPr>
+          <w:p>
+            <w:pPr>
+              <w:spacing w:after="0" w:line="300" w:lineRule="exact"/>
+              <w:snapToGrid w:val="0"/>
+            </w:pPr>
+            <w:r>
+              <w:rPr>
+                <w:b w:val="0"/>
+                <w:sz w:val="21"/>
+              </w:rPr>
+              <w:t>写入约束与升级状态能否持久保存</w:t>
+            </w:r>
+          </w:p>
+        </w:tc>
+        <w:tc>
+          <w:tcPr>
+            <w:tcW w:type="dxa" w:w="3240"/>
+            <w:vAlign w:val="center"/>
+            <w:tcMar>
+              <w:top w:w="90" w:type="dxa"/>
+              <w:left w:w="110" w:type="dxa"/>
+              <w:bottom w:w="90" w:type="dxa"/>
+              <w:right w:w="110" w:type="dxa"/>
+            </w:tcMar>
+            <w:shd w:fill="FFFFFF"/>
+          </w:tcPr>
+          <w:p>
+            <w:pPr>
+              <w:spacing w:after="0" w:line="300" w:lineRule="exact"/>
+              <w:snapToGrid w:val="0"/>
+            </w:pPr>
+            <w:r>
+              <w:rPr>
+                <w:b w:val="0"/>
+                <w:sz w:val="21"/>
+              </w:rPr>
+              <w:t>模拟写入中断，检查有效记录判定</w:t>
+            </w:r>
+          </w:p>
+        </w:tc>
+      </w:tr>
+      <w:tr>
+        <w:trPr>
+          <w:cantSplit/>
+        </w:trPr>
+        <w:tc>
+          <w:tcPr>
+            <w:tcW w:type="dxa" w:w="1872"/>
+            <w:vAlign w:val="center"/>
+            <w:tcMar>
+              <w:top w:w="90" w:type="dxa"/>
+              <w:left w:w="110" w:type="dxa"/>
+              <w:bottom w:w="90" w:type="dxa"/>
+              <w:right w:w="110" w:type="dxa"/>
+            </w:tcMar>
+            <w:shd w:fill="FFFFFF"/>
+          </w:tcPr>
+          <w:p>
+            <w:pPr>
+              <w:spacing w:after="0" w:line="300" w:lineRule="exact"/>
+              <w:snapToGrid w:val="0"/>
+            </w:pPr>
+            <w:r>
+              <w:rPr>
+                <w:b w:val="0"/>
+                <w:sz w:val="21"/>
+              </w:rPr>
+              <w:t>启动选择</w:t>
+            </w:r>
+          </w:p>
+        </w:tc>
+        <w:tc>
+          <w:tcPr>
+            <w:tcW w:type="dxa" w:w="4968"/>
+            <w:vAlign w:val="center"/>
+            <w:tcMar>
+              <w:top w:w="90" w:type="dxa"/>
+              <w:left w:w="110" w:type="dxa"/>
+              <w:bottom w:w="90" w:type="dxa"/>
+              <w:right w:w="110" w:type="dxa"/>
+            </w:tcMar>
+            <w:shd w:fill="FFFFFF"/>
+          </w:tcPr>
+          <w:p>
+            <w:pPr>
+              <w:spacing w:after="0" w:line="300" w:lineRule="exact"/>
+              <w:snapToGrid w:val="0"/>
+            </w:pPr>
+            <w:r>
+              <w:rPr>
+                <w:b w:val="0"/>
+                <w:sz w:val="21"/>
+              </w:rPr>
+              <w:t>候选镜像失败后如何恢复</w:t>
+            </w:r>
+          </w:p>
+        </w:tc>
+        <w:tc>
+          <w:tcPr>
+            <w:tcW w:type="dxa" w:w="3240"/>
+            <w:vAlign w:val="center"/>
+            <w:tcMar>
+              <w:top w:w="90" w:type="dxa"/>
+              <w:left w:w="110" w:type="dxa"/>
+              <w:bottom w:w="90" w:type="dxa"/>
+              <w:right w:w="110" w:type="dxa"/>
+            </w:tcMar>
+            <w:shd w:fill="FFFFFF"/>
+          </w:tcPr>
+          <w:p>
+            <w:pPr>
+              <w:spacing w:after="0" w:line="300" w:lineRule="exact"/>
+              <w:snapToGrid w:val="0"/>
+            </w:pPr>
+            <w:r>
+              <w:rPr>
+                <w:b w:val="0"/>
+                <w:sz w:val="21"/>
+              </w:rPr>
+              <w:t>验证失败和试运行失败时选择已确认镜像</w:t>
+            </w:r>
+          </w:p>
+        </w:tc>
+      </w:tr>
+      <w:tr>
+        <w:trPr>
+          <w:cantSplit/>
+        </w:trPr>
+        <w:tc>
+          <w:tcPr>
+            <w:tcW w:type="dxa" w:w="1872"/>
+            <w:vAlign w:val="center"/>
+            <w:tcMar>
+              <w:top w:w="90" w:type="dxa"/>
+              <w:left w:w="110" w:type="dxa"/>
+              <w:bottom w:w="90" w:type="dxa"/>
+              <w:right w:w="110" w:type="dxa"/>
+            </w:tcMar>
+            <w:shd w:fill="FFFFFF"/>
+          </w:tcPr>
+          <w:p>
+            <w:pPr>
+              <w:spacing w:after="0" w:line="300" w:lineRule="exact"/>
+              <w:snapToGrid w:val="0"/>
+            </w:pPr>
+            <w:r>
+              <w:rPr>
+                <w:b w:val="0"/>
+                <w:sz w:val="21"/>
+              </w:rPr>
+              <w:t>应用交接</w:t>
+            </w:r>
+          </w:p>
+        </w:tc>
+        <w:tc>
+          <w:tcPr>
+            <w:tcW w:type="dxa" w:w="4968"/>
+            <w:vAlign w:val="center"/>
+            <w:tcMar>
+              <w:top w:w="90" w:type="dxa"/>
+              <w:left w:w="110" w:type="dxa"/>
+              <w:bottom w:w="90" w:type="dxa"/>
+              <w:right w:w="110" w:type="dxa"/>
+            </w:tcMar>
+            <w:shd w:fill="FFFFFF"/>
+          </w:tcPr>
+          <w:p>
+            <w:pPr>
+              <w:spacing w:after="0" w:line="300" w:lineRule="exact"/>
+              <w:snapToGrid w:val="0"/>
+            </w:pPr>
+            <w:r>
+              <w:rPr>
+                <w:b w:val="0"/>
+                <w:sz w:val="21"/>
+              </w:rPr>
+              <w:t>栈、向量表和中断状态如何交给应用</w:t>
+            </w:r>
+          </w:p>
+        </w:tc>
+        <w:tc>
+          <w:tcPr>
+            <w:tcW w:type="dxa" w:w="3240"/>
+            <w:vAlign w:val="center"/>
+            <w:tcMar>
+              <w:top w:w="90" w:type="dxa"/>
+              <w:left w:w="110" w:type="dxa"/>
+              <w:bottom w:w="90" w:type="dxa"/>
+              <w:right w:w="110" w:type="dxa"/>
+            </w:tcMar>
+            <w:shd w:fill="FFFFFF"/>
+          </w:tcPr>
+          <w:p>
+            <w:pPr>
+              <w:spacing w:after="0" w:line="300" w:lineRule="exact"/>
+              <w:snapToGrid w:val="0"/>
+            </w:pPr>
+            <w:r>
+              <w:rPr>
+                <w:b w:val="0"/>
+                <w:sz w:val="21"/>
+              </w:rPr>
+              <w:t>检查入口、MSP 和跳转前状态</w:t>
+            </w:r>
+          </w:p>
+        </w:tc>
+      </w:tr>
+    </w:tbl>
+    <w:p>
+      <w:pPr>
+        <w:spacing w:after="40" w:before="0" w:line="240" w:lineRule="auto"/>
+        <w:snapToGrid w:val="0"/>
+      </w:pPr>
+      <w:r>
+        <w:rPr>
+          <w:sz w:val="4"/>
+        </w:rPr>
+      </w:r>
+    </w:p>
+    <w:p>
+      <w:pPr>
+        <w:snapToGrid w:val="0"/>
+      </w:pPr>
+      <w:r>
+        <w:t>候选设计是先保留已确认镜像，将更新写入候选区，验证通过后试运行，再由应用确认成功。这样可以把“接收完成”“验证通过”和“实际运行成功”作为不同阶段处理。持久化元数据的格式和切换时机需要先确定，随后才能进行有意义的断电恢复实验。</w:t>
+      </w:r>
+    </w:p>
+    <w:p>
+      <w:pPr>
+        <w:pStyle w:val="Heading2"/>
+        <w:snapToGrid w:val="0"/>
+      </w:pPr>
+      <w:r>
+        <w:t>当前问题与改进计划</w:t>
+      </w:r>
+    </w:p>
+    <w:p>
+      <w:pPr>
+        <w:snapToGrid w:val="0"/>
+      </w:pPr>
+      <w:r>
+        <w:t>第一周将“能构建、运行、调试同一份固件”作为环境验收条件。进一步学习需要结合源码和 GDB，说明每一步的输入、输出和失败表现。开发中使用工具辅助生成和整理的部分，也需要逐项阅读和复现。</w:t>
       </w:r>
     </w:p>
     <w:tbl>
@@ -649,7 +2955,7 @@
                 <w:b/>
                 <w:sz w:val="21"/>
               </w:rPr>
-              <w:t>预期结果</w:t>
+              <w:t>预期交付与验收条件</w:t>
             </w:r>
           </w:p>
         </w:tc>
@@ -680,7 +2986,7 @@
                 <w:b w:val="0"/>
                 <w:sz w:val="21"/>
               </w:rPr>
-              <w:t>熟悉现有代码与调试流程</w:t>
+              <w:t>熟悉现有启动及驱动代码</w:t>
             </w:r>
           </w:p>
         </w:tc>
@@ -706,7 +3012,7 @@
                 <w:b w:val="0"/>
                 <w:sz w:val="21"/>
               </w:rPr>
-              <w:t>能结合代码说明复位到 main 的过程，并演示正常启动和一个故障用例</w:t>
+              <w:t>演示复位到 main、UART 正常输出及一个故障定位过程</w:t>
             </w:r>
           </w:p>
         </w:tc>
@@ -737,7 +3043,7 @@
                 <w:b w:val="0"/>
                 <w:sz w:val="21"/>
               </w:rPr>
-              <w:t>增加 UART 接收与中断处理</w:t>
+              <w:t>UART 接收与中断</w:t>
             </w:r>
           </w:p>
         </w:tc>
@@ -763,7 +3069,7 @@
                 <w:b w:val="0"/>
                 <w:sz w:val="21"/>
               </w:rPr>
-              <w:t>完成接收、缓冲区边界及溢出处理测试，保存对应日志</w:t>
+              <w:t>完成接收与缓冲区边界测试，明确溢出处理方式</w:t>
             </w:r>
           </w:p>
         </w:tc>
@@ -794,7 +3100,7 @@
                 <w:b w:val="0"/>
                 <w:sz w:val="21"/>
               </w:rPr>
-              <w:t>明确 Flash 仿真方案</w:t>
+              <w:t>Flash 仿真方案</w:t>
             </w:r>
           </w:p>
         </w:tc>
@@ -820,7 +3126,7 @@
                 <w:b w:val="0"/>
                 <w:sz w:val="21"/>
               </w:rPr>
-              <w:t>先确定擦写约束、重启后数据保存方式和断电测试条件，再实施存储层</w:t>
+              <w:t>明确擦写约束、重启后保存方式和断电注入点</w:t>
             </w:r>
           </w:p>
         </w:tc>
@@ -842,7 +3148,88 @@
         <w:snapToGrid w:val="0"/>
       </w:pPr>
       <w:r>
-        <w:t>当前尚未实现持久化 Flash、独立应用跳转、签名验证和升级回滚。需请带教确认参考的 S7 CPU 型号，以及本项目以功能演示为主，还是需要进一步对应安全标准条款，以便确定后续开发范围。</w:t>
+        <w:t>需请带教确认参考的 S7 CPU 型号，以及项目侧重功能演示还是需要对应安全标准条款。当前尚未实现持久化 Flash、独立应用跳转、签名验证与升级回滚；这些工作将按后续阶段安排。</w:t>
+      </w:r>
+    </w:p>
+    <w:p>
+      <w:pPr>
+        <w:pStyle w:val="Heading2"/>
+        <w:snapToGrid w:val="0"/>
+      </w:pPr>
+      <w:r>
+        <w:t>交付入口</w:t>
+      </w:r>
+    </w:p>
+    <w:p>
+      <w:pPr>
+        <w:snapToGrid w:val="0"/>
+      </w:pPr>
+      <w:r>
+        <w:t xml:space="preserve">工程位于 Siemens_Intern/codes。第一周 </w:t>
+      </w:r>
+      <w:hyperlink r:id="rId13">
+        <w:r>
+          <w:rPr>
+            <w:rFonts w:ascii="Calibri" w:eastAsia="Songti SC"/>
+            <w:color w:val="1F4E79"/>
+          </w:rPr>
+          <w:t>环境报告</w:t>
+        </w:r>
+      </w:hyperlink>
+      <w:r>
+        <w:t>、</w:t>
+      </w:r>
+      <w:hyperlink r:id="rId14">
+        <w:r>
+          <w:rPr>
+            <w:rFonts w:ascii="Calibri" w:eastAsia="Songti SC"/>
+            <w:color w:val="1F4E79"/>
+          </w:rPr>
+          <w:t>增强验证报告</w:t>
+        </w:r>
+      </w:hyperlink>
+      <w:r>
+        <w:t>、</w:t>
+      </w:r>
+      <w:hyperlink r:id="rId15">
+        <w:r>
+          <w:rPr>
+            <w:rFonts w:ascii="Calibri" w:eastAsia="Songti SC"/>
+            <w:color w:val="1F4E79"/>
+          </w:rPr>
+          <w:t>学习笔记</w:t>
+        </w:r>
+      </w:hyperlink>
+      <w:r>
+        <w:t xml:space="preserve"> 和 </w:t>
+      </w:r>
+      <w:hyperlink r:id="rId16">
+        <w:r>
+          <w:rPr>
+            <w:rFonts w:ascii="Calibri" w:eastAsia="Songti SC"/>
+            <w:color w:val="1F4E79"/>
+          </w:rPr>
+          <w:t>测试摘要</w:t>
+        </w:r>
+      </w:hyperlink>
+      <w:r>
+        <w:t xml:space="preserve"> 均已整理。测试日志中的旧绝对路径是当时运行记录，当前入口以项目目录为准。</w:t>
+      </w:r>
+    </w:p>
+    <w:p>
+      <w:pPr>
+        <w:snapToGrid w:val="0"/>
+      </w:pPr>
+      <w:r>
+        <w:t>复现方式：进入 codes 目录，执行 source scripts/env.sh，然后运行 python3 scripts/verify-startup.py；第二周验收使用 python3 scripts/verify-week2.py。每次生成新的证据目录。</w:t>
+      </w:r>
+    </w:p>
+    <w:p>
+      <w:pPr>
+        <w:snapToGrid w:val="0"/>
+      </w:pPr>
+      <w:r>
+        <w:br w:type="page"/>
       </w:r>
     </w:p>
     <w:p>
@@ -851,7 +3238,7 @@
         <w:snapToGrid w:val="0"/>
       </w:pPr>
       <w:r>
-        <w:t>五 交付与证据入口</w:t>
+        <w:t>五 截至本次更新的 UART 后续进度</w:t>
       </w:r>
     </w:p>
     <w:p>
@@ -859,7 +3246,84 @@
         <w:snapToGrid w:val="0"/>
       </w:pPr>
       <w:r>
-        <w:t>工程路径：/Users/charton/projects/Siemens_Intern/codes</w:t>
+        <w:t>本节单独记录 10 月 14 日完成的第二周阶段工作。新增 bootloader.elf，保留第一周 Demo；第二周代码提交为 8cbafe1。已完成 Git 提交和 GitHub 推送：</w:t>
+      </w:r>
+      <w:hyperlink r:id="rId17">
+        <w:r>
+          <w:rPr>
+            <w:rFonts w:ascii="Calibri" w:eastAsia="Songti SC"/>
+            <w:color w:val="1F4E79"/>
+          </w:rPr>
+          <w:t>远程仓库</w:t>
+        </w:r>
+      </w:hyperlink>
+      <w:r>
+        <w:t xml:space="preserve"> 的 main 分支与本地已提交版本一致，提交号为 9f8969f。第一周基线 8bb81c4、第二周代码 8cbafe1 的提交历史均已保留。仓库统一管理代码、周报、规划及笔记。</w:t>
+      </w:r>
+    </w:p>
+    <w:p>
+      <w:pPr>
+        <w:pStyle w:val="Heading2"/>
+        <w:snapToGrid w:val="0"/>
+      </w:pPr>
+      <w:r>
+        <w:t>模块关系与发送实现</w:t>
+      </w:r>
+    </w:p>
+    <w:p>
+      <w:pPr>
+        <w:keepNext/>
+        <w:spacing w:after="0" w:line="236" w:lineRule="exact"/>
+        <w:snapToGrid w:val="0"/>
+      </w:pPr>
+      <w:r>
+        <w:rPr>
+          <w:rFonts w:ascii="Menlo" w:hAnsi="Menlo" w:eastAsia="Heiti SC"/>
+          <w:sz w:val="18"/>
+        </w:rPr>
+        <w:t>src/week2/startup.S → main.c → board.c（板级初始化与时钟）</w:t>
+      </w:r>
+    </w:p>
+    <w:p>
+      <w:pPr>
+        <w:keepNext/>
+        <w:spacing w:after="0" w:line="236" w:lineRule="exact"/>
+        <w:snapToGrid w:val="0"/>
+      </w:pPr>
+      <w:r>
+        <w:rPr>
+          <w:rFonts w:ascii="Menlo" w:hAnsi="Menlo" w:eastAsia="Heiti SC"/>
+          <w:sz w:val="18"/>
+        </w:rPr>
+        <w:t xml:space="preserve">                            → uart.c（配置与轮询发送）</w:t>
+      </w:r>
+    </w:p>
+    <w:p>
+      <w:pPr>
+        <w:keepNext/>
+        <w:spacing w:after="0" w:line="236" w:lineRule="exact"/>
+        <w:snapToGrid w:val="0"/>
+      </w:pPr>
+      <w:r>
+        <w:rPr>
+          <w:rFonts w:ascii="Menlo" w:hAnsi="Menlo" w:eastAsia="Heiti SC"/>
+          <w:sz w:val="18"/>
+        </w:rPr>
+        <w:t xml:space="preserve">                            → boot_idle（主流程等待）</w:t>
+      </w:r>
+    </w:p>
+    <w:p>
+      <w:pPr>
+        <w:keepNext w:val="0"/>
+        <w:spacing w:after="0" w:line="236" w:lineRule="exact"/>
+        <w:snapToGrid w:val="0"/>
+      </w:pPr>
+      <w:r>
+        <w:rPr>
+          <w:rFonts w:ascii="Menlo" w:hAnsi="Menlo" w:eastAsia="Heiti SC"/>
+          <w:sz w:val="18"/>
+        </w:rPr>
+        <w:t>异常入口 → exception_handler → fault_idle（异常等待）</w:t>
       </w:r>
     </w:p>
     <w:p>
@@ -867,7 +3331,117 @@
         <w:snapToGrid w:val="0"/>
       </w:pPr>
       <w:r>
-        <w:t>第一周交付：README.md、docs/validation-report.md、docs/week1-learning-notes.md、docs/week1-audit.md。第一周检查汇总位于 logs/week1-review-20261013-125900/summary.json。</w:t>
+        <w:t xml:space="preserve">UART 驱动独立处理寄存器访问和返回值，主流程组织自检及日志。当前模型使用固定 25 MHz 时钟，115200 配置的分频值为 217。下面摘录自 </w:t>
+      </w:r>
+      <w:hyperlink r:id="rId18">
+        <w:r>
+          <w:rPr>
+            <w:rFonts w:ascii="Calibri" w:eastAsia="Songti SC"/>
+            <w:color w:val="1F4E79"/>
+          </w:rPr>
+          <w:t>src/week2/uart.c</w:t>
+        </w:r>
+      </w:hyperlink>
+      <w:r>
+        <w:t>。</w:t>
+      </w:r>
+    </w:p>
+    <w:p>
+      <w:pPr>
+        <w:keepNext/>
+        <w:spacing w:after="0" w:line="236" w:lineRule="exact"/>
+        <w:snapToGrid w:val="0"/>
+      </w:pPr>
+      <w:r>
+        <w:rPr>
+          <w:rFonts w:ascii="Menlo" w:hAnsi="Menlo" w:eastAsia="Heiti SC"/>
+          <w:sz w:val="18"/>
+        </w:rPr>
+        <w:t>int uart_flush(void) {</w:t>
+      </w:r>
+    </w:p>
+    <w:p>
+      <w:pPr>
+        <w:keepNext/>
+        <w:spacing w:after="0" w:line="236" w:lineRule="exact"/>
+        <w:snapToGrid w:val="0"/>
+      </w:pPr>
+      <w:r>
+        <w:rPr>
+          <w:rFonts w:ascii="Menlo" w:hAnsi="Menlo" w:eastAsia="Heiti SC"/>
+          <w:sz w:val="18"/>
+        </w:rPr>
+        <w:t xml:space="preserve">    if ((CTRL &amp; TX_ENABLE) == 0u) return -1;</w:t>
+      </w:r>
+    </w:p>
+    <w:p>
+      <w:pPr>
+        <w:keepNext/>
+        <w:spacing w:after="0" w:line="236" w:lineRule="exact"/>
+        <w:snapToGrid w:val="0"/>
+      </w:pPr>
+      <w:r>
+        <w:rPr>
+          <w:rFonts w:ascii="Menlo" w:hAnsi="Menlo" w:eastAsia="Heiti SC"/>
+          <w:sz w:val="18"/>
+        </w:rPr>
+        <w:t xml:space="preserve">    for (uint32_t n = 0; n &lt; POLL_LIMIT; ++n) {</w:t>
+      </w:r>
+    </w:p>
+    <w:p>
+      <w:pPr>
+        <w:keepNext/>
+        <w:spacing w:after="0" w:line="236" w:lineRule="exact"/>
+        <w:snapToGrid w:val="0"/>
+      </w:pPr>
+      <w:r>
+        <w:rPr>
+          <w:rFonts w:ascii="Menlo" w:hAnsi="Menlo" w:eastAsia="Heiti SC"/>
+          <w:sz w:val="18"/>
+        </w:rPr>
+        <w:t xml:space="preserve">        if ((STATE &amp; TX_FULL) == 0u) return 0;</w:t>
+      </w:r>
+    </w:p>
+    <w:p>
+      <w:pPr>
+        <w:keepNext/>
+        <w:spacing w:after="0" w:line="236" w:lineRule="exact"/>
+        <w:snapToGrid w:val="0"/>
+      </w:pPr>
+      <w:r>
+        <w:rPr>
+          <w:rFonts w:ascii="Menlo" w:hAnsi="Menlo" w:eastAsia="Heiti SC"/>
+          <w:sz w:val="18"/>
+        </w:rPr>
+        <w:t xml:space="preserve">    }</w:t>
+      </w:r>
+    </w:p>
+    <w:p>
+      <w:pPr>
+        <w:keepNext/>
+        <w:spacing w:after="0" w:line="236" w:lineRule="exact"/>
+        <w:snapToGrid w:val="0"/>
+      </w:pPr>
+      <w:r>
+        <w:rPr>
+          <w:rFonts w:ascii="Menlo" w:hAnsi="Menlo" w:eastAsia="Heiti SC"/>
+          <w:sz w:val="18"/>
+        </w:rPr>
+        <w:t xml:space="preserve">    return -1;</w:t>
+      </w:r>
+    </w:p>
+    <w:p>
+      <w:pPr>
+        <w:keepNext w:val="0"/>
+        <w:spacing w:after="0" w:line="236" w:lineRule="exact"/>
+        <w:snapToGrid w:val="0"/>
+      </w:pPr>
+      <w:r>
+        <w:rPr>
+          <w:rFonts w:ascii="Menlo" w:hAnsi="Menlo" w:eastAsia="Heiti SC"/>
+          <w:sz w:val="18"/>
+        </w:rPr>
+        <w:t>}</w:t>
       </w:r>
     </w:p>
     <w:p>
@@ -875,7 +3449,416 @@
         <w:snapToGrid w:val="0"/>
       </w:pPr>
       <w:r>
-        <w:t>后续进度依据：docs/week2-test-report.md 及 logs/week2-20261014-003543/summary.json。完整实验参数和调试细节见上述材料。</w:t>
+        <w:t>uart_flush 检查 TX 使能并轮询发送缓冲区状态，超过循环上限返回错误；uart_putc 仅在允许发送后写数据寄存器。该上限是循环次数，尚不是按实际时间定义的超时。当前为轮询 TX，接收和中断处理仍待开发。</w:t>
+      </w:r>
+    </w:p>
+    <w:p>
+      <w:pPr>
+        <w:pStyle w:val="Heading2"/>
+        <w:snapToGrid w:val="0"/>
+      </w:pPr>
+      <w:r>
+        <w:t>输出与验收结果</w:t>
+      </w:r>
+    </w:p>
+    <w:p>
+      <w:pPr>
+        <w:snapToGrid w:val="0"/>
+      </w:pPr>
+      <w:r>
+        <w:t>关闭 semihosting 后，UART 输出如下。原始记录保存 CRLF，本处按行展示。</w:t>
+      </w:r>
+    </w:p>
+    <w:p>
+      <w:pPr>
+        <w:keepNext/>
+        <w:spacing w:after="0" w:line="236" w:lineRule="exact"/>
+        <w:snapToGrid w:val="0"/>
+      </w:pPr>
+      <w:r>
+        <w:rPr>
+          <w:rFonts w:ascii="Menlo" w:hAnsi="Menlo" w:eastAsia="Heiti SC"/>
+          <w:sz w:val="18"/>
+        </w:rPr>
+        <w:t>BOOT: week2 mps2-an500 Cortex-M7</w:t>
+      </w:r>
+    </w:p>
+    <w:p>
+      <w:pPr>
+        <w:keepNext/>
+        <w:spacing w:after="0" w:line="236" w:lineRule="exact"/>
+        <w:snapToGrid w:val="0"/>
+      </w:pPr>
+      <w:r>
+        <w:rPr>
+          <w:rFonts w:ascii="Menlo" w:hAnsi="Menlo" w:eastAsia="Heiti SC"/>
+          <w:sz w:val="18"/>
+        </w:rPr>
+        <w:t>CLOCK: 25000000 Hz (QEMU fixed)</w:t>
+      </w:r>
+    </w:p>
+    <w:p>
+      <w:pPr>
+        <w:keepNext/>
+        <w:spacing w:after="0" w:line="236" w:lineRule="exact"/>
+        <w:snapToGrid w:val="0"/>
+      </w:pPr>
+      <w:r>
+        <w:rPr>
+          <w:rFonts w:ascii="Menlo" w:hAnsi="Menlo" w:eastAsia="Heiti SC"/>
+          <w:sz w:val="18"/>
+        </w:rPr>
+        <w:t>UART0: 115200 requested, divisor=217, 8N1</w:t>
+      </w:r>
+    </w:p>
+    <w:p>
+      <w:pPr>
+        <w:keepNext w:val="0"/>
+        <w:spacing w:after="0" w:line="236" w:lineRule="exact"/>
+        <w:snapToGrid w:val="0"/>
+      </w:pPr>
+      <w:r>
+        <w:rPr>
+          <w:rFonts w:ascii="Menlo" w:hAnsi="Menlo" w:eastAsia="Heiti SC"/>
+          <w:sz w:val="18"/>
+        </w:rPr>
+        <w:t>PASS: C runtime; UART boot ready</w:t>
+      </w:r>
+    </w:p>
+    <w:tbl>
+      <w:tblPr>
+        <w:tblW w:type="auto" w:w="0"/>
+        <w:jc w:val="center"/>
+        <w:tblLayout w:type="fixed"/>
+        <w:tblLook w:firstColumn="1" w:firstRow="1" w:lastColumn="0" w:lastRow="0" w:noHBand="0" w:noVBand="1" w:val="04A0"/>
+        <w:tblBorders>
+          <w:top w:val="single" w:sz="4" w:color="D9D9D9"/>
+          <w:left w:val="single" w:sz="4" w:color="D9D9D9"/>
+          <w:bottom w:val="single" w:sz="4" w:color="D9D9D9"/>
+          <w:right w:val="single" w:sz="4" w:color="D9D9D9"/>
+          <w:insideH w:val="single" w:sz="4" w:color="D9D9D9"/>
+          <w:insideV w:val="single" w:sz="4" w:color="D9D9D9"/>
+        </w:tblBorders>
+      </w:tblPr>
+      <w:tblGrid>
+        <w:gridCol w:w="2880"/>
+        <w:gridCol w:w="7200"/>
+      </w:tblGrid>
+      <w:tr>
+        <w:trPr>
+          <w:cantSplit/>
+          <w:tblHeader/>
+        </w:trPr>
+        <w:tc>
+          <w:tcPr>
+            <w:tcW w:type="dxa" w:w="2880"/>
+            <w:vAlign w:val="center"/>
+            <w:tcMar>
+              <w:top w:w="90" w:type="dxa"/>
+              <w:left w:w="110" w:type="dxa"/>
+              <w:bottom w:w="90" w:type="dxa"/>
+              <w:right w:w="110" w:type="dxa"/>
+            </w:tcMar>
+            <w:shd w:fill="E8EEF4"/>
+          </w:tcPr>
+          <w:p>
+            <w:pPr>
+              <w:spacing w:after="0" w:line="300" w:lineRule="exact"/>
+              <w:jc w:val="center"/>
+              <w:snapToGrid w:val="0"/>
+            </w:pPr>
+            <w:r>
+              <w:rPr>
+                <w:b/>
+                <w:sz w:val="21"/>
+              </w:rPr>
+              <w:t>场景</w:t>
+            </w:r>
+          </w:p>
+        </w:tc>
+        <w:tc>
+          <w:tcPr>
+            <w:tcW w:type="dxa" w:w="7200"/>
+            <w:vAlign w:val="center"/>
+            <w:tcMar>
+              <w:top w:w="90" w:type="dxa"/>
+              <w:left w:w="110" w:type="dxa"/>
+              <w:bottom w:w="90" w:type="dxa"/>
+              <w:right w:w="110" w:type="dxa"/>
+            </w:tcMar>
+            <w:shd w:fill="E8EEF4"/>
+          </w:tcPr>
+          <w:p>
+            <w:pPr>
+              <w:spacing w:after="0" w:line="300" w:lineRule="exact"/>
+              <w:jc w:val="center"/>
+              <w:snapToGrid w:val="0"/>
+            </w:pPr>
+            <w:r>
+              <w:rPr>
+                <w:b/>
+                <w:sz w:val="21"/>
+              </w:rPr>
+              <w:t>10 月 14 日记录中的实际结果</w:t>
+            </w:r>
+          </w:p>
+        </w:tc>
+      </w:tr>
+      <w:tr>
+        <w:trPr>
+          <w:cantSplit/>
+        </w:trPr>
+        <w:tc>
+          <w:tcPr>
+            <w:tcW w:type="dxa" w:w="2880"/>
+            <w:vAlign w:val="center"/>
+            <w:tcMar>
+              <w:top w:w="90" w:type="dxa"/>
+              <w:left w:w="110" w:type="dxa"/>
+              <w:bottom w:w="90" w:type="dxa"/>
+              <w:right w:w="110" w:type="dxa"/>
+            </w:tcMar>
+            <w:shd w:fill="FFFFFF"/>
+          </w:tcPr>
+          <w:p>
+            <w:pPr>
+              <w:spacing w:after="0" w:line="300" w:lineRule="exact"/>
+              <w:snapToGrid w:val="0"/>
+            </w:pPr>
+            <w:r>
+              <w:rPr>
+                <w:b w:val="0"/>
+                <w:sz w:val="21"/>
+              </w:rPr>
+              <w:t>三次正常启动</w:t>
+            </w:r>
+          </w:p>
+        </w:tc>
+        <w:tc>
+          <w:tcPr>
+            <w:tcW w:type="dxa" w:w="7200"/>
+            <w:vAlign w:val="center"/>
+            <w:tcMar>
+              <w:top w:w="90" w:type="dxa"/>
+              <w:left w:w="110" w:type="dxa"/>
+              <w:bottom w:w="90" w:type="dxa"/>
+              <w:right w:w="110" w:type="dxa"/>
+            </w:tcMar>
+            <w:shd w:fill="FFFFFF"/>
+          </w:tcPr>
+          <w:p>
+            <w:pPr>
+              <w:spacing w:after="0" w:line="300" w:lineRule="exact"/>
+              <w:snapToGrid w:val="0"/>
+            </w:pPr>
+            <w:r>
+              <w:rPr>
+                <w:b w:val="0"/>
+                <w:sz w:val="21"/>
+              </w:rPr>
+              <w:t>每次输出预期的 144 字节，完整内容比对通过</w:t>
+            </w:r>
+          </w:p>
+        </w:tc>
+      </w:tr>
+      <w:tr>
+        <w:trPr>
+          <w:cantSplit/>
+        </w:trPr>
+        <w:tc>
+          <w:tcPr>
+            <w:tcW w:type="dxa" w:w="2880"/>
+            <w:vAlign w:val="center"/>
+            <w:tcMar>
+              <w:top w:w="90" w:type="dxa"/>
+              <w:left w:w="110" w:type="dxa"/>
+              <w:bottom w:w="90" w:type="dxa"/>
+              <w:right w:w="110" w:type="dxa"/>
+            </w:tcMar>
+            <w:shd w:fill="FFFFFF"/>
+          </w:tcPr>
+          <w:p>
+            <w:pPr>
+              <w:spacing w:after="0" w:line="300" w:lineRule="exact"/>
+              <w:snapToGrid w:val="0"/>
+            </w:pPr>
+            <w:r>
+              <w:rPr>
+                <w:b w:val="0"/>
+                <w:sz w:val="21"/>
+              </w:rPr>
+              <w:t>初始化污染</w:t>
+            </w:r>
+          </w:p>
+        </w:tc>
+        <w:tc>
+          <w:tcPr>
+            <w:tcW w:type="dxa" w:w="7200"/>
+            <w:vAlign w:val="center"/>
+            <w:tcMar>
+              <w:top w:w="90" w:type="dxa"/>
+              <w:left w:w="110" w:type="dxa"/>
+              <w:bottom w:w="90" w:type="dxa"/>
+              <w:right w:w="110" w:type="dxa"/>
+            </w:tcMar>
+            <w:shd w:fill="FFFFFF"/>
+          </w:tcPr>
+          <w:p>
+            <w:pPr>
+              <w:spacing w:after="0" w:line="300" w:lineRule="exact"/>
+              <w:snapToGrid w:val="0"/>
+            </w:pPr>
+            <w:r>
+              <w:rPr>
+                <w:b w:val="0"/>
+                <w:sz w:val="21"/>
+              </w:rPr>
+              <w:t>20 字节 data 恢复、36 字节 BSS 清零、哨兵保留</w:t>
+            </w:r>
+          </w:p>
+        </w:tc>
+      </w:tr>
+      <w:tr>
+        <w:trPr>
+          <w:cantSplit/>
+        </w:trPr>
+        <w:tc>
+          <w:tcPr>
+            <w:tcW w:type="dxa" w:w="2880"/>
+            <w:vAlign w:val="center"/>
+            <w:tcMar>
+              <w:top w:w="90" w:type="dxa"/>
+              <w:left w:w="110" w:type="dxa"/>
+              <w:bottom w:w="90" w:type="dxa"/>
+              <w:right w:w="110" w:type="dxa"/>
+            </w:tcMar>
+            <w:shd w:fill="FFFFFF"/>
+          </w:tcPr>
+          <w:p>
+            <w:pPr>
+              <w:spacing w:after="0" w:line="300" w:lineRule="exact"/>
+              <w:snapToGrid w:val="0"/>
+            </w:pPr>
+            <w:r>
+              <w:rPr>
+                <w:b w:val="0"/>
+                <w:sz w:val="21"/>
+              </w:rPr>
+              <w:t>参数边界与变量破坏</w:t>
+            </w:r>
+          </w:p>
+        </w:tc>
+        <w:tc>
+          <w:tcPr>
+            <w:tcW w:type="dxa" w:w="7200"/>
+            <w:vAlign w:val="center"/>
+            <w:tcMar>
+              <w:top w:w="90" w:type="dxa"/>
+              <w:left w:w="110" w:type="dxa"/>
+              <w:bottom w:w="90" w:type="dxa"/>
+              <w:right w:w="110" w:type="dxa"/>
+            </w:tcMar>
+            <w:shd w:fill="FFFFFF"/>
+          </w:tcPr>
+          <w:p>
+            <w:pPr>
+              <w:spacing w:after="0" w:line="300" w:lineRule="exact"/>
+              <w:snapToGrid w:val="0"/>
+            </w:pPr>
+            <w:r>
+              <w:rPr>
+                <w:b w:val="0"/>
+                <w:sz w:val="21"/>
+              </w:rPr>
+              <w:t>无效配置被拒绝；数据破坏被检测并输出 FAIL</w:t>
+            </w:r>
+          </w:p>
+        </w:tc>
+      </w:tr>
+      <w:tr>
+        <w:trPr>
+          <w:cantSplit/>
+        </w:trPr>
+        <w:tc>
+          <w:tcPr>
+            <w:tcW w:type="dxa" w:w="2880"/>
+            <w:vAlign w:val="center"/>
+            <w:tcMar>
+              <w:top w:w="90" w:type="dxa"/>
+              <w:left w:w="110" w:type="dxa"/>
+              <w:bottom w:w="90" w:type="dxa"/>
+              <w:right w:w="110" w:type="dxa"/>
+            </w:tcMar>
+            <w:shd w:fill="FFFFFF"/>
+          </w:tcPr>
+          <w:p>
+            <w:pPr>
+              <w:spacing w:after="0" w:line="300" w:lineRule="exact"/>
+              <w:snapToGrid w:val="0"/>
+            </w:pPr>
+            <w:r>
+              <w:rPr>
+                <w:b w:val="0"/>
+                <w:sz w:val="21"/>
+              </w:rPr>
+              <w:t>禁用 UART 与非法指令</w:t>
+            </w:r>
+          </w:p>
+        </w:tc>
+        <w:tc>
+          <w:tcPr>
+            <w:tcW w:type="dxa" w:w="7200"/>
+            <w:vAlign w:val="center"/>
+            <w:tcMar>
+              <w:top w:w="90" w:type="dxa"/>
+              <w:left w:w="110" w:type="dxa"/>
+              <w:bottom w:w="90" w:type="dxa"/>
+              <w:right w:w="110" w:type="dxa"/>
+            </w:tcMar>
+            <w:shd w:fill="FFFFFF"/>
+          </w:tcPr>
+          <w:p>
+            <w:pPr>
+              <w:spacing w:after="0" w:line="300" w:lineRule="exact"/>
+              <w:snapToGrid w:val="0"/>
+            </w:pPr>
+            <w:r>
+              <w:rPr>
+                <w:b w:val="0"/>
+                <w:sz w:val="21"/>
+              </w:rPr>
+              <w:t>分别记录串口错误状态和 HardFault 异常号 3</w:t>
+            </w:r>
+          </w:p>
+        </w:tc>
+      </w:tr>
+    </w:tbl>
+    <w:p>
+      <w:pPr>
+        <w:spacing w:after="40" w:before="0" w:line="240" w:lineRule="auto"/>
+        <w:snapToGrid w:val="0"/>
+      </w:pPr>
+      <w:r>
+        <w:rPr>
+          <w:sz w:val="4"/>
+        </w:rPr>
+      </w:r>
+    </w:p>
+    <w:p>
+      <w:pPr>
+        <w:snapToGrid w:val="0"/>
+      </w:pPr>
+      <w:hyperlink r:id="rId19">
+        <w:r>
+          <w:rPr>
+            <w:rFonts w:ascii="Calibri" w:eastAsia="Songti SC"/>
+            <w:color w:val="1F4E79"/>
+          </w:rPr>
+          <w:t>最终验收报告</w:t>
+        </w:r>
+      </w:hyperlink>
+      <w:r>
+        <w:t xml:space="preserve"> 共 12 项检查通过，含时钟、构建、第一周回归及 9 个第二周运行场景。模拟器由宿主机在断言后结束；判定依据是日志与状态检查。当前结果支持最小启动与 UART TX，不包含物理波形验证、故障恢复或工业认证。</w:t>
       </w:r>
     </w:p>
     <w:sectPr>

</xml_diff>

<commit_message>
feat: add stage 3 storage and stage 4 verified application boot
</commit_message>
<xml_diff>
--- a/reports/week01/第一周实习周报.docx
+++ b/reports/week01/第一周实习周报.docx
@@ -8,6 +8,9 @@
         <w:snapToGrid w:val="0"/>
       </w:pPr>
       <w:r>
+        <w:rPr>
+          <w:rFonts w:eastAsia="Hiragino Sans GB"/>
+        </w:rPr>
         <w:t>工业嵌入式 Bootloader 开发第一周周报</w:t>
       </w:r>
     </w:p>
@@ -18,6 +21,7 @@
       </w:pPr>
       <w:r>
         <w:rPr>
+          <w:rFonts w:eastAsia="Hiragino Sans GB"/>
           <w:sz w:val="20"/>
         </w:rPr>
         <w:t>项目：基于 QEMU 的 Cortex-M7 工业 Bootloader</w:t>
@@ -28,7 +32,10 @@
         <w:snapToGrid w:val="0"/>
       </w:pPr>
       <w:r>
-        <w:t>第一周记录：2026 年 10 月 12 日至 13 日　更新日期：2026 年 10 月 16 日</w:t>
+        <w:rPr>
+          <w:rFonts w:eastAsia="Hiragino Sans GB"/>
+        </w:rPr>
+        <w:t>第一周记录：2026 年 10 月 12 日至 13 日　更新日期：2026 年 10 月 17 日</w:t>
       </w:r>
     </w:p>
     <w:p>
@@ -36,6 +43,9 @@
         <w:snapToGrid w:val="0"/>
       </w:pPr>
       <w:r>
+        <w:rPr>
+          <w:rFonts w:eastAsia="Hiragino Sans GB"/>
+        </w:rPr>
         <w:t>第一周完成了开发环境搭建、最小裸机 Demo、GDB 启动调试和工业需求资料整理。已形成可复现的启动验证工程，10 月 13 日的增强验证共 6 项检查通过。当前工作重点是理解启动代码与测试之间的对应关系，为后续驱动及镜像加载开发打基础。</w:t>
       </w:r>
     </w:p>
@@ -45,6 +55,9 @@
         <w:snapToGrid w:val="0"/>
       </w:pPr>
       <w:r>
+        <w:rPr>
+          <w:rFonts w:eastAsia="Hiragino Sans GB"/>
+        </w:rPr>
         <w:t>一 完成情况与工程架构</w:t>
       </w:r>
     </w:p>
@@ -93,6 +106,7 @@
             </w:pPr>
             <w:r>
               <w:rPr>
+                <w:rFonts w:eastAsia="Hiragino Sans GB"/>
                 <w:b/>
                 <w:sz w:val="21"/>
               </w:rPr>
@@ -120,6 +134,7 @@
             </w:pPr>
             <w:r>
               <w:rPr>
+                <w:rFonts w:eastAsia="Hiragino Sans GB"/>
                 <w:b/>
                 <w:sz w:val="21"/>
               </w:rPr>
@@ -147,6 +162,7 @@
             </w:pPr>
             <w:r>
               <w:rPr>
+                <w:rFonts w:eastAsia="Hiragino Sans GB"/>
                 <w:b/>
                 <w:sz w:val="21"/>
               </w:rPr>
@@ -178,6 +194,7 @@
             </w:pPr>
             <w:r>
               <w:rPr>
+                <w:rFonts w:eastAsia="Hiragino Sans GB"/>
                 <w:b w:val="0"/>
                 <w:sz w:val="21"/>
               </w:rPr>
@@ -204,6 +221,7 @@
             </w:pPr>
             <w:r>
               <w:rPr>
+                <w:rFonts w:eastAsia="Hiragino Sans GB"/>
                 <w:b w:val="0"/>
                 <w:sz w:val="21"/>
               </w:rPr>
@@ -230,6 +248,7 @@
             </w:pPr>
             <w:r>
               <w:rPr>
+                <w:rFonts w:eastAsia="Hiragino Sans GB"/>
                 <w:b w:val="0"/>
                 <w:sz w:val="21"/>
               </w:rPr>
@@ -261,6 +280,7 @@
             </w:pPr>
             <w:r>
               <w:rPr>
+                <w:rFonts w:eastAsia="Hiragino Sans GB"/>
                 <w:b w:val="0"/>
                 <w:sz w:val="21"/>
               </w:rPr>
@@ -287,6 +307,7 @@
             </w:pPr>
             <w:r>
               <w:rPr>
+                <w:rFonts w:eastAsia="Hiragino Sans GB"/>
                 <w:b w:val="0"/>
                 <w:sz w:val="21"/>
               </w:rPr>
@@ -313,6 +334,7 @@
             </w:pPr>
             <w:r>
               <w:rPr>
+                <w:rFonts w:eastAsia="Hiragino Sans GB"/>
                 <w:b w:val="0"/>
                 <w:sz w:val="21"/>
               </w:rPr>
@@ -344,6 +366,7 @@
             </w:pPr>
             <w:r>
               <w:rPr>
+                <w:rFonts w:eastAsia="Hiragino Sans GB"/>
                 <w:b w:val="0"/>
                 <w:sz w:val="21"/>
               </w:rPr>
@@ -370,6 +393,7 @@
             </w:pPr>
             <w:r>
               <w:rPr>
+                <w:rFonts w:eastAsia="Hiragino Sans GB"/>
                 <w:b w:val="0"/>
                 <w:sz w:val="21"/>
               </w:rPr>
@@ -396,6 +420,7 @@
             </w:pPr>
             <w:r>
               <w:rPr>
+                <w:rFonts w:eastAsia="Hiragino Sans GB"/>
                 <w:b w:val="0"/>
                 <w:sz w:val="21"/>
               </w:rPr>
@@ -427,6 +452,7 @@
             </w:pPr>
             <w:r>
               <w:rPr>
+                <w:rFonts w:eastAsia="Hiragino Sans GB"/>
                 <w:b w:val="0"/>
                 <w:sz w:val="21"/>
               </w:rPr>
@@ -453,6 +479,7 @@
             </w:pPr>
             <w:r>
               <w:rPr>
+                <w:rFonts w:eastAsia="Hiragino Sans GB"/>
                 <w:b w:val="0"/>
                 <w:sz w:val="21"/>
               </w:rPr>
@@ -479,6 +506,7 @@
             </w:pPr>
             <w:r>
               <w:rPr>
+                <w:rFonts w:eastAsia="Hiragino Sans GB"/>
                 <w:b w:val="0"/>
                 <w:sz w:val="21"/>
               </w:rPr>
@@ -510,6 +538,7 @@
             </w:pPr>
             <w:r>
               <w:rPr>
+                <w:rFonts w:eastAsia="Hiragino Sans GB"/>
                 <w:b w:val="0"/>
                 <w:sz w:val="21"/>
               </w:rPr>
@@ -536,6 +565,7 @@
             </w:pPr>
             <w:r>
               <w:rPr>
+                <w:rFonts w:eastAsia="Hiragino Sans GB"/>
                 <w:b w:val="0"/>
                 <w:sz w:val="21"/>
               </w:rPr>
@@ -562,6 +592,7 @@
             </w:pPr>
             <w:r>
               <w:rPr>
+                <w:rFonts w:eastAsia="Hiragino Sans GB"/>
                 <w:b w:val="0"/>
                 <w:sz w:val="21"/>
               </w:rPr>
@@ -578,6 +609,7 @@
       </w:pPr>
       <w:r>
         <w:rPr>
+          <w:rFonts w:eastAsia="Hiragino Sans GB"/>
           <w:sz w:val="4"/>
         </w:rPr>
       </w:r>
@@ -588,6 +620,9 @@
         <w:snapToGrid w:val="0"/>
       </w:pPr>
       <w:r>
+        <w:rPr>
+          <w:rFonts w:eastAsia="Hiragino Sans GB"/>
+        </w:rPr>
         <w:t>构建运行与调试关系</w:t>
       </w:r>
     </w:p>
@@ -599,7 +634,7 @@
       </w:pPr>
       <w:r>
         <w:rPr>
-          <w:rFonts w:ascii="Menlo" w:hAnsi="Menlo" w:eastAsia="Heiti SC"/>
+          <w:rFonts w:ascii="Menlo" w:hAnsi="Menlo" w:eastAsia="Hiragino Sans GB"/>
           <w:sz w:val="18"/>
         </w:rPr>
         <w:t>CMake + Arm GCC + linker.ld → demo.elf</w:t>
@@ -613,7 +648,7 @@
       </w:pPr>
       <w:r>
         <w:rPr>
-          <w:rFonts w:ascii="Menlo" w:hAnsi="Menlo" w:eastAsia="Heiti SC"/>
+          <w:rFonts w:ascii="Menlo" w:hAnsi="Menlo" w:eastAsia="Hiragino Sans GB"/>
           <w:sz w:val="18"/>
         </w:rPr>
         <w:t>QEMU → 向量表 → Reset_Handler → main → 自检与输出</w:t>
@@ -627,7 +662,7 @@
       </w:pPr>
       <w:r>
         <w:rPr>
-          <w:rFonts w:ascii="Menlo" w:hAnsi="Menlo" w:eastAsia="Heiti SC"/>
+          <w:rFonts w:ascii="Menlo" w:hAnsi="Menlo" w:eastAsia="Hiragino Sans GB"/>
           <w:sz w:val="18"/>
         </w:rPr>
         <w:t>GDB  → QEMU gdbstub → 断点 单步 内存与寄存器观察</w:t>
@@ -678,6 +713,7 @@
             </w:pPr>
             <w:r>
               <w:rPr>
+                <w:rFonts w:eastAsia="Hiragino Sans GB"/>
                 <w:b/>
                 <w:sz w:val="21"/>
               </w:rPr>
@@ -705,6 +741,7 @@
             </w:pPr>
             <w:r>
               <w:rPr>
+                <w:rFonts w:eastAsia="Hiragino Sans GB"/>
                 <w:b/>
                 <w:sz w:val="21"/>
               </w:rPr>
@@ -732,6 +769,7 @@
             </w:pPr>
             <w:r>
               <w:rPr>
+                <w:rFonts w:eastAsia="Hiragino Sans GB"/>
                 <w:b/>
                 <w:sz w:val="21"/>
               </w:rPr>
@@ -763,6 +801,7 @@
             </w:pPr>
             <w:r>
               <w:rPr>
+                <w:rFonts w:eastAsia="Hiragino Sans GB"/>
                 <w:b w:val="0"/>
                 <w:sz w:val="21"/>
               </w:rPr>
@@ -789,6 +828,7 @@
             </w:pPr>
             <w:r>
               <w:rPr>
+                <w:rFonts w:eastAsia="Hiragino Sans GB"/>
                 <w:b w:val="0"/>
                 <w:sz w:val="21"/>
               </w:rPr>
@@ -815,6 +855,7 @@
             </w:pPr>
             <w:r>
               <w:rPr>
+                <w:rFonts w:eastAsia="Hiragino Sans GB"/>
                 <w:b w:val="0"/>
                 <w:sz w:val="21"/>
               </w:rPr>
@@ -846,6 +887,7 @@
             </w:pPr>
             <w:r>
               <w:rPr>
+                <w:rFonts w:eastAsia="Hiragino Sans GB"/>
                 <w:b w:val="0"/>
                 <w:sz w:val="21"/>
               </w:rPr>
@@ -872,6 +914,7 @@
             </w:pPr>
             <w:r>
               <w:rPr>
+                <w:rFonts w:eastAsia="Hiragino Sans GB"/>
                 <w:b w:val="0"/>
                 <w:sz w:val="21"/>
               </w:rPr>
@@ -898,6 +941,7 @@
             </w:pPr>
             <w:r>
               <w:rPr>
+                <w:rFonts w:eastAsia="Hiragino Sans GB"/>
                 <w:b w:val="0"/>
                 <w:sz w:val="21"/>
               </w:rPr>
@@ -929,6 +973,7 @@
             </w:pPr>
             <w:r>
               <w:rPr>
+                <w:rFonts w:eastAsia="Hiragino Sans GB"/>
                 <w:b w:val="0"/>
                 <w:sz w:val="21"/>
               </w:rPr>
@@ -955,6 +1000,7 @@
             </w:pPr>
             <w:r>
               <w:rPr>
+                <w:rFonts w:eastAsia="Hiragino Sans GB"/>
                 <w:b w:val="0"/>
                 <w:sz w:val="21"/>
               </w:rPr>
@@ -981,6 +1027,7 @@
             </w:pPr>
             <w:r>
               <w:rPr>
+                <w:rFonts w:eastAsia="Hiragino Sans GB"/>
                 <w:b w:val="0"/>
                 <w:sz w:val="21"/>
               </w:rPr>
@@ -1012,6 +1059,7 @@
             </w:pPr>
             <w:r>
               <w:rPr>
+                <w:rFonts w:eastAsia="Hiragino Sans GB"/>
                 <w:b w:val="0"/>
                 <w:sz w:val="21"/>
               </w:rPr>
@@ -1038,6 +1086,7 @@
             </w:pPr>
             <w:r>
               <w:rPr>
+                <w:rFonts w:eastAsia="Hiragino Sans GB"/>
                 <w:b w:val="0"/>
                 <w:sz w:val="21"/>
               </w:rPr>
@@ -1064,6 +1113,7 @@
             </w:pPr>
             <w:r>
               <w:rPr>
+                <w:rFonts w:eastAsia="Hiragino Sans GB"/>
                 <w:b w:val="0"/>
                 <w:sz w:val="21"/>
               </w:rPr>
@@ -1080,6 +1130,7 @@
       </w:pPr>
       <w:r>
         <w:rPr>
+          <w:rFonts w:eastAsia="Hiragino Sans GB"/>
           <w:sz w:val="4"/>
         </w:rPr>
       </w:r>
@@ -1089,6 +1140,9 @@
         <w:snapToGrid w:val="0"/>
       </w:pPr>
       <w:r>
+        <w:rPr>
+          <w:rFonts w:eastAsia="Hiragino Sans GB"/>
+        </w:rPr>
         <w:t>这样划分后，启动代码只负责建立 C 运行条件，自检由 C 程序完成，测试脚本负责观察及故障注入。GDB 属于调试工具，不是固件启动步骤。第一周代码仍保留为独立 demo.elf，便于后续回归。</w:t>
       </w:r>
     </w:p>
@@ -1097,6 +1151,9 @@
         <w:snapToGrid w:val="0"/>
       </w:pPr>
       <w:r>
+        <w:rPr>
+          <w:rFonts w:eastAsia="Hiragino Sans GB"/>
+        </w:rPr>
         <w:br w:type="page"/>
       </w:r>
     </w:p>
@@ -1106,6 +1163,9 @@
         <w:snapToGrid w:val="0"/>
       </w:pPr>
       <w:r>
+        <w:rPr>
+          <w:rFonts w:eastAsia="Hiragino Sans GB"/>
+        </w:rPr>
         <w:t>二 关键代码与实现思路</w:t>
       </w:r>
     </w:p>
@@ -1115,6 +1175,9 @@
         <w:snapToGrid w:val="0"/>
       </w:pPr>
       <w:r>
+        <w:rPr>
+          <w:rFonts w:eastAsia="Hiragino Sans GB"/>
+        </w:rPr>
         <w:t>数据初始化为什么放在 main 之前</w:t>
       </w:r>
     </w:p>
@@ -1123,18 +1186,24 @@
         <w:snapToGrid w:val="0"/>
       </w:pPr>
       <w:r>
+        <w:rPr>
+          <w:rFonts w:eastAsia="Hiragino Sans GB"/>
+        </w:rPr>
         <w:t xml:space="preserve">带初值的全局变量需要从装载位置复制到 RAM，零初始化变量需要清零。链接脚本输出 _sidata、_sdata、_edata 等符号，由启动汇编使用。下面摘录自 </w:t>
       </w:r>
       <w:hyperlink r:id="rId10">
         <w:r>
           <w:rPr>
-            <w:rFonts w:ascii="Calibri" w:eastAsia="Songti SC"/>
+            <w:rFonts w:ascii="Calibri" w:eastAsia="Hiragino Sans GB"/>
             <w:color w:val="1F4E79"/>
           </w:rPr>
           <w:t>src/startup.S</w:t>
         </w:r>
       </w:hyperlink>
       <w:r>
+        <w:rPr>
+          <w:rFonts w:eastAsia="Hiragino Sans GB"/>
+        </w:rPr>
         <w:t>，与当前源文件一致。</w:t>
       </w:r>
     </w:p>
@@ -1146,7 +1215,7 @@
       </w:pPr>
       <w:r>
         <w:rPr>
-          <w:rFonts w:ascii="Menlo" w:hAnsi="Menlo" w:eastAsia="Heiti SC"/>
+          <w:rFonts w:ascii="Menlo" w:hAnsi="Menlo" w:eastAsia="Hiragino Sans GB"/>
           <w:sz w:val="18"/>
         </w:rPr>
         <w:t xml:space="preserve">  ldr r0, =_sidata</w:t>
@@ -1160,7 +1229,7 @@
       </w:pPr>
       <w:r>
         <w:rPr>
-          <w:rFonts w:ascii="Menlo" w:hAnsi="Menlo" w:eastAsia="Heiti SC"/>
+          <w:rFonts w:ascii="Menlo" w:hAnsi="Menlo" w:eastAsia="Hiragino Sans GB"/>
           <w:sz w:val="18"/>
         </w:rPr>
         <w:t xml:space="preserve">  ldr r1, =_sdata</w:t>
@@ -1174,7 +1243,7 @@
       </w:pPr>
       <w:r>
         <w:rPr>
-          <w:rFonts w:ascii="Menlo" w:hAnsi="Menlo" w:eastAsia="Heiti SC"/>
+          <w:rFonts w:ascii="Menlo" w:hAnsi="Menlo" w:eastAsia="Hiragino Sans GB"/>
           <w:sz w:val="18"/>
         </w:rPr>
         <w:t xml:space="preserve">  ldr r2, =_edata</w:t>
@@ -1188,7 +1257,7 @@
       </w:pPr>
       <w:r>
         <w:rPr>
-          <w:rFonts w:ascii="Menlo" w:hAnsi="Menlo" w:eastAsia="Heiti SC"/>
+          <w:rFonts w:ascii="Menlo" w:hAnsi="Menlo" w:eastAsia="Hiragino Sans GB"/>
           <w:sz w:val="18"/>
         </w:rPr>
         <w:t>1:</w:t>
@@ -1202,7 +1271,7 @@
       </w:pPr>
       <w:r>
         <w:rPr>
-          <w:rFonts w:ascii="Menlo" w:hAnsi="Menlo" w:eastAsia="Heiti SC"/>
+          <w:rFonts w:ascii="Menlo" w:hAnsi="Menlo" w:eastAsia="Hiragino Sans GB"/>
           <w:sz w:val="18"/>
         </w:rPr>
         <w:t xml:space="preserve">  cmp r1, r2</w:t>
@@ -1216,7 +1285,7 @@
       </w:pPr>
       <w:r>
         <w:rPr>
-          <w:rFonts w:ascii="Menlo" w:hAnsi="Menlo" w:eastAsia="Heiti SC"/>
+          <w:rFonts w:ascii="Menlo" w:hAnsi="Menlo" w:eastAsia="Hiragino Sans GB"/>
           <w:sz w:val="18"/>
         </w:rPr>
         <w:t xml:space="preserve">  bcs 2f</w:t>
@@ -1230,7 +1299,7 @@
       </w:pPr>
       <w:r>
         <w:rPr>
-          <w:rFonts w:ascii="Menlo" w:hAnsi="Menlo" w:eastAsia="Heiti SC"/>
+          <w:rFonts w:ascii="Menlo" w:hAnsi="Menlo" w:eastAsia="Hiragino Sans GB"/>
           <w:sz w:val="18"/>
         </w:rPr>
         <w:t xml:space="preserve">  ldr r3, [r0], #4</w:t>
@@ -1244,7 +1313,7 @@
       </w:pPr>
       <w:r>
         <w:rPr>
-          <w:rFonts w:ascii="Menlo" w:hAnsi="Menlo" w:eastAsia="Heiti SC"/>
+          <w:rFonts w:ascii="Menlo" w:hAnsi="Menlo" w:eastAsia="Hiragino Sans GB"/>
           <w:sz w:val="18"/>
         </w:rPr>
         <w:t xml:space="preserve">  str r3, [r1], #4</w:t>
@@ -1258,7 +1327,7 @@
       </w:pPr>
       <w:r>
         <w:rPr>
-          <w:rFonts w:ascii="Menlo" w:hAnsi="Menlo" w:eastAsia="Heiti SC"/>
+          <w:rFonts w:ascii="Menlo" w:hAnsi="Menlo" w:eastAsia="Hiragino Sans GB"/>
           <w:sz w:val="18"/>
         </w:rPr>
         <w:t xml:space="preserve">  b 1b</w:t>
@@ -1269,6 +1338,9 @@
         <w:snapToGrid w:val="0"/>
       </w:pPr>
       <w:r>
+        <w:rPr>
+          <w:rFonts w:eastAsia="Hiragino Sans GB"/>
+        </w:rPr>
         <w:t>r0 指向 .data 初值，r1 指向 RAM 写入位置，r2 表示结束边界；每次复制 4 字节。当前链接脚本对段边界进行 4 字节对齐，与按字复制的实现相配合。</w:t>
       </w:r>
     </w:p>
@@ -1280,7 +1352,7 @@
       </w:pPr>
       <w:r>
         <w:rPr>
-          <w:rFonts w:ascii="Menlo" w:hAnsi="Menlo" w:eastAsia="Heiti SC"/>
+          <w:rFonts w:ascii="Menlo" w:hAnsi="Menlo" w:eastAsia="Hiragino Sans GB"/>
           <w:sz w:val="18"/>
         </w:rPr>
         <w:t>2:</w:t>
@@ -1294,7 +1366,7 @@
       </w:pPr>
       <w:r>
         <w:rPr>
-          <w:rFonts w:ascii="Menlo" w:hAnsi="Menlo" w:eastAsia="Heiti SC"/>
+          <w:rFonts w:ascii="Menlo" w:hAnsi="Menlo" w:eastAsia="Hiragino Sans GB"/>
           <w:sz w:val="18"/>
         </w:rPr>
         <w:t xml:space="preserve">  ldr r1, =_sbss</w:t>
@@ -1308,7 +1380,7 @@
       </w:pPr>
       <w:r>
         <w:rPr>
-          <w:rFonts w:ascii="Menlo" w:hAnsi="Menlo" w:eastAsia="Heiti SC"/>
+          <w:rFonts w:ascii="Menlo" w:hAnsi="Menlo" w:eastAsia="Hiragino Sans GB"/>
           <w:sz w:val="18"/>
         </w:rPr>
         <w:t xml:space="preserve">  ldr r2, =_ebss</w:t>
@@ -1322,7 +1394,7 @@
       </w:pPr>
       <w:r>
         <w:rPr>
-          <w:rFonts w:ascii="Menlo" w:hAnsi="Menlo" w:eastAsia="Heiti SC"/>
+          <w:rFonts w:ascii="Menlo" w:hAnsi="Menlo" w:eastAsia="Hiragino Sans GB"/>
           <w:sz w:val="18"/>
         </w:rPr>
         <w:t xml:space="preserve">  movs r3, #0</w:t>
@@ -1336,7 +1408,7 @@
       </w:pPr>
       <w:r>
         <w:rPr>
-          <w:rFonts w:ascii="Menlo" w:hAnsi="Menlo" w:eastAsia="Heiti SC"/>
+          <w:rFonts w:ascii="Menlo" w:hAnsi="Menlo" w:eastAsia="Hiragino Sans GB"/>
           <w:sz w:val="18"/>
         </w:rPr>
         <w:t>3:</w:t>
@@ -1350,7 +1422,7 @@
       </w:pPr>
       <w:r>
         <w:rPr>
-          <w:rFonts w:ascii="Menlo" w:hAnsi="Menlo" w:eastAsia="Heiti SC"/>
+          <w:rFonts w:ascii="Menlo" w:hAnsi="Menlo" w:eastAsia="Hiragino Sans GB"/>
           <w:sz w:val="18"/>
         </w:rPr>
         <w:t xml:space="preserve">  cmp r1, r2</w:t>
@@ -1364,7 +1436,7 @@
       </w:pPr>
       <w:r>
         <w:rPr>
-          <w:rFonts w:ascii="Menlo" w:hAnsi="Menlo" w:eastAsia="Heiti SC"/>
+          <w:rFonts w:ascii="Menlo" w:hAnsi="Menlo" w:eastAsia="Hiragino Sans GB"/>
           <w:sz w:val="18"/>
         </w:rPr>
         <w:t xml:space="preserve">  bcs 4f</w:t>
@@ -1378,7 +1450,7 @@
       </w:pPr>
       <w:r>
         <w:rPr>
-          <w:rFonts w:ascii="Menlo" w:hAnsi="Menlo" w:eastAsia="Heiti SC"/>
+          <w:rFonts w:ascii="Menlo" w:hAnsi="Menlo" w:eastAsia="Hiragino Sans GB"/>
           <w:sz w:val="18"/>
         </w:rPr>
         <w:t xml:space="preserve">  str r3, [r1], #4</w:t>
@@ -1392,7 +1464,7 @@
       </w:pPr>
       <w:r>
         <w:rPr>
-          <w:rFonts w:ascii="Menlo" w:hAnsi="Menlo" w:eastAsia="Heiti SC"/>
+          <w:rFonts w:ascii="Menlo" w:hAnsi="Menlo" w:eastAsia="Hiragino Sans GB"/>
           <w:sz w:val="18"/>
         </w:rPr>
         <w:t xml:space="preserve">  b 3b</w:t>
@@ -1406,7 +1478,7 @@
       </w:pPr>
       <w:r>
         <w:rPr>
-          <w:rFonts w:ascii="Menlo" w:hAnsi="Menlo" w:eastAsia="Heiti SC"/>
+          <w:rFonts w:ascii="Menlo" w:hAnsi="Menlo" w:eastAsia="Hiragino Sans GB"/>
           <w:sz w:val="18"/>
         </w:rPr>
         <w:t>4:</w:t>
@@ -1420,7 +1492,7 @@
       </w:pPr>
       <w:r>
         <w:rPr>
-          <w:rFonts w:ascii="Menlo" w:hAnsi="Menlo" w:eastAsia="Heiti SC"/>
+          <w:rFonts w:ascii="Menlo" w:hAnsi="Menlo" w:eastAsia="Hiragino Sans GB"/>
           <w:sz w:val="18"/>
         </w:rPr>
         <w:t xml:space="preserve">  bl main</w:t>
@@ -1431,6 +1503,9 @@
         <w:snapToGrid w:val="0"/>
       </w:pPr>
       <w:r>
+        <w:rPr>
+          <w:rFonts w:eastAsia="Hiragino Sans GB"/>
+        </w:rPr>
         <w:t>第二个循环清零 [_sbss, _ebss)，随后调用 main。若 main 返回，则进入默认处理循环。第一周向量表只提供基本入口，完整异常和外部中断支持留在后续阶段。</w:t>
       </w:r>
     </w:p>
@@ -1440,6 +1515,9 @@
         <w:snapToGrid w:val="0"/>
       </w:pPr>
       <w:r>
+        <w:rPr>
+          <w:rFonts w:eastAsia="Hiragino Sans GB"/>
+        </w:rPr>
         <w:t>在 C 入口检查启动结果</w:t>
       </w:r>
     </w:p>
@@ -1448,18 +1526,24 @@
         <w:snapToGrid w:val="0"/>
       </w:pPr>
       <w:r>
+        <w:rPr>
+          <w:rFonts w:eastAsia="Hiragino Sans GB"/>
+        </w:rPr>
         <w:t xml:space="preserve">以下摘录自 </w:t>
       </w:r>
       <w:hyperlink r:id="rId11">
         <w:r>
           <w:rPr>
-            <w:rFonts w:ascii="Calibri" w:eastAsia="Songti SC"/>
+            <w:rFonts w:ascii="Calibri" w:eastAsia="Hiragino Sans GB"/>
             <w:color w:val="1F4E79"/>
           </w:rPr>
           <w:t>src/main.c</w:t>
         </w:r>
       </w:hyperlink>
       <w:r>
+        <w:rPr>
+          <w:rFonts w:eastAsia="Hiragino Sans GB"/>
+        </w:rPr>
         <w:t>。CPUID 的 PartNo 用于检查内核，两个变量分别观察 .data 和 .bss 的初始化结果。</w:t>
       </w:r>
     </w:p>
@@ -1471,7 +1555,7 @@
       </w:pPr>
       <w:r>
         <w:rPr>
-          <w:rFonts w:ascii="Menlo" w:hAnsi="Menlo" w:eastAsia="Heiti SC"/>
+          <w:rFonts w:ascii="Menlo" w:hAnsi="Menlo" w:eastAsia="Hiragino Sans GB"/>
           <w:sz w:val="18"/>
         </w:rPr>
         <w:t xml:space="preserve">    const uint32_t cpuid = *(volatile uint32_t *)0xE000ED00;</w:t>
@@ -1485,7 +1569,7 @@
       </w:pPr>
       <w:r>
         <w:rPr>
-          <w:rFonts w:ascii="Menlo" w:hAnsi="Menlo" w:eastAsia="Heiti SC"/>
+          <w:rFonts w:ascii="Menlo" w:hAnsi="Menlo" w:eastAsia="Hiragino Sans GB"/>
           <w:sz w:val="18"/>
         </w:rPr>
         <w:t xml:space="preserve">    int ok = initialized_data == 0x12345678 &amp;&amp; zero_data == 0</w:t>
@@ -1499,7 +1583,7 @@
       </w:pPr>
       <w:r>
         <w:rPr>
-          <w:rFonts w:ascii="Menlo" w:hAnsi="Menlo" w:eastAsia="Heiti SC"/>
+          <w:rFonts w:ascii="Menlo" w:hAnsi="Menlo" w:eastAsia="Hiragino Sans GB"/>
           <w:sz w:val="18"/>
         </w:rPr>
         <w:t xml:space="preserve">        &amp;&amp; ((cpuid &gt;&gt; 4) &amp; 0xfff) == 0xc27;</w:t>
@@ -1513,7 +1597,7 @@
       </w:pPr>
       <w:r>
         <w:rPr>
-          <w:rFonts w:ascii="Menlo" w:hAnsi="Menlo" w:eastAsia="Heiti SC"/>
+          <w:rFonts w:ascii="Menlo" w:hAnsi="Menlo" w:eastAsia="Hiragino Sans GB"/>
           <w:sz w:val="18"/>
         </w:rPr>
         <w:t xml:space="preserve">    demo_result = ok ? 0x600d : 0xdead;</w:t>
@@ -1527,7 +1611,7 @@
       </w:pPr>
       <w:r>
         <w:rPr>
-          <w:rFonts w:ascii="Menlo" w:hAnsi="Menlo" w:eastAsia="Heiti SC"/>
+          <w:rFonts w:ascii="Menlo" w:hAnsi="Menlo" w:eastAsia="Hiragino Sans GB"/>
           <w:sz w:val="18"/>
         </w:rPr>
         <w:t xml:space="preserve">    semihost(4, ok ? "PASS: Cortex-M7; .data initialized; .bss zero; bare-metal C99\n"</w:t>
@@ -1541,7 +1625,7 @@
       </w:pPr>
       <w:r>
         <w:rPr>
-          <w:rFonts w:ascii="Menlo" w:hAnsi="Menlo" w:eastAsia="Heiti SC"/>
+          <w:rFonts w:ascii="Menlo" w:hAnsi="Menlo" w:eastAsia="Hiragino Sans GB"/>
           <w:sz w:val="18"/>
         </w:rPr>
         <w:t xml:space="preserve">                   : "FAIL: Cortex-M7 or C runtime validation\n");</w:t>
@@ -1552,6 +1636,9 @@
         <w:snapToGrid w:val="0"/>
       </w:pPr>
       <w:r>
+        <w:rPr>
+          <w:rFonts w:eastAsia="Hiragino Sans GB"/>
+        </w:rPr>
         <w:t>demo_result 提供 GDB 可观察的结果标记。该检查用于当前启动示例；semihosting 输出依赖宿主机调试服务，UART 驱动的验证见后续进度。</w:t>
       </w:r>
     </w:p>
@@ -1560,6 +1647,9 @@
         <w:snapToGrid w:val="0"/>
       </w:pPr>
       <w:r>
+        <w:rPr>
+          <w:rFonts w:eastAsia="Hiragino Sans GB"/>
+        </w:rPr>
         <w:br w:type="page"/>
       </w:r>
     </w:p>
@@ -1569,6 +1659,9 @@
         <w:snapToGrid w:val="0"/>
       </w:pPr>
       <w:r>
+        <w:rPr>
+          <w:rFonts w:eastAsia="Hiragino Sans GB"/>
+        </w:rPr>
         <w:t>三 测试方法与实际结果</w:t>
       </w:r>
     </w:p>
@@ -1578,6 +1671,9 @@
         <w:snapToGrid w:val="0"/>
       </w:pPr>
       <w:r>
+        <w:rPr>
+          <w:rFonts w:eastAsia="Hiragino Sans GB"/>
+        </w:rPr>
         <w:t>先设置错误初值再验证恢复</w:t>
       </w:r>
     </w:p>
@@ -1586,6 +1682,9 @@
         <w:snapToGrid w:val="0"/>
       </w:pPr>
       <w:r>
+        <w:rPr>
+          <w:rFonts w:eastAsia="Hiragino Sans GB"/>
+        </w:rPr>
         <w:t>只观察 .bss 为零可能产生假阳性，因为模拟 RAM 初值可能恰好为零。因此测试先停在 Reset_Handler，污染 .data 和 .bss，再运行到 main 的第一条指令检查恢复结果；同时在 .bss 末尾后放置 4 字节哨兵，观察该位置是否被误写。</w:t>
       </w:r>
     </w:p>
@@ -1594,6 +1693,9 @@
         <w:snapToGrid w:val="0"/>
       </w:pPr>
       <w:r>
+        <w:rPr>
+          <w:rFonts w:eastAsia="Hiragino Sans GB"/>
+        </w:rPr>
         <w:t>测试于 10 月 13 日执行，在独立构建目录生成并运行同一 ELF。汇总包含 6 项检查，其中工具和构建各 1 项，固件运行场景 4 项。</w:t>
       </w:r>
     </w:p>
@@ -1642,6 +1744,7 @@
             </w:pPr>
             <w:r>
               <w:rPr>
+                <w:rFonts w:eastAsia="Hiragino Sans GB"/>
                 <w:b/>
                 <w:sz w:val="21"/>
               </w:rPr>
@@ -1669,6 +1772,7 @@
             </w:pPr>
             <w:r>
               <w:rPr>
+                <w:rFonts w:eastAsia="Hiragino Sans GB"/>
                 <w:b/>
                 <w:sz w:val="21"/>
               </w:rPr>
@@ -1696,6 +1800,7 @@
             </w:pPr>
             <w:r>
               <w:rPr>
+                <w:rFonts w:eastAsia="Hiragino Sans GB"/>
                 <w:b/>
                 <w:sz w:val="21"/>
               </w:rPr>
@@ -1727,6 +1832,7 @@
             </w:pPr>
             <w:r>
               <w:rPr>
+                <w:rFonts w:eastAsia="Hiragino Sans GB"/>
                 <w:b w:val="0"/>
                 <w:sz w:val="21"/>
               </w:rPr>
@@ -1753,6 +1859,7 @@
             </w:pPr>
             <w:r>
               <w:rPr>
+                <w:rFonts w:eastAsia="Hiragino Sans GB"/>
                 <w:b w:val="0"/>
                 <w:sz w:val="21"/>
               </w:rPr>
@@ -1779,6 +1886,7 @@
             </w:pPr>
             <w:r>
               <w:rPr>
+                <w:rFonts w:eastAsia="Hiragino Sans GB"/>
                 <w:b w:val="0"/>
                 <w:sz w:val="21"/>
               </w:rPr>
@@ -1810,6 +1918,7 @@
             </w:pPr>
             <w:r>
               <w:rPr>
+                <w:rFonts w:eastAsia="Hiragino Sans GB"/>
                 <w:b w:val="0"/>
                 <w:sz w:val="21"/>
               </w:rPr>
@@ -1836,6 +1945,7 @@
             </w:pPr>
             <w:r>
               <w:rPr>
+                <w:rFonts w:eastAsia="Hiragino Sans GB"/>
                 <w:b w:val="0"/>
                 <w:sz w:val="21"/>
               </w:rPr>
@@ -1862,6 +1972,7 @@
             </w:pPr>
             <w:r>
               <w:rPr>
+                <w:rFonts w:eastAsia="Hiragino Sans GB"/>
                 <w:b w:val="0"/>
                 <w:sz w:val="21"/>
               </w:rPr>
@@ -1893,6 +2004,7 @@
             </w:pPr>
             <w:r>
               <w:rPr>
+                <w:rFonts w:eastAsia="Hiragino Sans GB"/>
                 <w:b w:val="0"/>
                 <w:sz w:val="21"/>
               </w:rPr>
@@ -1919,6 +2031,7 @@
             </w:pPr>
             <w:r>
               <w:rPr>
+                <w:rFonts w:eastAsia="Hiragino Sans GB"/>
                 <w:b w:val="0"/>
                 <w:sz w:val="21"/>
               </w:rPr>
@@ -1945,6 +2058,7 @@
             </w:pPr>
             <w:r>
               <w:rPr>
+                <w:rFonts w:eastAsia="Hiragino Sans GB"/>
                 <w:b w:val="0"/>
                 <w:sz w:val="21"/>
               </w:rPr>
@@ -1976,6 +2090,7 @@
             </w:pPr>
             <w:r>
               <w:rPr>
+                <w:rFonts w:eastAsia="Hiragino Sans GB"/>
                 <w:b w:val="0"/>
                 <w:sz w:val="21"/>
               </w:rPr>
@@ -2002,6 +2117,7 @@
             </w:pPr>
             <w:r>
               <w:rPr>
+                <w:rFonts w:eastAsia="Hiragino Sans GB"/>
                 <w:b w:val="0"/>
                 <w:sz w:val="21"/>
               </w:rPr>
@@ -2028,6 +2144,7 @@
             </w:pPr>
             <w:r>
               <w:rPr>
+                <w:rFonts w:eastAsia="Hiragino Sans GB"/>
                 <w:b w:val="0"/>
                 <w:sz w:val="21"/>
               </w:rPr>
@@ -2059,6 +2176,7 @@
             </w:pPr>
             <w:r>
               <w:rPr>
+                <w:rFonts w:eastAsia="Hiragino Sans GB"/>
                 <w:b w:val="0"/>
                 <w:sz w:val="21"/>
               </w:rPr>
@@ -2085,6 +2203,7 @@
             </w:pPr>
             <w:r>
               <w:rPr>
+                <w:rFonts w:eastAsia="Hiragino Sans GB"/>
                 <w:b w:val="0"/>
                 <w:sz w:val="21"/>
               </w:rPr>
@@ -2111,6 +2230,7 @@
             </w:pPr>
             <w:r>
               <w:rPr>
+                <w:rFonts w:eastAsia="Hiragino Sans GB"/>
                 <w:b w:val="0"/>
                 <w:sz w:val="21"/>
               </w:rPr>
@@ -2142,6 +2262,7 @@
             </w:pPr>
             <w:r>
               <w:rPr>
+                <w:rFonts w:eastAsia="Hiragino Sans GB"/>
                 <w:b w:val="0"/>
                 <w:sz w:val="21"/>
               </w:rPr>
@@ -2168,6 +2289,7 @@
             </w:pPr>
             <w:r>
               <w:rPr>
+                <w:rFonts w:eastAsia="Hiragino Sans GB"/>
                 <w:b w:val="0"/>
                 <w:sz w:val="21"/>
               </w:rPr>
@@ -2194,6 +2316,7 @@
             </w:pPr>
             <w:r>
               <w:rPr>
+                <w:rFonts w:eastAsia="Hiragino Sans GB"/>
                 <w:b w:val="0"/>
                 <w:sz w:val="21"/>
               </w:rPr>
@@ -2210,6 +2333,7 @@
       </w:pPr>
       <w:r>
         <w:rPr>
+          <w:rFonts w:eastAsia="Hiragino Sans GB"/>
           <w:sz w:val="4"/>
         </w:rPr>
       </w:r>
@@ -2220,6 +2344,9 @@
         <w:snapToGrid w:val="0"/>
       </w:pPr>
       <w:r>
+        <w:rPr>
+          <w:rFonts w:eastAsia="Hiragino Sans GB"/>
+        </w:rPr>
         <w:t>关键调试证据</w:t>
       </w:r>
     </w:p>
@@ -2228,18 +2355,24 @@
         <w:snapToGrid w:val="0"/>
       </w:pPr>
       <w:r>
+        <w:rPr>
+          <w:rFonts w:eastAsia="Hiragino Sans GB"/>
+        </w:rPr>
         <w:t xml:space="preserve">以下为 </w:t>
       </w:r>
       <w:hyperlink r:id="rId12">
         <w:r>
           <w:rPr>
-            <w:rFonts w:ascii="Calibri" w:eastAsia="Songti SC"/>
+            <w:rFonts w:ascii="Calibri" w:eastAsia="Hiragino Sans GB"/>
             <w:color w:val="1F4E79"/>
           </w:rPr>
           <w:t>初始化污染 GDB 日志</w:t>
         </w:r>
       </w:hyperlink>
       <w:r>
+        <w:rPr>
+          <w:rFonts w:eastAsia="Hiragino Sans GB"/>
+        </w:rPr>
         <w:t xml:space="preserve"> 的节选。</w:t>
       </w:r>
     </w:p>
@@ -2251,7 +2384,7 @@
       </w:pPr>
       <w:r>
         <w:rPr>
-          <w:rFonts w:ascii="Menlo" w:hAnsi="Menlo" w:eastAsia="Heiti SC"/>
+          <w:rFonts w:ascii="Menlo" w:hAnsi="Menlo" w:eastAsia="Hiragino Sans GB"/>
           <w:sz w:val="18"/>
         </w:rPr>
         <w:t>RESET_MSP=0x20400000 RESET_PC=0xc4 RESET_VECTOR=0xc5</w:t>
@@ -2265,7 +2398,7 @@
       </w:pPr>
       <w:r>
         <w:rPr>
-          <w:rFonts w:ascii="Menlo" w:hAnsi="Menlo" w:eastAsia="Heiti SC"/>
+          <w:rFonts w:ascii="Menlo" w:hAnsi="Menlo" w:eastAsia="Hiragino Sans GB"/>
           <w:sz w:val="18"/>
         </w:rPr>
         <w:t>INJECTED_DATA=cccccccc</w:t>
@@ -2279,7 +2412,7 @@
       </w:pPr>
       <w:r>
         <w:rPr>
-          <w:rFonts w:ascii="Menlo" w:hAnsi="Menlo" w:eastAsia="Heiti SC"/>
+          <w:rFonts w:ascii="Menlo" w:hAnsi="Menlo" w:eastAsia="Hiragino Sans GB"/>
           <w:sz w:val="18"/>
         </w:rPr>
         <w:t>INJECTED_BSS=a5a5a5a5a5a5a5a5</w:t>
@@ -2293,7 +2426,7 @@
       </w:pPr>
       <w:r>
         <w:rPr>
-          <w:rFonts w:ascii="Menlo" w:hAnsi="Menlo" w:eastAsia="Heiti SC"/>
+          <w:rFonts w:ascii="Menlo" w:hAnsi="Menlo" w:eastAsia="Hiragino Sans GB"/>
           <w:sz w:val="18"/>
         </w:rPr>
         <w:t>RESTORED_DATA=78563412</w:t>
@@ -2307,7 +2440,7 @@
       </w:pPr>
       <w:r>
         <w:rPr>
-          <w:rFonts w:ascii="Menlo" w:hAnsi="Menlo" w:eastAsia="Heiti SC"/>
+          <w:rFonts w:ascii="Menlo" w:hAnsi="Menlo" w:eastAsia="Hiragino Sans GB"/>
           <w:sz w:val="18"/>
         </w:rPr>
         <w:t>CLEARED_BSS=0000000000000000</w:t>
@@ -2321,7 +2454,7 @@
       </w:pPr>
       <w:r>
         <w:rPr>
-          <w:rFonts w:ascii="Menlo" w:hAnsi="Menlo" w:eastAsia="Heiti SC"/>
+          <w:rFonts w:ascii="Menlo" w:hAnsi="Menlo" w:eastAsia="Hiragino Sans GB"/>
           <w:sz w:val="18"/>
         </w:rPr>
         <w:t>UPPER_SENTINEL=0x12345678</w:t>
@@ -2335,7 +2468,7 @@
       </w:pPr>
       <w:r>
         <w:rPr>
-          <w:rFonts w:ascii="Menlo" w:hAnsi="Menlo" w:eastAsia="Heiti SC"/>
+          <w:rFonts w:ascii="Menlo" w:hAnsi="Menlo" w:eastAsia="Hiragino Sans GB"/>
           <w:sz w:val="18"/>
         </w:rPr>
         <w:t>STEP_PC=0x46</w:t>
@@ -2349,7 +2482,7 @@
       </w:pPr>
       <w:r>
         <w:rPr>
-          <w:rFonts w:ascii="Menlo" w:hAnsi="Menlo" w:eastAsia="Heiti SC"/>
+          <w:rFonts w:ascii="Menlo" w:hAnsi="Menlo" w:eastAsia="Hiragino Sans GB"/>
           <w:sz w:val="18"/>
         </w:rPr>
         <w:t>CHECK_PASS:poisoned-startup</w:t>
@@ -2360,6 +2493,9 @@
         <w:snapToGrid w:val="0"/>
       </w:pPr>
       <w:r>
+        <w:rPr>
+          <w:rFonts w:eastAsia="Hiragino Sans GB"/>
+        </w:rPr>
         <w:t>恢复后的字节 78 56 34 12 对应小端整数 0x12345678。复位向量值 0xc5 的最低位表示 Thumb 状态，实际指令地址为 0xc4。负向用例的退出码 1 是预期结果；最终测试脚本退出码为 0。</w:t>
       </w:r>
     </w:p>
@@ -2368,6 +2504,9 @@
         <w:snapToGrid w:val="0"/>
       </w:pPr>
       <w:r>
+        <w:rPr>
+          <w:rFonts w:eastAsia="Hiragino Sans GB"/>
+        </w:rPr>
         <w:t>结论：当前布局中的数据复制、清零和错误识别符合预期。覆盖范围为 4 字节 .data、8 字节 .bss 和一处末尾哨兵；尚未覆盖任意段长度、空段和完整越界检测。</w:t>
       </w:r>
     </w:p>
@@ -2376,6 +2515,9 @@
         <w:snapToGrid w:val="0"/>
       </w:pPr>
       <w:r>
+        <w:rPr>
+          <w:rFonts w:eastAsia="Hiragino Sans GB"/>
+        </w:rPr>
         <w:br w:type="page"/>
       </w:r>
     </w:p>
@@ -2385,6 +2527,9 @@
         <w:snapToGrid w:val="0"/>
       </w:pPr>
       <w:r>
+        <w:rPr>
+          <w:rFonts w:eastAsia="Hiragino Sans GB"/>
+        </w:rPr>
         <w:t>四 工业需求调研与下一阶段设计</w:t>
       </w:r>
     </w:p>
@@ -2394,6 +2539,9 @@
         <w:snapToGrid w:val="0"/>
       </w:pPr>
       <w:r>
+        <w:rPr>
+          <w:rFonts w:eastAsia="Hiragino Sans GB"/>
+        </w:rPr>
         <w:t>将需求落实到模块与验收条件</w:t>
       </w:r>
     </w:p>
@@ -2402,6 +2550,9 @@
         <w:snapToGrid w:val="0"/>
       </w:pPr>
       <w:r>
+        <w:rPr>
+          <w:rFonts w:eastAsia="Hiragino Sans GB"/>
+        </w:rPr>
         <w:t>已整理的 S7 资料帮助区分更新文件验证、启动前固件验证及 PLC 用户程序启动阶段。具体型号仍需确认；本项目使用 QEMU MPS2 Cortex-M7 平台，以下模块是后续设计草案，不代表已还原 S7 内部实现。</w:t>
       </w:r>
     </w:p>
@@ -2450,6 +2601,7 @@
             </w:pPr>
             <w:r>
               <w:rPr>
+                <w:rFonts w:eastAsia="Hiragino Sans GB"/>
                 <w:b/>
                 <w:sz w:val="21"/>
               </w:rPr>
@@ -2477,6 +2629,7 @@
             </w:pPr>
             <w:r>
               <w:rPr>
+                <w:rFonts w:eastAsia="Hiragino Sans GB"/>
                 <w:b/>
                 <w:sz w:val="21"/>
               </w:rPr>
@@ -2504,6 +2657,7 @@
             </w:pPr>
             <w:r>
               <w:rPr>
+                <w:rFonts w:eastAsia="Hiragino Sans GB"/>
                 <w:b/>
                 <w:sz w:val="21"/>
               </w:rPr>
@@ -2535,6 +2689,7 @@
             </w:pPr>
             <w:r>
               <w:rPr>
+                <w:rFonts w:eastAsia="Hiragino Sans GB"/>
                 <w:b w:val="0"/>
                 <w:sz w:val="21"/>
               </w:rPr>
@@ -2561,6 +2716,7 @@
             </w:pPr>
             <w:r>
               <w:rPr>
+                <w:rFonts w:eastAsia="Hiragino Sans GB"/>
                 <w:b w:val="0"/>
                 <w:sz w:val="21"/>
               </w:rPr>
@@ -2587,6 +2743,7 @@
             </w:pPr>
             <w:r>
               <w:rPr>
+                <w:rFonts w:eastAsia="Hiragino Sans GB"/>
                 <w:b w:val="0"/>
                 <w:sz w:val="21"/>
               </w:rPr>
@@ -2618,6 +2775,7 @@
             </w:pPr>
             <w:r>
               <w:rPr>
+                <w:rFonts w:eastAsia="Hiragino Sans GB"/>
                 <w:b w:val="0"/>
                 <w:sz w:val="21"/>
               </w:rPr>
@@ -2644,6 +2802,7 @@
             </w:pPr>
             <w:r>
               <w:rPr>
+                <w:rFonts w:eastAsia="Hiragino Sans GB"/>
                 <w:b w:val="0"/>
                 <w:sz w:val="21"/>
               </w:rPr>
@@ -2670,6 +2829,7 @@
             </w:pPr>
             <w:r>
               <w:rPr>
+                <w:rFonts w:eastAsia="Hiragino Sans GB"/>
                 <w:b w:val="0"/>
                 <w:sz w:val="21"/>
               </w:rPr>
@@ -2701,6 +2861,7 @@
             </w:pPr>
             <w:r>
               <w:rPr>
+                <w:rFonts w:eastAsia="Hiragino Sans GB"/>
                 <w:b w:val="0"/>
                 <w:sz w:val="21"/>
               </w:rPr>
@@ -2727,6 +2888,7 @@
             </w:pPr>
             <w:r>
               <w:rPr>
+                <w:rFonts w:eastAsia="Hiragino Sans GB"/>
                 <w:b w:val="0"/>
                 <w:sz w:val="21"/>
               </w:rPr>
@@ -2753,6 +2915,7 @@
             </w:pPr>
             <w:r>
               <w:rPr>
+                <w:rFonts w:eastAsia="Hiragino Sans GB"/>
                 <w:b w:val="0"/>
                 <w:sz w:val="21"/>
               </w:rPr>
@@ -2784,6 +2947,7 @@
             </w:pPr>
             <w:r>
               <w:rPr>
+                <w:rFonts w:eastAsia="Hiragino Sans GB"/>
                 <w:b w:val="0"/>
                 <w:sz w:val="21"/>
               </w:rPr>
@@ -2810,6 +2974,7 @@
             </w:pPr>
             <w:r>
               <w:rPr>
+                <w:rFonts w:eastAsia="Hiragino Sans GB"/>
                 <w:b w:val="0"/>
                 <w:sz w:val="21"/>
               </w:rPr>
@@ -2836,6 +3001,7 @@
             </w:pPr>
             <w:r>
               <w:rPr>
+                <w:rFonts w:eastAsia="Hiragino Sans GB"/>
                 <w:b w:val="0"/>
                 <w:sz w:val="21"/>
               </w:rPr>
@@ -2852,6 +3018,7 @@
       </w:pPr>
       <w:r>
         <w:rPr>
+          <w:rFonts w:eastAsia="Hiragino Sans GB"/>
           <w:sz w:val="4"/>
         </w:rPr>
       </w:r>
@@ -2861,6 +3028,9 @@
         <w:snapToGrid w:val="0"/>
       </w:pPr>
       <w:r>
+        <w:rPr>
+          <w:rFonts w:eastAsia="Hiragino Sans GB"/>
+        </w:rPr>
         <w:t>候选设计是先保留已确认镜像，将更新写入候选区，验证通过后试运行，再由应用确认成功。这样可以把“接收完成”“验证通过”和“实际运行成功”作为不同阶段处理。持久化元数据的格式和切换时机需要先确定，随后才能进行有意义的断电恢复实验。</w:t>
       </w:r>
     </w:p>
@@ -2870,6 +3040,9 @@
         <w:snapToGrid w:val="0"/>
       </w:pPr>
       <w:r>
+        <w:rPr>
+          <w:rFonts w:eastAsia="Hiragino Sans GB"/>
+        </w:rPr>
         <w:t>当前问题与改进计划</w:t>
       </w:r>
     </w:p>
@@ -2878,6 +3051,9 @@
         <w:snapToGrid w:val="0"/>
       </w:pPr>
       <w:r>
+        <w:rPr>
+          <w:rFonts w:eastAsia="Hiragino Sans GB"/>
+        </w:rPr>
         <w:t>第一周将“能构建、运行、调试同一份固件”作为环境验收条件。进一步学习需要结合源码和 GDB，说明每一步的输入、输出和失败表现。开发中使用工具辅助生成和整理的部分，也需要逐项阅读和复现。</w:t>
       </w:r>
     </w:p>
@@ -2925,6 +3101,7 @@
             </w:pPr>
             <w:r>
               <w:rPr>
+                <w:rFonts w:eastAsia="Hiragino Sans GB"/>
                 <w:b/>
                 <w:sz w:val="21"/>
               </w:rPr>
@@ -2952,6 +3129,7 @@
             </w:pPr>
             <w:r>
               <w:rPr>
+                <w:rFonts w:eastAsia="Hiragino Sans GB"/>
                 <w:b/>
                 <w:sz w:val="21"/>
               </w:rPr>
@@ -2983,6 +3161,7 @@
             </w:pPr>
             <w:r>
               <w:rPr>
+                <w:rFonts w:eastAsia="Hiragino Sans GB"/>
                 <w:b w:val="0"/>
                 <w:sz w:val="21"/>
               </w:rPr>
@@ -3009,6 +3188,7 @@
             </w:pPr>
             <w:r>
               <w:rPr>
+                <w:rFonts w:eastAsia="Hiragino Sans GB"/>
                 <w:b w:val="0"/>
                 <w:sz w:val="21"/>
               </w:rPr>
@@ -3040,6 +3220,7 @@
             </w:pPr>
             <w:r>
               <w:rPr>
+                <w:rFonts w:eastAsia="Hiragino Sans GB"/>
                 <w:b w:val="0"/>
                 <w:sz w:val="21"/>
               </w:rPr>
@@ -3066,6 +3247,7 @@
             </w:pPr>
             <w:r>
               <w:rPr>
+                <w:rFonts w:eastAsia="Hiragino Sans GB"/>
                 <w:b w:val="0"/>
                 <w:sz w:val="21"/>
               </w:rPr>
@@ -3097,6 +3279,7 @@
             </w:pPr>
             <w:r>
               <w:rPr>
+                <w:rFonts w:eastAsia="Hiragino Sans GB"/>
                 <w:b w:val="0"/>
                 <w:sz w:val="21"/>
               </w:rPr>
@@ -3123,6 +3306,7 @@
             </w:pPr>
             <w:r>
               <w:rPr>
+                <w:rFonts w:eastAsia="Hiragino Sans GB"/>
                 <w:b w:val="0"/>
                 <w:sz w:val="21"/>
               </w:rPr>
@@ -3139,6 +3323,7 @@
       </w:pPr>
       <w:r>
         <w:rPr>
+          <w:rFonts w:eastAsia="Hiragino Sans GB"/>
           <w:sz w:val="4"/>
         </w:rPr>
       </w:r>
@@ -3148,6 +3333,9 @@
         <w:snapToGrid w:val="0"/>
       </w:pPr>
       <w:r>
+        <w:rPr>
+          <w:rFonts w:eastAsia="Hiragino Sans GB"/>
+        </w:rPr>
         <w:t>需请带教确认参考的 S7 CPU 型号，以及项目侧重功能演示还是需要对应安全标准条款。当前尚未实现持久化 Flash、独立应用跳转、签名验证与升级回滚；这些工作将按后续阶段安排。</w:t>
       </w:r>
     </w:p>
@@ -3157,6 +3345,9 @@
         <w:snapToGrid w:val="0"/>
       </w:pPr>
       <w:r>
+        <w:rPr>
+          <w:rFonts w:eastAsia="Hiragino Sans GB"/>
+        </w:rPr>
         <w:t>交付入口</w:t>
       </w:r>
     </w:p>
@@ -3165,54 +3356,69 @@
         <w:snapToGrid w:val="0"/>
       </w:pPr>
       <w:r>
+        <w:rPr>
+          <w:rFonts w:eastAsia="Hiragino Sans GB"/>
+        </w:rPr>
         <w:t xml:space="preserve">工程位于 Siemens_Intern/codes。第一周 </w:t>
       </w:r>
       <w:hyperlink r:id="rId13">
         <w:r>
           <w:rPr>
-            <w:rFonts w:ascii="Calibri" w:eastAsia="Songti SC"/>
+            <w:rFonts w:ascii="Calibri" w:eastAsia="Hiragino Sans GB"/>
             <w:color w:val="1F4E79"/>
           </w:rPr>
           <w:t>环境报告</w:t>
         </w:r>
       </w:hyperlink>
       <w:r>
+        <w:rPr>
+          <w:rFonts w:eastAsia="Hiragino Sans GB"/>
+        </w:rPr>
         <w:t>、</w:t>
       </w:r>
       <w:hyperlink r:id="rId14">
         <w:r>
           <w:rPr>
-            <w:rFonts w:ascii="Calibri" w:eastAsia="Songti SC"/>
+            <w:rFonts w:ascii="Calibri" w:eastAsia="Hiragino Sans GB"/>
             <w:color w:val="1F4E79"/>
           </w:rPr>
           <w:t>增强验证报告</w:t>
         </w:r>
       </w:hyperlink>
       <w:r>
+        <w:rPr>
+          <w:rFonts w:eastAsia="Hiragino Sans GB"/>
+        </w:rPr>
         <w:t>、</w:t>
       </w:r>
       <w:hyperlink r:id="rId15">
         <w:r>
           <w:rPr>
-            <w:rFonts w:ascii="Calibri" w:eastAsia="Songti SC"/>
+            <w:rFonts w:ascii="Calibri" w:eastAsia="Hiragino Sans GB"/>
             <w:color w:val="1F4E79"/>
           </w:rPr>
           <w:t>学习笔记</w:t>
         </w:r>
       </w:hyperlink>
       <w:r>
+        <w:rPr>
+          <w:rFonts w:eastAsia="Hiragino Sans GB"/>
+        </w:rPr>
         <w:t xml:space="preserve"> 和 </w:t>
       </w:r>
       <w:hyperlink r:id="rId16">
         <w:r>
           <w:rPr>
-            <w:rFonts w:ascii="Calibri" w:eastAsia="Songti SC"/>
+            <w:rFonts w:ascii="Calibri" w:eastAsia="Hiragino Sans GB"/>
             <w:color w:val="1F4E79"/>
           </w:rPr>
           <w:t>测试摘要</w:t>
         </w:r>
       </w:hyperlink>
       <w:r>
+        <w:rPr>
+          <w:rFonts w:eastAsia="Hiragino Sans GB"/>
+        </w:rPr>
         <w:t xml:space="preserve"> 均已整理。测试日志中的旧绝对路径是当时运行记录，当前入口以项目目录为准。</w:t>
       </w:r>
     </w:p>
@@ -3221,6 +3427,9 @@
         <w:snapToGrid w:val="0"/>
       </w:pPr>
       <w:r>
+        <w:rPr>
+          <w:rFonts w:eastAsia="Hiragino Sans GB"/>
+        </w:rPr>
         <w:t>复现方式：进入 codes 目录，执行 source scripts/env.sh，然后运行 python3 scripts/verify-startup.py；第二周验收使用 python3 scripts/verify-week2.py。每次生成新的证据目录。</w:t>
       </w:r>
     </w:p>
@@ -3229,6 +3438,9 @@
         <w:snapToGrid w:val="0"/>
       </w:pPr>
       <w:r>
+        <w:rPr>
+          <w:rFonts w:eastAsia="Hiragino Sans GB"/>
+        </w:rPr>
         <w:br w:type="page"/>
       </w:r>
     </w:p>
@@ -3238,6 +3450,9 @@
         <w:snapToGrid w:val="0"/>
       </w:pPr>
       <w:r>
+        <w:rPr>
+          <w:rFonts w:eastAsia="Hiragino Sans GB"/>
+        </w:rPr>
         <w:t>五 截至本次更新的 UART 后续进度</w:t>
       </w:r>
     </w:p>
@@ -3246,18 +3461,24 @@
         <w:snapToGrid w:val="0"/>
       </w:pPr>
       <w:r>
+        <w:rPr>
+          <w:rFonts w:eastAsia="Hiragino Sans GB"/>
+        </w:rPr>
         <w:t>本节单独记录 10 月 14 日完成的第二周阶段工作。新增 bootloader.elf，保留第一周 Demo；第二周代码提交为 8cbafe1。已完成 Git 提交和 GitHub 推送：</w:t>
       </w:r>
       <w:hyperlink r:id="rId17">
         <w:r>
           <w:rPr>
-            <w:rFonts w:ascii="Calibri" w:eastAsia="Songti SC"/>
+            <w:rFonts w:ascii="Calibri" w:eastAsia="Hiragino Sans GB"/>
             <w:color w:val="1F4E79"/>
           </w:rPr>
           <w:t>远程仓库</w:t>
         </w:r>
       </w:hyperlink>
       <w:r>
+        <w:rPr>
+          <w:rFonts w:eastAsia="Hiragino Sans GB"/>
+        </w:rPr>
         <w:t xml:space="preserve"> 的 main 分支与本地已提交版本一致，提交号为 9f8969f。第一周基线 8bb81c4、第二周代码 8cbafe1 的提交历史均已保留。仓库统一管理代码、周报、规划及笔记。</w:t>
       </w:r>
     </w:p>
@@ -3267,6 +3488,9 @@
         <w:snapToGrid w:val="0"/>
       </w:pPr>
       <w:r>
+        <w:rPr>
+          <w:rFonts w:eastAsia="Hiragino Sans GB"/>
+        </w:rPr>
         <w:t>模块关系与发送实现</w:t>
       </w:r>
     </w:p>
@@ -3278,7 +3502,7 @@
       </w:pPr>
       <w:r>
         <w:rPr>
-          <w:rFonts w:ascii="Menlo" w:hAnsi="Menlo" w:eastAsia="Heiti SC"/>
+          <w:rFonts w:ascii="Menlo" w:hAnsi="Menlo" w:eastAsia="Hiragino Sans GB"/>
           <w:sz w:val="18"/>
         </w:rPr>
         <w:t>src/week2/startup.S → main.c → board.c（板级初始化与时钟）</w:t>
@@ -3292,7 +3516,7 @@
       </w:pPr>
       <w:r>
         <w:rPr>
-          <w:rFonts w:ascii="Menlo" w:hAnsi="Menlo" w:eastAsia="Heiti SC"/>
+          <w:rFonts w:ascii="Menlo" w:hAnsi="Menlo" w:eastAsia="Hiragino Sans GB"/>
           <w:sz w:val="18"/>
         </w:rPr>
         <w:t xml:space="preserve">                            → uart.c（配置与轮询发送）</w:t>
@@ -3306,7 +3530,7 @@
       </w:pPr>
       <w:r>
         <w:rPr>
-          <w:rFonts w:ascii="Menlo" w:hAnsi="Menlo" w:eastAsia="Heiti SC"/>
+          <w:rFonts w:ascii="Menlo" w:hAnsi="Menlo" w:eastAsia="Hiragino Sans GB"/>
           <w:sz w:val="18"/>
         </w:rPr>
         <w:t xml:space="preserve">                            → boot_idle（主流程等待）</w:t>
@@ -3320,7 +3544,7 @@
       </w:pPr>
       <w:r>
         <w:rPr>
-          <w:rFonts w:ascii="Menlo" w:hAnsi="Menlo" w:eastAsia="Heiti SC"/>
+          <w:rFonts w:ascii="Menlo" w:hAnsi="Menlo" w:eastAsia="Hiragino Sans GB"/>
           <w:sz w:val="18"/>
         </w:rPr>
         <w:t>异常入口 → exception_handler → fault_idle（异常等待）</w:t>
@@ -3331,18 +3555,24 @@
         <w:snapToGrid w:val="0"/>
       </w:pPr>
       <w:r>
+        <w:rPr>
+          <w:rFonts w:eastAsia="Hiragino Sans GB"/>
+        </w:rPr>
         <w:t xml:space="preserve">UART 驱动独立处理寄存器访问和返回值，主流程组织自检及日志。当前模型使用固定 25 MHz 时钟，115200 配置的分频值为 217。下面摘录自 </w:t>
       </w:r>
       <w:hyperlink r:id="rId18">
         <w:r>
           <w:rPr>
-            <w:rFonts w:ascii="Calibri" w:eastAsia="Songti SC"/>
+            <w:rFonts w:ascii="Calibri" w:eastAsia="Hiragino Sans GB"/>
             <w:color w:val="1F4E79"/>
           </w:rPr>
           <w:t>src/week2/uart.c</w:t>
         </w:r>
       </w:hyperlink>
       <w:r>
+        <w:rPr>
+          <w:rFonts w:eastAsia="Hiragino Sans GB"/>
+        </w:rPr>
         <w:t>。</w:t>
       </w:r>
     </w:p>
@@ -3354,7 +3584,7 @@
       </w:pPr>
       <w:r>
         <w:rPr>
-          <w:rFonts w:ascii="Menlo" w:hAnsi="Menlo" w:eastAsia="Heiti SC"/>
+          <w:rFonts w:ascii="Menlo" w:hAnsi="Menlo" w:eastAsia="Hiragino Sans GB"/>
           <w:sz w:val="18"/>
         </w:rPr>
         <w:t>int uart_flush(void) {</w:t>
@@ -3368,7 +3598,7 @@
       </w:pPr>
       <w:r>
         <w:rPr>
-          <w:rFonts w:ascii="Menlo" w:hAnsi="Menlo" w:eastAsia="Heiti SC"/>
+          <w:rFonts w:ascii="Menlo" w:hAnsi="Menlo" w:eastAsia="Hiragino Sans GB"/>
           <w:sz w:val="18"/>
         </w:rPr>
         <w:t xml:space="preserve">    if ((CTRL &amp; TX_ENABLE) == 0u) return -1;</w:t>
@@ -3382,7 +3612,7 @@
       </w:pPr>
       <w:r>
         <w:rPr>
-          <w:rFonts w:ascii="Menlo" w:hAnsi="Menlo" w:eastAsia="Heiti SC"/>
+          <w:rFonts w:ascii="Menlo" w:hAnsi="Menlo" w:eastAsia="Hiragino Sans GB"/>
           <w:sz w:val="18"/>
         </w:rPr>
         <w:t xml:space="preserve">    for (uint32_t n = 0; n &lt; POLL_LIMIT; ++n) {</w:t>
@@ -3396,7 +3626,7 @@
       </w:pPr>
       <w:r>
         <w:rPr>
-          <w:rFonts w:ascii="Menlo" w:hAnsi="Menlo" w:eastAsia="Heiti SC"/>
+          <w:rFonts w:ascii="Menlo" w:hAnsi="Menlo" w:eastAsia="Hiragino Sans GB"/>
           <w:sz w:val="18"/>
         </w:rPr>
         <w:t xml:space="preserve">        if ((STATE &amp; TX_FULL) == 0u) return 0;</w:t>
@@ -3410,7 +3640,7 @@
       </w:pPr>
       <w:r>
         <w:rPr>
-          <w:rFonts w:ascii="Menlo" w:hAnsi="Menlo" w:eastAsia="Heiti SC"/>
+          <w:rFonts w:ascii="Menlo" w:hAnsi="Menlo" w:eastAsia="Hiragino Sans GB"/>
           <w:sz w:val="18"/>
         </w:rPr>
         <w:t xml:space="preserve">    }</w:t>
@@ -3424,7 +3654,7 @@
       </w:pPr>
       <w:r>
         <w:rPr>
-          <w:rFonts w:ascii="Menlo" w:hAnsi="Menlo" w:eastAsia="Heiti SC"/>
+          <w:rFonts w:ascii="Menlo" w:hAnsi="Menlo" w:eastAsia="Hiragino Sans GB"/>
           <w:sz w:val="18"/>
         </w:rPr>
         <w:t xml:space="preserve">    return -1;</w:t>
@@ -3438,7 +3668,7 @@
       </w:pPr>
       <w:r>
         <w:rPr>
-          <w:rFonts w:ascii="Menlo" w:hAnsi="Menlo" w:eastAsia="Heiti SC"/>
+          <w:rFonts w:ascii="Menlo" w:hAnsi="Menlo" w:eastAsia="Hiragino Sans GB"/>
           <w:sz w:val="18"/>
         </w:rPr>
         <w:t>}</w:t>
@@ -3449,6 +3679,9 @@
         <w:snapToGrid w:val="0"/>
       </w:pPr>
       <w:r>
+        <w:rPr>
+          <w:rFonts w:eastAsia="Hiragino Sans GB"/>
+        </w:rPr>
         <w:t>uart_flush 检查 TX 使能并轮询发送缓冲区状态，超过循环上限返回错误；uart_putc 仅在允许发送后写数据寄存器。该上限是循环次数，尚不是按实际时间定义的超时。当前为轮询 TX，接收和中断处理仍待开发。</w:t>
       </w:r>
     </w:p>
@@ -3458,6 +3691,9 @@
         <w:snapToGrid w:val="0"/>
       </w:pPr>
       <w:r>
+        <w:rPr>
+          <w:rFonts w:eastAsia="Hiragino Sans GB"/>
+        </w:rPr>
         <w:t>输出与验收结果</w:t>
       </w:r>
     </w:p>
@@ -3466,6 +3702,9 @@
         <w:snapToGrid w:val="0"/>
       </w:pPr>
       <w:r>
+        <w:rPr>
+          <w:rFonts w:eastAsia="Hiragino Sans GB"/>
+        </w:rPr>
         <w:t>关闭 semihosting 后，UART 输出如下。原始记录保存 CRLF，本处按行展示。</w:t>
       </w:r>
     </w:p>
@@ -3477,7 +3716,7 @@
       </w:pPr>
       <w:r>
         <w:rPr>
-          <w:rFonts w:ascii="Menlo" w:hAnsi="Menlo" w:eastAsia="Heiti SC"/>
+          <w:rFonts w:ascii="Menlo" w:hAnsi="Menlo" w:eastAsia="Hiragino Sans GB"/>
           <w:sz w:val="18"/>
         </w:rPr>
         <w:t>BOOT: week2 mps2-an500 Cortex-M7</w:t>
@@ -3491,7 +3730,7 @@
       </w:pPr>
       <w:r>
         <w:rPr>
-          <w:rFonts w:ascii="Menlo" w:hAnsi="Menlo" w:eastAsia="Heiti SC"/>
+          <w:rFonts w:ascii="Menlo" w:hAnsi="Menlo" w:eastAsia="Hiragino Sans GB"/>
           <w:sz w:val="18"/>
         </w:rPr>
         <w:t>CLOCK: 25000000 Hz (QEMU fixed)</w:t>
@@ -3505,7 +3744,7 @@
       </w:pPr>
       <w:r>
         <w:rPr>
-          <w:rFonts w:ascii="Menlo" w:hAnsi="Menlo" w:eastAsia="Heiti SC"/>
+          <w:rFonts w:ascii="Menlo" w:hAnsi="Menlo" w:eastAsia="Hiragino Sans GB"/>
           <w:sz w:val="18"/>
         </w:rPr>
         <w:t>UART0: 115200 requested, divisor=217, 8N1</w:t>
@@ -3519,7 +3758,7 @@
       </w:pPr>
       <w:r>
         <w:rPr>
-          <w:rFonts w:ascii="Menlo" w:hAnsi="Menlo" w:eastAsia="Heiti SC"/>
+          <w:rFonts w:ascii="Menlo" w:hAnsi="Menlo" w:eastAsia="Hiragino Sans GB"/>
           <w:sz w:val="18"/>
         </w:rPr>
         <w:t>PASS: C runtime; UART boot ready</w:t>
@@ -3569,6 +3808,7 @@
             </w:pPr>
             <w:r>
               <w:rPr>
+                <w:rFonts w:eastAsia="Hiragino Sans GB"/>
                 <w:b/>
                 <w:sz w:val="21"/>
               </w:rPr>
@@ -3596,6 +3836,7 @@
             </w:pPr>
             <w:r>
               <w:rPr>
+                <w:rFonts w:eastAsia="Hiragino Sans GB"/>
                 <w:b/>
                 <w:sz w:val="21"/>
               </w:rPr>
@@ -3627,6 +3868,7 @@
             </w:pPr>
             <w:r>
               <w:rPr>
+                <w:rFonts w:eastAsia="Hiragino Sans GB"/>
                 <w:b w:val="0"/>
                 <w:sz w:val="21"/>
               </w:rPr>
@@ -3653,6 +3895,7 @@
             </w:pPr>
             <w:r>
               <w:rPr>
+                <w:rFonts w:eastAsia="Hiragino Sans GB"/>
                 <w:b w:val="0"/>
                 <w:sz w:val="21"/>
               </w:rPr>
@@ -3684,6 +3927,7 @@
             </w:pPr>
             <w:r>
               <w:rPr>
+                <w:rFonts w:eastAsia="Hiragino Sans GB"/>
                 <w:b w:val="0"/>
                 <w:sz w:val="21"/>
               </w:rPr>
@@ -3710,6 +3954,7 @@
             </w:pPr>
             <w:r>
               <w:rPr>
+                <w:rFonts w:eastAsia="Hiragino Sans GB"/>
                 <w:b w:val="0"/>
                 <w:sz w:val="21"/>
               </w:rPr>
@@ -3741,6 +3986,7 @@
             </w:pPr>
             <w:r>
               <w:rPr>
+                <w:rFonts w:eastAsia="Hiragino Sans GB"/>
                 <w:b w:val="0"/>
                 <w:sz w:val="21"/>
               </w:rPr>
@@ -3767,6 +4013,7 @@
             </w:pPr>
             <w:r>
               <w:rPr>
+                <w:rFonts w:eastAsia="Hiragino Sans GB"/>
                 <w:b w:val="0"/>
                 <w:sz w:val="21"/>
               </w:rPr>
@@ -3798,6 +4045,7 @@
             </w:pPr>
             <w:r>
               <w:rPr>
+                <w:rFonts w:eastAsia="Hiragino Sans GB"/>
                 <w:b w:val="0"/>
                 <w:sz w:val="21"/>
               </w:rPr>
@@ -3824,6 +4072,7 @@
             </w:pPr>
             <w:r>
               <w:rPr>
+                <w:rFonts w:eastAsia="Hiragino Sans GB"/>
                 <w:b w:val="0"/>
                 <w:sz w:val="21"/>
               </w:rPr>
@@ -3840,6 +4089,7 @@
       </w:pPr>
       <w:r>
         <w:rPr>
+          <w:rFonts w:eastAsia="Hiragino Sans GB"/>
           <w:sz w:val="4"/>
         </w:rPr>
       </w:r>
@@ -3851,14 +4101,269 @@
       <w:hyperlink r:id="rId19">
         <w:r>
           <w:rPr>
-            <w:rFonts w:ascii="Calibri" w:eastAsia="Songti SC"/>
+            <w:rFonts w:ascii="Calibri" w:eastAsia="Hiragino Sans GB"/>
             <w:color w:val="1F4E79"/>
           </w:rPr>
           <w:t>最终验收报告</w:t>
         </w:r>
       </w:hyperlink>
       <w:r>
+        <w:rPr>
+          <w:rFonts w:eastAsia="Hiragino Sans GB"/>
+        </w:rPr>
         <w:t xml:space="preserve"> 共 12 项检查通过，含时钟、构建、第一周回归及 9 个第二周运行场景。模拟器由宿主机在断言后结束；判定依据是日志与状态检查。当前结果支持最小启动与 UART TX，不包含物理波形验证、故障恢复或工业认证。</w:t>
+      </w:r>
+    </w:p>
+    <w:p>
+      <w:r>
+        <w:rPr>
+          <w:rFonts w:eastAsia="Hiragino Sans GB"/>
+        </w:rPr>
+        <w:br w:type="page"/>
+      </w:r>
+    </w:p>
+    <w:p>
+      <w:pPr>
+        <w:pStyle w:val="Heading1"/>
+      </w:pPr>
+      <w:r>
+        <w:rPr>
+          <w:rFonts w:eastAsia="Hiragino Sans GB"/>
+        </w:rPr>
+        <w:t>六 开发运行截图与日志补充</w:t>
+      </w:r>
+    </w:p>
+    <w:p>
+      <w:r>
+        <w:t>2026 年 10 月 17 日补充运行复验。为便于观察控制台程序的启动过程，新增 INIT、CPU、CRT、CHECK、STATE 和 NEXT 日志，输出内核标识、关键变量、自检结果及后续等待状态。以下图片直接截取自 VS Code 编辑器与集成终端窗口，保留工具栏、文件路径和实际运行画面。</w:t>
+      </w:r>
+    </w:p>
+    <w:p>
+      <w:pPr>
+        <w:pStyle w:val="Heading2"/>
+      </w:pPr>
+      <w:r>
+        <w:t>终端自动验收</w:t>
+      </w:r>
+    </w:p>
+    <w:p>
+      <w:pPr>
+        <w:keepNext/>
+        <w:spacing w:line="240" w:lineRule="auto"/>
+      </w:pPr>
+      <w:r>
+        <w:rPr>
+          <w:rFonts w:eastAsia="Hiragino Sans GB"/>
+        </w:rPr>
+        <w:drawing>
+          <wp:inline xmlns:a="http://schemas.openxmlformats.org/drawingml/2006/main" xmlns:pic="http://schemas.openxmlformats.org/drawingml/2006/picture">
+            <wp:extent cx="6400800" cy="4267200"/>
+            <wp:docPr id="1" name="Picture 1"/>
+            <wp:cNvGraphicFramePr>
+              <a:graphicFrameLocks noChangeAspect="1"/>
+            </wp:cNvGraphicFramePr>
+            <a:graphic>
+              <a:graphicData uri="http://schemas.openxmlformats.org/drawingml/2006/picture">
+                <pic:pic>
+                  <pic:nvPicPr>
+                    <pic:cNvPr id="0" name="20261017-build.png"/>
+                    <pic:cNvPicPr/>
+                  </pic:nvPicPr>
+                  <pic:blipFill>
+                    <a:blip r:embed="rId20"/>
+                    <a:stretch>
+                      <a:fillRect/>
+                    </a:stretch>
+                  </pic:blipFill>
+                  <pic:spPr>
+                    <a:xfrm>
+                      <a:off x="0" y="0"/>
+                      <a:ext cx="6400800" cy="4267200"/>
+                    </a:xfrm>
+                    <a:prstGeom prst="rect"/>
+                  </pic:spPr>
+                </pic:pic>
+              </a:graphicData>
+            </a:graphic>
+          </wp:inline>
+        </w:drawing>
+      </w:r>
+    </w:p>
+    <w:p>
+      <w:pPr>
+        <w:pStyle w:val="Caption"/>
+        <w:keepNext/>
+      </w:pPr>
+      <w:r>
+        <w:t>图 1 VS Code 终端中的 12 项验收结果</w:t>
+      </w:r>
+    </w:p>
+    <w:p>
+      <w:r>
+        <w:rPr>
+          <w:rFonts w:eastAsia="Hiragino Sans GB"/>
+        </w:rPr>
+        <w:t>构建同时生成 demo.elf 与 bootloader.elf，退出码为 0。本次 12 项检查全部通过，包含第一周回归、三次正常启动、初始化污染、参数边界、数据破坏、禁用 UART 和非法指令场景。</w:t>
+      </w:r>
+    </w:p>
+    <w:p>
+      <w:r>
+        <w:rPr>
+          <w:rFonts w:eastAsia="Hiragino Sans GB"/>
+        </w:rPr>
+        <w:br w:type="page"/>
+      </w:r>
+    </w:p>
+    <w:p>
+      <w:pPr>
+        <w:pStyle w:val="Heading2"/>
+      </w:pPr>
+      <w:r>
+        <w:rPr>
+          <w:rFonts w:eastAsia="Hiragino Sans GB"/>
+        </w:rPr>
+        <w:t>正常启动过程</w:t>
+      </w:r>
+    </w:p>
+    <w:p>
+      <w:pPr>
+        <w:keepNext/>
+        <w:spacing w:line="240" w:lineRule="auto"/>
+      </w:pPr>
+      <w:r>
+        <w:rPr>
+          <w:rFonts w:eastAsia="Hiragino Sans GB"/>
+        </w:rPr>
+        <w:drawing>
+          <wp:inline xmlns:a="http://schemas.openxmlformats.org/drawingml/2006/main" xmlns:pic="http://schemas.openxmlformats.org/drawingml/2006/picture">
+            <wp:extent cx="6400800" cy="4267200"/>
+            <wp:docPr id="2" name="Picture 2"/>
+            <wp:cNvGraphicFramePr>
+              <a:graphicFrameLocks noChangeAspect="1"/>
+            </wp:cNvGraphicFramePr>
+            <a:graphic>
+              <a:graphicData uri="http://schemas.openxmlformats.org/drawingml/2006/picture">
+                <pic:pic>
+                  <pic:nvPicPr>
+                    <pic:cNvPr id="0" name="20261017-uart.png"/>
+                    <pic:cNvPicPr/>
+                  </pic:nvPicPr>
+                  <pic:blipFill>
+                    <a:blip r:embed="rId21"/>
+                    <a:stretch>
+                      <a:fillRect/>
+                    </a:stretch>
+                  </pic:blipFill>
+                  <pic:spPr>
+                    <a:xfrm>
+                      <a:off x="0" y="0"/>
+                      <a:ext cx="6400800" cy="4267200"/>
+                    </a:xfrm>
+                    <a:prstGeom prst="rect"/>
+                  </pic:spPr>
+                </pic:pic>
+              </a:graphicData>
+            </a:graphic>
+          </wp:inline>
+        </w:drawing>
+      </w:r>
+    </w:p>
+    <w:p>
+      <w:pPr>
+        <w:pStyle w:val="Caption"/>
+        <w:keepNext/>
+      </w:pPr>
+      <w:r>
+        <w:rPr>
+          <w:rFonts w:eastAsia="Hiragino Sans GB"/>
+        </w:rPr>
+        <w:t>图 2 关闭 semihosting 后的 UART 启动日志</w:t>
+      </w:r>
+    </w:p>
+    <w:p>
+      <w:r>
+        <w:rPr>
+          <w:rFonts w:eastAsia="Hiragino Sans GB"/>
+        </w:rPr>
+        <w:t>PartNo 为 0x00000c27；data[4] 为预期值 0xa55aa55a，bss[6] 为 0。CHECK 检查全部 5 个 data 元素与 7 个 BSS 元素，boot_status 为 1 后进入 WFI 等待。三次启动均逐字节比对通过，每次输出 370 字节。</w:t>
+      </w:r>
+    </w:p>
+    <w:p>
+      <w:r>
+        <w:rPr>
+          <w:rFonts w:eastAsia="Hiragino Sans GB"/>
+        </w:rPr>
+        <w:br w:type="page"/>
+      </w:r>
+    </w:p>
+    <w:p>
+      <w:pPr>
+        <w:pStyle w:val="Heading2"/>
+      </w:pPr>
+      <w:r>
+        <w:t>日志代码开发界面</w:t>
+      </w:r>
+    </w:p>
+    <w:p>
+      <w:pPr>
+        <w:keepNext/>
+        <w:spacing w:line="240" w:lineRule="auto"/>
+      </w:pPr>
+      <w:r>
+        <w:rPr>
+          <w:rFonts w:eastAsia="Hiragino Sans GB"/>
+        </w:rPr>
+        <w:drawing>
+          <wp:inline xmlns:a="http://schemas.openxmlformats.org/drawingml/2006/main" xmlns:pic="http://schemas.openxmlformats.org/drawingml/2006/picture">
+            <wp:extent cx="6400800" cy="4267200"/>
+            <wp:docPr id="3" name="Picture 3"/>
+            <wp:cNvGraphicFramePr>
+              <a:graphicFrameLocks noChangeAspect="1"/>
+            </wp:cNvGraphicFramePr>
+            <a:graphic>
+              <a:graphicData uri="http://schemas.openxmlformats.org/drawingml/2006/picture">
+                <pic:pic>
+                  <pic:nvPicPr>
+                    <pic:cNvPr id="0" name="20261017-fault.png"/>
+                    <pic:cNvPicPr/>
+                  </pic:nvPicPr>
+                  <pic:blipFill>
+                    <a:blip r:embed="rId22"/>
+                    <a:stretch>
+                      <a:fillRect/>
+                    </a:stretch>
+                  </pic:blipFill>
+                  <pic:spPr>
+                    <a:xfrm>
+                      <a:off x="0" y="0"/>
+                      <a:ext cx="6400800" cy="4267200"/>
+                    </a:xfrm>
+                    <a:prstGeom prst="rect"/>
+                  </pic:spPr>
+                </pic:pic>
+              </a:graphicData>
+            </a:graphic>
+          </wp:inline>
+        </w:drawing>
+      </w:r>
+    </w:p>
+    <w:p>
+      <w:pPr>
+        <w:pStyle w:val="Caption"/>
+        <w:keepNext/>
+      </w:pPr>
+      <w:r>
+        <w:t>图 3 VS Code 中的启动流程与日志实现</w:t>
+      </w:r>
+    </w:p>
+    <w:p>
+      <w:r>
+        <w:t>编辑器截图展示 main.c 中的板级初始化、UART 初始化、内核与 C 运行环境检查，以及分阶段日志输出。输出错误时将 boot_status 设为 3；正常完成后进入 boot_idle。自动验收另覆盖数据破坏、禁用 UART 与非法指令等负向场景。</w:t>
+      </w:r>
+    </w:p>
+    <w:p>
+      <w:r>
+        <w:t>本次证据目录：codes/logs/week2-20261017-135258；验收入口：在 codes 目录执行 python3 scripts/verify-week2.py。历史章节中的 144 字节为 10 月 14 日版本输出，本次扩充日志后以新记录为准。</w:t>
       </w:r>
     </w:p>
     <w:sectPr>
@@ -4256,7 +4761,7 @@
       <w:spacing w:line="330" w:lineRule="exact" w:after="120"/>
     </w:pPr>
     <w:rPr>
-      <w:rFonts w:ascii="Calibri" w:hAnsi="Calibri" w:eastAsia="Songti SC"/>
+      <w:rFonts w:ascii="Calibri" w:hAnsi="Calibri" w:eastAsia="Hiragino Sans GB"/>
       <w:color w:val="000000"/>
       <w:sz w:val="22"/>
     </w:rPr>
@@ -4275,6 +4780,9 @@
       </w:tabs>
       <w:spacing w:after="0" w:line="240" w:lineRule="auto"/>
     </w:pPr>
+    <w:rPr>
+      <w:rFonts w:eastAsia="Hiragino Sans GB"/>
+    </w:rPr>
   </w:style>
   <w:style w:type="character" w:customStyle="1" w:styleId="HeaderChar">
     <w:name w:val="Header Char"/>
@@ -4282,6 +4790,9 @@
     <w:link w:val="Header"/>
     <w:uiPriority w:val="99"/>
     <w:rsid w:val="00E618BF"/>
+    <w:rPr>
+      <w:rFonts w:eastAsia="Hiragino Sans GB"/>
+    </w:rPr>
   </w:style>
   <w:style w:type="paragraph" w:styleId="Footer">
     <w:name w:val="footer"/>
@@ -4297,6 +4808,9 @@
       </w:tabs>
       <w:spacing w:after="0" w:line="240" w:lineRule="auto"/>
     </w:pPr>
+    <w:rPr>
+      <w:rFonts w:eastAsia="Hiragino Sans GB"/>
+    </w:rPr>
   </w:style>
   <w:style w:type="character" w:customStyle="1" w:styleId="FooterChar">
     <w:name w:val="Footer Char"/>
@@ -4304,6 +4818,9 @@
     <w:link w:val="Footer"/>
     <w:uiPriority w:val="99"/>
     <w:rsid w:val="00E618BF"/>
+    <w:rPr>
+      <w:rFonts w:eastAsia="Hiragino Sans GB"/>
+    </w:rPr>
   </w:style>
   <w:style w:type="paragraph" w:styleId="Heading1">
     <w:name w:val="heading 1"/>
@@ -4321,7 +4838,7 @@
       <w:outlineLvl w:val="0"/>
     </w:pPr>
     <w:rPr>
-      <w:rFonts w:ascii="Calibri" w:hAnsi="Calibri" w:eastAsia="Heiti SC"/>
+      <w:rFonts w:ascii="Calibri" w:hAnsi="Calibri" w:eastAsia="Hiragino Sans GB"/>
       <w:b/>
       <w:bCs/>
       <w:color w:val="000000"/>
@@ -4346,7 +4863,7 @@
       <w:outlineLvl w:val="1"/>
     </w:pPr>
     <w:rPr>
-      <w:rFonts w:ascii="Calibri" w:hAnsi="Calibri" w:eastAsia="Heiti SC"/>
+      <w:rFonts w:ascii="Calibri" w:hAnsi="Calibri" w:eastAsia="Hiragino Sans GB"/>
       <w:b/>
       <w:bCs/>
       <w:color w:val="000000"/>
@@ -4371,7 +4888,7 @@
       <w:outlineLvl w:val="2"/>
     </w:pPr>
     <w:rPr>
-      <w:rFonts w:ascii="Calibri" w:hAnsi="Calibri" w:eastAsia="Heiti SC"/>
+      <w:rFonts w:ascii="Calibri" w:hAnsi="Calibri" w:eastAsia="Hiragino Sans GB"/>
       <w:b/>
       <w:bCs/>
       <w:color w:val="000000"/>
@@ -4394,12 +4911,12 @@
       <w:outlineLvl w:val="3"/>
     </w:pPr>
     <w:rPr>
-      <w:rFonts/>
+      <w:rFonts w:eastAsia="Hiragino Sans GB"/>
       <w:b/>
       <w:bCs/>
       <w:i/>
       <w:iCs/>
-      <w:color w:val="4F81BD" w:themeColor="accent1"/>
+      <w:color w:val="000000"/>
     </w:rPr>
   </w:style>
   <w:style w:type="paragraph" w:styleId="Heading5">
@@ -4419,8 +4936,8 @@
       <w:outlineLvl w:val="4"/>
     </w:pPr>
     <w:rPr>
-      <w:rFonts/>
-      <w:color w:val="243F60" w:themeColor="accent1" w:themeShade="7F"/>
+      <w:rFonts w:eastAsia="Hiragino Sans GB"/>
+      <w:color w:val="000000"/>
     </w:rPr>
   </w:style>
   <w:style w:type="paragraph" w:styleId="Heading6">
@@ -4440,10 +4957,10 @@
       <w:outlineLvl w:val="5"/>
     </w:pPr>
     <w:rPr>
-      <w:rFonts/>
+      <w:rFonts w:eastAsia="Hiragino Sans GB"/>
       <w:i/>
       <w:iCs/>
-      <w:color w:val="243F60" w:themeColor="accent1" w:themeShade="7F"/>
+      <w:color w:val="000000"/>
     </w:rPr>
   </w:style>
   <w:style w:type="paragraph" w:styleId="Heading7">
@@ -4463,10 +4980,10 @@
       <w:outlineLvl w:val="6"/>
     </w:pPr>
     <w:rPr>
-      <w:rFonts/>
+      <w:rFonts w:eastAsia="Hiragino Sans GB"/>
       <w:i/>
       <w:iCs/>
-      <w:color w:val="404040" w:themeColor="text1" w:themeTint="BF"/>
+      <w:color w:val="000000"/>
     </w:rPr>
   </w:style>
   <w:style w:type="paragraph" w:styleId="Heading8">
@@ -4486,8 +5003,8 @@
       <w:outlineLvl w:val="7"/>
     </w:pPr>
     <w:rPr>
-      <w:rFonts/>
-      <w:color w:val="4F81BD" w:themeColor="accent1"/>
+      <w:rFonts w:eastAsia="Hiragino Sans GB"/>
+      <w:color w:val="000000"/>
       <w:sz w:val="20"/>
       <w:szCs w:val="20"/>
     </w:rPr>
@@ -4509,10 +5026,10 @@
       <w:outlineLvl w:val="8"/>
     </w:pPr>
     <w:rPr>
-      <w:rFonts/>
+      <w:rFonts w:eastAsia="Hiragino Sans GB"/>
       <w:i/>
       <w:iCs/>
-      <w:color w:val="404040" w:themeColor="text1" w:themeTint="BF"/>
+      <w:color w:val="000000"/>
       <w:sz w:val="20"/>
       <w:szCs w:val="20"/>
     </w:rPr>
@@ -4522,6 +5039,9 @@
     <w:uiPriority w:val="1"/>
     <w:semiHidden/>
     <w:unhideWhenUsed/>
+    <w:rPr>
+      <w:rFonts w:eastAsia="Hiragino Sans GB"/>
+    </w:rPr>
   </w:style>
   <w:style w:type="table" w:default="1" w:styleId="TableNormal">
     <w:name w:val="Normal Table"/>
@@ -4552,6 +5072,9 @@
     <w:pPr>
       <w:spacing w:after="0" w:line="240" w:lineRule="auto"/>
     </w:pPr>
+    <w:rPr>
+      <w:rFonts w:eastAsia="Hiragino Sans GB"/>
+    </w:rPr>
   </w:style>
   <w:style w:type="character" w:customStyle="1" w:styleId="Heading1Char">
     <w:name w:val="Heading 1 Char"/>
@@ -4560,10 +5083,10 @@
     <w:uiPriority w:val="9"/>
     <w:rsid w:val="00FC693F"/>
     <w:rPr>
-      <w:rFonts w:asciiTheme="majorHAnsi" w:eastAsiaTheme="majorEastAsia" w:hAnsiTheme="majorHAnsi" w:cstheme="majorBidi"/>
+      <w:rFonts w:asciiTheme="majorHAnsi" w:eastAsiaTheme="majorEastAsia" w:hAnsiTheme="majorHAnsi" w:cstheme="majorBidi" w:eastAsia="Hiragino Sans GB"/>
       <w:b/>
       <w:bCs/>
-      <w:color w:val="365F91" w:themeColor="accent1" w:themeShade="BF"/>
+      <w:color w:val="000000"/>
       <w:sz w:val="28"/>
       <w:szCs w:val="28"/>
     </w:rPr>
@@ -4575,10 +5098,10 @@
     <w:uiPriority w:val="9"/>
     <w:rsid w:val="00FC693F"/>
     <w:rPr>
-      <w:rFonts w:asciiTheme="majorHAnsi" w:eastAsiaTheme="majorEastAsia" w:hAnsiTheme="majorHAnsi" w:cstheme="majorBidi"/>
+      <w:rFonts w:asciiTheme="majorHAnsi" w:eastAsiaTheme="majorEastAsia" w:hAnsiTheme="majorHAnsi" w:cstheme="majorBidi" w:eastAsia="Hiragino Sans GB"/>
       <w:b/>
       <w:bCs/>
-      <w:color w:val="4F81BD" w:themeColor="accent1"/>
+      <w:color w:val="000000"/>
       <w:sz w:val="26"/>
       <w:szCs w:val="26"/>
     </w:rPr>
@@ -4590,10 +5113,10 @@
     <w:uiPriority w:val="9"/>
     <w:rsid w:val="00FC693F"/>
     <w:rPr>
-      <w:rFonts w:asciiTheme="majorHAnsi" w:eastAsiaTheme="majorEastAsia" w:hAnsiTheme="majorHAnsi" w:cstheme="majorBidi"/>
+      <w:rFonts w:asciiTheme="majorHAnsi" w:eastAsiaTheme="majorEastAsia" w:hAnsiTheme="majorHAnsi" w:cstheme="majorBidi" w:eastAsia="Hiragino Sans GB"/>
       <w:b/>
       <w:bCs/>
-      <w:color w:val="4F81BD" w:themeColor="accent1"/>
+      <w:color w:val="000000"/>
     </w:rPr>
   </w:style>
   <w:style w:type="paragraph" w:styleId="Title">
@@ -4610,7 +5133,7 @@
       <w:contextualSpacing/>
     </w:pPr>
     <w:rPr>
-      <w:rFonts w:ascii="Calibri" w:hAnsi="Calibri" w:eastAsia="Heiti SC"/>
+      <w:rFonts w:ascii="Calibri" w:hAnsi="Calibri" w:eastAsia="Hiragino Sans GB"/>
       <w:b/>
       <w:color w:val="000000"/>
       <w:spacing w:val="5"/>
@@ -4626,7 +5149,7 @@
     <w:uiPriority w:val="10"/>
     <w:rsid w:val="00FC693F"/>
     <w:rPr>
-      <w:rFonts w:asciiTheme="majorHAnsi" w:eastAsiaTheme="majorEastAsia" w:hAnsiTheme="majorHAnsi" w:cstheme="majorBidi"/>
+      <w:rFonts w:asciiTheme="majorHAnsi" w:eastAsiaTheme="majorEastAsia" w:hAnsiTheme="majorHAnsi" w:cstheme="majorBidi" w:eastAsia="Hiragino Sans GB"/>
       <w:color w:val="17365D" w:themeColor="text2" w:themeShade="BF"/>
       <w:spacing w:val="5"/>
       <w:kern w:val="28"/>
@@ -4649,7 +5172,7 @@
       </w:numPr>
     </w:pPr>
     <w:rPr>
-      <w:rFonts w:ascii="Calibri" w:hAnsi="Calibri" w:eastAsia="Heiti SC"/>
+      <w:rFonts w:ascii="Calibri" w:hAnsi="Calibri" w:eastAsia="Hiragino Sans GB"/>
       <w:i/>
       <w:iCs/>
       <w:color w:val="000000"/>
@@ -4665,7 +5188,7 @@
     <w:uiPriority w:val="11"/>
     <w:rsid w:val="00FC693F"/>
     <w:rPr>
-      <w:rFonts w:asciiTheme="majorHAnsi" w:eastAsiaTheme="majorEastAsia" w:hAnsiTheme="majorHAnsi" w:cstheme="majorBidi"/>
+      <w:rFonts w:asciiTheme="majorHAnsi" w:eastAsiaTheme="majorEastAsia" w:hAnsiTheme="majorHAnsi" w:cstheme="majorBidi" w:eastAsia="Hiragino Sans GB"/>
       <w:i/>
       <w:iCs/>
       <w:color w:val="4F81BD" w:themeColor="accent1"/>
@@ -4684,6 +5207,9 @@
       <w:ind w:left="720"/>
       <w:contextualSpacing/>
     </w:pPr>
+    <w:rPr>
+      <w:rFonts w:eastAsia="Hiragino Sans GB"/>
+    </w:rPr>
   </w:style>
   <w:style w:type="paragraph" w:styleId="BodyText">
     <w:name w:val="Body Text"/>
@@ -4695,6 +5221,9 @@
     <w:pPr>
       <w:spacing w:after="120"/>
     </w:pPr>
+    <w:rPr>
+      <w:rFonts w:eastAsia="Hiragino Sans GB"/>
+    </w:rPr>
   </w:style>
   <w:style w:type="character" w:customStyle="1" w:styleId="BodyTextChar">
     <w:name w:val="Body Text Char"/>
@@ -4702,6 +5231,9 @@
     <w:link w:val="BodyText"/>
     <w:uiPriority w:val="99"/>
     <w:rsid w:val="00AA1D8D"/>
+    <w:rPr>
+      <w:rFonts w:eastAsia="Hiragino Sans GB"/>
+    </w:rPr>
   </w:style>
   <w:style w:type="paragraph" w:styleId="BodyText2">
     <w:name w:val="Body Text 2"/>
@@ -4713,6 +5245,9 @@
     <w:pPr>
       <w:spacing w:after="120" w:line="480" w:lineRule="auto"/>
     </w:pPr>
+    <w:rPr>
+      <w:rFonts w:eastAsia="Hiragino Sans GB"/>
+    </w:rPr>
   </w:style>
   <w:style w:type="character" w:customStyle="1" w:styleId="BodyText2Char">
     <w:name w:val="Body Text 2 Char"/>
@@ -4720,6 +5255,9 @@
     <w:link w:val="BodyText2"/>
     <w:uiPriority w:val="99"/>
     <w:rsid w:val="00AA1D8D"/>
+    <w:rPr>
+      <w:rFonts w:eastAsia="Hiragino Sans GB"/>
+    </w:rPr>
   </w:style>
   <w:style w:type="paragraph" w:styleId="BodyText3">
     <w:name w:val="Body Text 3"/>
@@ -4732,6 +5270,7 @@
       <w:spacing w:after="120"/>
     </w:pPr>
     <w:rPr>
+      <w:rFonts w:eastAsia="Hiragino Sans GB"/>
       <w:sz w:val="16"/>
       <w:szCs w:val="16"/>
     </w:rPr>
@@ -4743,6 +5282,7 @@
     <w:uiPriority w:val="99"/>
     <w:rsid w:val="00AA1D8D"/>
     <w:rPr>
+      <w:rFonts w:eastAsia="Hiragino Sans GB"/>
       <w:sz w:val="16"/>
       <w:szCs w:val="16"/>
     </w:rPr>
@@ -4757,6 +5297,9 @@
       <w:ind w:left="360" w:hanging="360"/>
       <w:contextualSpacing/>
     </w:pPr>
+    <w:rPr>
+      <w:rFonts w:eastAsia="Hiragino Sans GB"/>
+    </w:rPr>
   </w:style>
   <w:style w:type="paragraph" w:styleId="List2">
     <w:name w:val="List 2"/>
@@ -4768,6 +5311,9 @@
       <w:ind w:left="720" w:hanging="360"/>
       <w:contextualSpacing/>
     </w:pPr>
+    <w:rPr>
+      <w:rFonts w:eastAsia="Hiragino Sans GB"/>
+    </w:rPr>
   </w:style>
   <w:style w:type="paragraph" w:styleId="List3">
     <w:name w:val="List 3"/>
@@ -4779,6 +5325,9 @@
       <w:ind w:left="1080" w:hanging="360"/>
       <w:contextualSpacing/>
     </w:pPr>
+    <w:rPr>
+      <w:rFonts w:eastAsia="Hiragino Sans GB"/>
+    </w:rPr>
   </w:style>
   <w:style w:type="paragraph" w:styleId="ListBullet">
     <w:name w:val="List Bullet"/>
@@ -4792,6 +5341,9 @@
       </w:numPr>
       <w:contextualSpacing/>
     </w:pPr>
+    <w:rPr>
+      <w:rFonts w:eastAsia="Hiragino Sans GB"/>
+    </w:rPr>
   </w:style>
   <w:style w:type="paragraph" w:styleId="ListBullet2">
     <w:name w:val="List Bullet 2"/>
@@ -4805,6 +5357,9 @@
       </w:numPr>
       <w:contextualSpacing/>
     </w:pPr>
+    <w:rPr>
+      <w:rFonts w:eastAsia="Hiragino Sans GB"/>
+    </w:rPr>
   </w:style>
   <w:style w:type="paragraph" w:styleId="ListBullet3">
     <w:name w:val="List Bullet 3"/>
@@ -4818,6 +5373,9 @@
       </w:numPr>
       <w:contextualSpacing/>
     </w:pPr>
+    <w:rPr>
+      <w:rFonts w:eastAsia="Hiragino Sans GB"/>
+    </w:rPr>
   </w:style>
   <w:style w:type="paragraph" w:styleId="ListNumber">
     <w:name w:val="List Number"/>
@@ -4831,6 +5389,9 @@
       </w:numPr>
       <w:contextualSpacing/>
     </w:pPr>
+    <w:rPr>
+      <w:rFonts w:eastAsia="Hiragino Sans GB"/>
+    </w:rPr>
   </w:style>
   <w:style w:type="paragraph" w:styleId="ListNumber2">
     <w:name w:val="List Number 2"/>
@@ -4844,6 +5405,9 @@
       </w:numPr>
       <w:contextualSpacing/>
     </w:pPr>
+    <w:rPr>
+      <w:rFonts w:eastAsia="Hiragino Sans GB"/>
+    </w:rPr>
   </w:style>
   <w:style w:type="paragraph" w:styleId="ListNumber3">
     <w:name w:val="List Number 3"/>
@@ -4857,6 +5421,9 @@
       </w:numPr>
       <w:contextualSpacing/>
     </w:pPr>
+    <w:rPr>
+      <w:rFonts w:eastAsia="Hiragino Sans GB"/>
+    </w:rPr>
   </w:style>
   <w:style w:type="paragraph" w:styleId="ListContinue">
     <w:name w:val="List Continue"/>
@@ -4869,6 +5436,9 @@
       <w:ind w:left="360"/>
       <w:contextualSpacing/>
     </w:pPr>
+    <w:rPr>
+      <w:rFonts w:eastAsia="Hiragino Sans GB"/>
+    </w:rPr>
   </w:style>
   <w:style w:type="paragraph" w:styleId="ListContinue2">
     <w:name w:val="List Continue 2"/>
@@ -4881,6 +5451,9 @@
       <w:ind w:left="720"/>
       <w:contextualSpacing/>
     </w:pPr>
+    <w:rPr>
+      <w:rFonts w:eastAsia="Hiragino Sans GB"/>
+    </w:rPr>
   </w:style>
   <w:style w:type="paragraph" w:styleId="ListContinue3">
     <w:name w:val="List Continue 3"/>
@@ -4893,6 +5466,9 @@
       <w:ind w:left="1080"/>
       <w:contextualSpacing/>
     </w:pPr>
+    <w:rPr>
+      <w:rFonts w:eastAsia="Hiragino Sans GB"/>
+    </w:rPr>
   </w:style>
   <w:style w:type="paragraph" w:styleId="MacroText">
     <w:name w:val="macro"/>
@@ -4912,7 +5488,7 @@
       </w:tabs>
     </w:pPr>
     <w:rPr>
-      <w:rFonts w:ascii="Courier" w:hAnsi="Courier"/>
+      <w:rFonts w:ascii="Courier" w:hAnsi="Courier" w:eastAsia="Hiragino Sans GB"/>
       <w:sz w:val="20"/>
       <w:szCs w:val="20"/>
     </w:rPr>
@@ -4924,7 +5500,7 @@
     <w:uiPriority w:val="99"/>
     <w:rsid w:val="0029639D"/>
     <w:rPr>
-      <w:rFonts w:ascii="Courier" w:hAnsi="Courier"/>
+      <w:rFonts w:ascii="Courier" w:hAnsi="Courier" w:eastAsia="Hiragino Sans GB"/>
       <w:sz w:val="20"/>
       <w:szCs w:val="20"/>
     </w:rPr>
@@ -4938,6 +5514,7 @@
     <w:qFormat/>
     <w:rsid w:val="00FC693F"/>
     <w:rPr>
+      <w:rFonts w:eastAsia="Hiragino Sans GB"/>
       <w:i/>
       <w:iCs/>
       <w:color w:val="000000" w:themeColor="text1"/>
@@ -4950,6 +5527,7 @@
     <w:uiPriority w:val="29"/>
     <w:rsid w:val="00FC693F"/>
     <w:rPr>
+      <w:rFonts w:eastAsia="Hiragino Sans GB"/>
       <w:i/>
       <w:iCs/>
       <w:color w:val="000000" w:themeColor="text1"/>
@@ -4963,12 +5541,12 @@
     <w:semiHidden/>
     <w:rsid w:val="00FC693F"/>
     <w:rPr>
-      <w:rFonts w:asciiTheme="majorHAnsi" w:eastAsiaTheme="majorEastAsia" w:hAnsiTheme="majorHAnsi" w:cstheme="majorBidi"/>
+      <w:rFonts w:asciiTheme="majorHAnsi" w:eastAsiaTheme="majorEastAsia" w:hAnsiTheme="majorHAnsi" w:cstheme="majorBidi" w:eastAsia="Hiragino Sans GB"/>
       <w:b/>
       <w:bCs/>
       <w:i/>
       <w:iCs/>
-      <w:color w:val="4F81BD" w:themeColor="accent1"/>
+      <w:color w:val="000000"/>
     </w:rPr>
   </w:style>
   <w:style w:type="character" w:customStyle="1" w:styleId="Heading5Char">
@@ -4979,8 +5557,8 @@
     <w:semiHidden/>
     <w:rsid w:val="00FC693F"/>
     <w:rPr>
-      <w:rFonts w:asciiTheme="majorHAnsi" w:eastAsiaTheme="majorEastAsia" w:hAnsiTheme="majorHAnsi" w:cstheme="majorBidi"/>
-      <w:color w:val="243F60" w:themeColor="accent1" w:themeShade="7F"/>
+      <w:rFonts w:asciiTheme="majorHAnsi" w:eastAsiaTheme="majorEastAsia" w:hAnsiTheme="majorHAnsi" w:cstheme="majorBidi" w:eastAsia="Hiragino Sans GB"/>
+      <w:color w:val="000000"/>
     </w:rPr>
   </w:style>
   <w:style w:type="character" w:customStyle="1" w:styleId="Heading6Char">
@@ -4991,10 +5569,10 @@
     <w:semiHidden/>
     <w:rsid w:val="00FC693F"/>
     <w:rPr>
-      <w:rFonts w:asciiTheme="majorHAnsi" w:eastAsiaTheme="majorEastAsia" w:hAnsiTheme="majorHAnsi" w:cstheme="majorBidi"/>
+      <w:rFonts w:asciiTheme="majorHAnsi" w:eastAsiaTheme="majorEastAsia" w:hAnsiTheme="majorHAnsi" w:cstheme="majorBidi" w:eastAsia="Hiragino Sans GB"/>
       <w:i/>
       <w:iCs/>
-      <w:color w:val="243F60" w:themeColor="accent1" w:themeShade="7F"/>
+      <w:color w:val="000000"/>
     </w:rPr>
   </w:style>
   <w:style w:type="character" w:customStyle="1" w:styleId="Heading7Char">
@@ -5005,10 +5583,10 @@
     <w:semiHidden/>
     <w:rsid w:val="00FC693F"/>
     <w:rPr>
-      <w:rFonts w:asciiTheme="majorHAnsi" w:eastAsiaTheme="majorEastAsia" w:hAnsiTheme="majorHAnsi" w:cstheme="majorBidi"/>
+      <w:rFonts w:asciiTheme="majorHAnsi" w:eastAsiaTheme="majorEastAsia" w:hAnsiTheme="majorHAnsi" w:cstheme="majorBidi" w:eastAsia="Hiragino Sans GB"/>
       <w:i/>
       <w:iCs/>
-      <w:color w:val="404040" w:themeColor="text1" w:themeTint="BF"/>
+      <w:color w:val="000000"/>
     </w:rPr>
   </w:style>
   <w:style w:type="character" w:customStyle="1" w:styleId="Heading8Char">
@@ -5019,8 +5597,8 @@
     <w:semiHidden/>
     <w:rsid w:val="00FC693F"/>
     <w:rPr>
-      <w:rFonts w:asciiTheme="majorHAnsi" w:eastAsiaTheme="majorEastAsia" w:hAnsiTheme="majorHAnsi" w:cstheme="majorBidi"/>
-      <w:color w:val="4F81BD" w:themeColor="accent1"/>
+      <w:rFonts w:asciiTheme="majorHAnsi" w:eastAsiaTheme="majorEastAsia" w:hAnsiTheme="majorHAnsi" w:cstheme="majorBidi" w:eastAsia="Hiragino Sans GB"/>
+      <w:color w:val="000000"/>
       <w:sz w:val="20"/>
       <w:szCs w:val="20"/>
     </w:rPr>
@@ -5033,10 +5611,10 @@
     <w:semiHidden/>
     <w:rsid w:val="00FC693F"/>
     <w:rPr>
-      <w:rFonts w:asciiTheme="majorHAnsi" w:eastAsiaTheme="majorEastAsia" w:hAnsiTheme="majorHAnsi" w:cstheme="majorBidi"/>
+      <w:rFonts w:asciiTheme="majorHAnsi" w:eastAsiaTheme="majorEastAsia" w:hAnsiTheme="majorHAnsi" w:cstheme="majorBidi" w:eastAsia="Hiragino Sans GB"/>
       <w:i/>
       <w:iCs/>
-      <w:color w:val="404040" w:themeColor="text1" w:themeTint="BF"/>
+      <w:color w:val="000000"/>
       <w:sz w:val="20"/>
       <w:szCs w:val="20"/>
     </w:rPr>
@@ -5054,9 +5632,10 @@
       <w:spacing w:line="240" w:lineRule="auto"/>
     </w:pPr>
     <w:rPr>
+      <w:rFonts w:eastAsia="Hiragino Sans GB"/>
       <w:b/>
       <w:bCs/>
-      <w:color w:val="4F81BD" w:themeColor="accent1"/>
+      <w:color w:val="000000"/>
       <w:sz w:val="18"/>
       <w:szCs w:val="18"/>
     </w:rPr>
@@ -5068,6 +5647,7 @@
     <w:qFormat/>
     <w:rsid w:val="00FC693F"/>
     <w:rPr>
+      <w:rFonts w:eastAsia="Hiragino Sans GB"/>
       <w:b/>
       <w:bCs/>
     </w:rPr>
@@ -5079,6 +5659,7 @@
     <w:qFormat/>
     <w:rsid w:val="00FC693F"/>
     <w:rPr>
+      <w:rFonts w:eastAsia="Hiragino Sans GB"/>
       <w:i/>
       <w:iCs/>
     </w:rPr>
@@ -5099,6 +5680,7 @@
       <w:ind w:left="936" w:right="936"/>
     </w:pPr>
     <w:rPr>
+      <w:rFonts w:eastAsia="Hiragino Sans GB"/>
       <w:b/>
       <w:bCs/>
       <w:i/>
@@ -5113,6 +5695,7 @@
     <w:uiPriority w:val="30"/>
     <w:rsid w:val="00FC693F"/>
     <w:rPr>
+      <w:rFonts w:eastAsia="Hiragino Sans GB"/>
       <w:b/>
       <w:bCs/>
       <w:i/>
@@ -5127,6 +5710,7 @@
     <w:qFormat/>
     <w:rsid w:val="00FC693F"/>
     <w:rPr>
+      <w:rFonts w:eastAsia="Hiragino Sans GB"/>
       <w:i/>
       <w:iCs/>
       <w:color w:val="808080" w:themeColor="text1" w:themeTint="7F"/>
@@ -5139,6 +5723,7 @@
     <w:qFormat/>
     <w:rsid w:val="00FC693F"/>
     <w:rPr>
+      <w:rFonts w:eastAsia="Hiragino Sans GB"/>
       <w:b/>
       <w:bCs/>
       <w:i/>
@@ -5153,6 +5738,7 @@
     <w:qFormat/>
     <w:rsid w:val="00FC693F"/>
     <w:rPr>
+      <w:rFonts w:eastAsia="Hiragino Sans GB"/>
       <w:smallCaps/>
       <w:color w:val="C0504D" w:themeColor="accent2"/>
       <w:u w:val="single"/>
@@ -5165,6 +5751,7 @@
     <w:qFormat/>
     <w:rsid w:val="00FC693F"/>
     <w:rPr>
+      <w:rFonts w:eastAsia="Hiragino Sans GB"/>
       <w:b/>
       <w:bCs/>
       <w:smallCaps/>
@@ -5180,6 +5767,7 @@
     <w:qFormat/>
     <w:rsid w:val="00FC693F"/>
     <w:rPr>
+      <w:rFonts w:eastAsia="Hiragino Sans GB"/>
       <w:b/>
       <w:bCs/>
       <w:smallCaps/>
@@ -5198,6 +5786,9 @@
     <w:pPr>
       <w:outlineLvl w:val="9"/>
     </w:pPr>
+    <w:rPr>
+      <w:rFonts w:eastAsia="Hiragino Sans GB"/>
+    </w:rPr>
   </w:style>
   <w:style w:type="table" w:styleId="TableGrid">
     <w:name w:val="Table Grid"/>

</xml_diff>